<commit_message>
up grade of the direction
</commit_message>
<xml_diff>
--- a/figures/Supplementary Materials.docx
+++ b/figures/Supplementary Materials.docx
@@ -344,7 +344,7 @@
           <w:szCs w:val="22"/>
           <w:lang w:val="en-GB"/>
         </w:rPr>
-        <w:t>3</w:t>
+        <w:t>4</w:t>
       </w:r>
       <w:r>
         <w:rPr>
@@ -373,7 +373,7 @@
           <w:szCs w:val="22"/>
           <w:lang w:val="en-GB"/>
         </w:rPr>
-        <w:t>Table</w:t>
+        <w:t>Table S1</w:t>
       </w:r>
       <w:r>
         <w:rPr>
@@ -382,56 +382,435 @@
           <w:szCs w:val="22"/>
           <w:lang w:val="en-GB"/>
         </w:rPr>
+        <w:t>.</w:t>
+      </w:r>
+    </w:p>
+    <w:p>
+      <w:pPr>
+        <w:spacing w:line="276" w:lineRule="auto"/>
+        <w:rPr>
+          <w:rFonts w:ascii="Calibri" w:hAnsi="Calibri" w:cs="Calibri"/>
+          <w:sz w:val="22"/>
+          <w:szCs w:val="22"/>
+        </w:rPr>
+      </w:pPr>
+    </w:p>
+    <w:p>
+      <w:pPr>
+        <w:spacing w:line="276" w:lineRule="auto"/>
+        <w:rPr>
+          <w:rFonts w:ascii="Calibri" w:hAnsi="Calibri" w:cs="Calibri"/>
+          <w:sz w:val="22"/>
+          <w:szCs w:val="22"/>
+        </w:rPr>
+      </w:pPr>
+    </w:p>
+    <w:p>
+      <w:pPr>
+        <w:spacing w:line="276" w:lineRule="auto"/>
+        <w:rPr>
+          <w:rFonts w:ascii="Calibri" w:hAnsi="Calibri" w:cs="Calibri"/>
+          <w:sz w:val="22"/>
+          <w:szCs w:val="22"/>
+        </w:rPr>
+      </w:pPr>
+    </w:p>
+    <w:p>
+      <w:pPr>
+        <w:rPr>
+          <w:rFonts w:ascii="Calibri" w:hAnsi="Calibri" w:cs="Calibri"/>
+          <w:sz w:val="22"/>
+          <w:szCs w:val="22"/>
+        </w:rPr>
+      </w:pPr>
+      <w:r>
+        <w:rPr>
+          <w:rFonts w:ascii="Calibri" w:hAnsi="Calibri" w:cs="Calibri"/>
+          <w:sz w:val="22"/>
+          <w:szCs w:val="22"/>
+        </w:rPr>
+        <w:br w:type="page"/>
+      </w:r>
+    </w:p>
+    <w:p>
+      <w:pPr>
+        <w:spacing w:line="276" w:lineRule="auto"/>
+        <w:rPr>
+          <w:rFonts w:ascii="Calibri" w:hAnsi="Calibri" w:cs="Calibri"/>
+          <w:sz w:val="22"/>
+          <w:szCs w:val="22"/>
+        </w:rPr>
+      </w:pPr>
+    </w:p>
+    <w:p>
+      <w:pPr>
+        <w:spacing w:line="276" w:lineRule="auto"/>
+        <w:rPr>
+          <w:rFonts w:ascii="Calibri" w:hAnsi="Calibri" w:cs="Calibri"/>
+          <w:sz w:val="22"/>
+          <w:szCs w:val="22"/>
+        </w:rPr>
+      </w:pPr>
+    </w:p>
+    <w:p>
+      <w:pPr>
+        <w:spacing w:line="276" w:lineRule="auto"/>
+        <w:rPr>
+          <w:rFonts w:ascii="Calibri" w:hAnsi="Calibri" w:cs="Calibri"/>
+          <w:sz w:val="22"/>
+          <w:szCs w:val="22"/>
+        </w:rPr>
+      </w:pPr>
+    </w:p>
+    <w:p>
+      <w:pPr>
+        <w:spacing w:line="276" w:lineRule="auto"/>
+        <w:rPr>
+          <w:rFonts w:ascii="Calibri" w:hAnsi="Calibri" w:cs="Calibri"/>
+          <w:sz w:val="22"/>
+          <w:szCs w:val="22"/>
+        </w:rPr>
+      </w:pPr>
+    </w:p>
+    <w:p>
+      <w:pPr>
+        <w:spacing w:line="276" w:lineRule="auto"/>
+        <w:rPr>
+          <w:rFonts w:ascii="Calibri" w:hAnsi="Calibri" w:cs="Calibri"/>
+          <w:sz w:val="22"/>
+          <w:szCs w:val="22"/>
+        </w:rPr>
+      </w:pPr>
+    </w:p>
+    <w:p>
+      <w:pPr>
+        <w:spacing w:line="276" w:lineRule="auto"/>
+        <w:rPr>
+          <w:rFonts w:ascii="Calibri" w:hAnsi="Calibri" w:cs="Calibri"/>
+          <w:sz w:val="22"/>
+          <w:szCs w:val="22"/>
+        </w:rPr>
+      </w:pPr>
+    </w:p>
+    <w:p>
+      <w:pPr>
+        <w:spacing w:line="276" w:lineRule="auto"/>
+        <w:rPr>
+          <w:rFonts w:ascii="Calibri" w:hAnsi="Calibri" w:cs="Calibri"/>
+          <w:sz w:val="22"/>
+          <w:szCs w:val="22"/>
+        </w:rPr>
+      </w:pPr>
+    </w:p>
+    <w:p>
+      <w:pPr>
+        <w:spacing w:line="276" w:lineRule="auto"/>
+        <w:rPr>
+          <w:rFonts w:ascii="Calibri" w:hAnsi="Calibri" w:cs="Calibri"/>
+          <w:sz w:val="22"/>
+          <w:szCs w:val="22"/>
+        </w:rPr>
+      </w:pPr>
+    </w:p>
+    <w:p>
+      <w:pPr>
+        <w:spacing w:line="276" w:lineRule="auto"/>
+        <w:rPr>
+          <w:rFonts w:ascii="Calibri" w:hAnsi="Calibri" w:cs="Calibri"/>
+          <w:sz w:val="22"/>
+          <w:szCs w:val="22"/>
+        </w:rPr>
+      </w:pPr>
+    </w:p>
+    <w:p>
+      <w:pPr>
+        <w:spacing w:line="276" w:lineRule="auto"/>
+        <w:rPr>
+          <w:rFonts w:ascii="Calibri" w:hAnsi="Calibri" w:cs="Calibri"/>
+          <w:sz w:val="22"/>
+          <w:szCs w:val="22"/>
+        </w:rPr>
+      </w:pPr>
+    </w:p>
+    <w:p>
+      <w:pPr>
+        <w:spacing w:line="276" w:lineRule="auto"/>
+        <w:rPr>
+          <w:rFonts w:ascii="Calibri" w:hAnsi="Calibri" w:cs="Calibri"/>
+          <w:sz w:val="22"/>
+          <w:szCs w:val="22"/>
+        </w:rPr>
+      </w:pPr>
+    </w:p>
+    <w:p>
+      <w:pPr>
+        <w:spacing w:line="276" w:lineRule="auto"/>
+        <w:rPr>
+          <w:rFonts w:ascii="Calibri" w:hAnsi="Calibri" w:cs="Calibri"/>
+          <w:sz w:val="22"/>
+          <w:szCs w:val="22"/>
+        </w:rPr>
+      </w:pPr>
+    </w:p>
+    <w:p>
+      <w:pPr>
+        <w:spacing w:line="276" w:lineRule="auto"/>
+        <w:rPr>
+          <w:rFonts w:ascii="Calibri" w:hAnsi="Calibri" w:cs="Calibri"/>
+          <w:sz w:val="22"/>
+          <w:szCs w:val="22"/>
+        </w:rPr>
+      </w:pPr>
+    </w:p>
+    <w:p>
+      <w:pPr>
+        <w:spacing w:line="276" w:lineRule="auto"/>
+        <w:jc w:val="center"/>
+        <w:rPr>
+          <w:rFonts w:ascii="Calibri" w:hAnsi="Calibri" w:cs="Calibri"/>
+          <w:sz w:val="22"/>
+          <w:szCs w:val="22"/>
+        </w:rPr>
+      </w:pPr>
+      <w:r>
+        <w:rPr>
+          <w:rFonts w:ascii="Calibri" w:hAnsi="Calibri" w:cs="Calibri"/>
+          <w:noProof/>
+          <w:sz w:val="22"/>
+          <w:szCs w:val="22"/>
+        </w:rPr>
+        <w:drawing>
+          <wp:inline distT="0" distB="0" distL="0" distR="0" wp14:anchorId="5DCB726E" wp14:editId="2194F990">
+            <wp:extent cx="3836276" cy="2260378"/>
+            <wp:effectExtent l="0" t="0" r="0" b="635"/>
+            <wp:docPr id="1902918111" name="Image 21"/>
+            <wp:cNvGraphicFramePr>
+              <a:graphicFrameLocks xmlns:a="http://schemas.openxmlformats.org/drawingml/2006/main" noChangeAspect="1"/>
+            </wp:cNvGraphicFramePr>
+            <a:graphic xmlns:a="http://schemas.openxmlformats.org/drawingml/2006/main">
+              <a:graphicData uri="http://schemas.openxmlformats.org/drawingml/2006/picture">
+                <pic:pic xmlns:pic="http://schemas.openxmlformats.org/drawingml/2006/picture">
+                  <pic:nvPicPr>
+                    <pic:cNvPr id="1902918111" name="Image 1902918111"/>
+                    <pic:cNvPicPr/>
+                  </pic:nvPicPr>
+                  <pic:blipFill>
+                    <a:blip r:embed="rId4"/>
+                    <a:stretch>
+                      <a:fillRect/>
+                    </a:stretch>
+                  </pic:blipFill>
+                  <pic:spPr>
+                    <a:xfrm>
+                      <a:off x="0" y="0"/>
+                      <a:ext cx="3881781" cy="2287190"/>
+                    </a:xfrm>
+                    <a:prstGeom prst="rect">
+                      <a:avLst/>
+                    </a:prstGeom>
+                  </pic:spPr>
+                </pic:pic>
+              </a:graphicData>
+            </a:graphic>
+          </wp:inline>
+        </w:drawing>
+      </w:r>
+    </w:p>
+    <w:p>
+      <w:pPr>
+        <w:rPr>
+          <w:rFonts w:ascii="Calibri" w:hAnsi="Calibri" w:cs="Calibri"/>
+          <w:b/>
+          <w:bCs/>
+          <w:sz w:val="22"/>
+          <w:szCs w:val="22"/>
+          <w:lang w:val="en-GB"/>
+        </w:rPr>
+      </w:pPr>
+    </w:p>
+    <w:p>
+      <w:pPr>
+        <w:spacing w:before="100" w:beforeAutospacing="1" w:after="100" w:afterAutospacing="1" w:line="276" w:lineRule="auto"/>
+        <w:jc w:val="both"/>
+        <w:rPr>
+          <w:rFonts w:ascii="Calibri" w:eastAsia="Times New Roman" w:hAnsi="Calibri" w:cs="Calibri"/>
+          <w:color w:val="000000"/>
+          <w:sz w:val="22"/>
+          <w:szCs w:val="22"/>
+          <w:lang w:val="en-GB" w:eastAsia="fr-FR"/>
+        </w:rPr>
+      </w:pPr>
+      <w:r>
+        <w:rPr>
+          <w:rFonts w:ascii="Calibri" w:hAnsi="Calibri" w:cs="Calibri"/>
+          <w:b/>
+          <w:bCs/>
+          <w:sz w:val="22"/>
+          <w:szCs w:val="22"/>
+          <w:lang w:val="en-GB"/>
+        </w:rPr>
+        <w:t>Figure S1: Experimental design</w:t>
+      </w:r>
+      <w:r>
+        <w:rPr>
+          <w:rFonts w:ascii="Calibri" w:hAnsi="Calibri" w:cs="Calibri"/>
+          <w:b/>
+          <w:bCs/>
+          <w:sz w:val="22"/>
+          <w:szCs w:val="22"/>
+        </w:rPr>
+        <w:t>.</w:t>
+      </w:r>
+      <w:r>
+        <w:rPr>
+          <w:rFonts w:ascii="Calibri" w:hAnsi="Calibri" w:cs="Calibri"/>
+          <w:b/>
+          <w:bCs/>
+          <w:sz w:val="22"/>
+          <w:szCs w:val="22"/>
+        </w:rPr>
+        <w:t xml:space="preserve"> </w:t>
+      </w:r>
+      <w:r>
+        <w:rPr>
+          <w:rFonts w:ascii="Calibri" w:hAnsi="Calibri" w:cs="Calibri"/>
+          <w:b/>
+          <w:bCs/>
+          <w:sz w:val="22"/>
+          <w:szCs w:val="22"/>
+        </w:rPr>
+        <w:t xml:space="preserve"> </w:t>
+      </w:r>
+      <w:r>
+        <w:rPr>
+          <w:rFonts w:ascii="Calibri" w:eastAsia="Times New Roman" w:hAnsi="Calibri" w:cs="Calibri"/>
+          <w:color w:val="000000"/>
+          <w:sz w:val="22"/>
+          <w:szCs w:val="22"/>
+          <w:lang w:val="en-GB" w:eastAsia="fr-FR"/>
+        </w:rPr>
+        <w:t xml:space="preserve">Two experimental variables were introduced: mice were subjected either to a control diet or to a high-fat, high-carbohydrate (HFHC) diet, and, independently, received injections of either dextran or iron-dextran. </w:t>
+      </w:r>
+      <w:r>
+        <w:rPr>
+          <w:rFonts w:ascii="Calibri" w:hAnsi="Calibri" w:cs="Calibri"/>
+          <w:sz w:val="22"/>
+          <w:szCs w:val="22"/>
+          <w:lang w:val="en-GB"/>
+        </w:rPr>
+        <w:t>T</w:t>
+      </w:r>
+      <w:r>
+        <w:rPr>
+          <w:rFonts w:ascii="Calibri" w:hAnsi="Calibri" w:cs="Calibri"/>
+          <w:sz w:val="22"/>
+          <w:szCs w:val="22"/>
+          <w:lang w:val="en-GB"/>
+        </w:rPr>
+        <w:t xml:space="preserve">he steatosis (i.e., </w:t>
+      </w:r>
+      <w:r>
+        <w:rPr>
+          <w:rFonts w:ascii="Calibri" w:eastAsia="Times New Roman" w:hAnsi="Calibri" w:cs="Calibri"/>
+          <w:color w:val="000000"/>
+          <w:sz w:val="22"/>
+          <w:szCs w:val="22"/>
+          <w:lang w:val="en-GB" w:eastAsia="fr-FR"/>
+        </w:rPr>
+        <w:t>hepatic lipid accumulation</w:t>
+      </w:r>
+      <w:r>
+        <w:rPr>
+          <w:rFonts w:ascii="Calibri" w:hAnsi="Calibri" w:cs="Calibri"/>
+          <w:sz w:val="22"/>
+          <w:szCs w:val="22"/>
+          <w:lang w:val="en-GB"/>
+        </w:rPr>
+        <w:t>) has been evaluated through 3 biological scales</w:t>
+      </w:r>
+      <w:r>
+        <w:rPr>
+          <w:rFonts w:ascii="Calibri" w:hAnsi="Calibri" w:cs="Calibri"/>
+          <w:sz w:val="22"/>
+          <w:szCs w:val="22"/>
+          <w:lang w:val="en-GB"/>
+        </w:rPr>
+        <w:t>.</w:t>
+      </w:r>
+      <w:r>
+        <w:rPr>
+          <w:rFonts w:ascii="Calibri" w:eastAsia="Times New Roman" w:hAnsi="Calibri" w:cs="Calibri"/>
+          <w:color w:val="000000"/>
+          <w:sz w:val="22"/>
+          <w:szCs w:val="22"/>
+          <w:lang w:val="en-GB" w:eastAsia="fr-FR"/>
+        </w:rPr>
+        <w:t xml:space="preserve"> W</w:t>
+      </w:r>
+      <w:r>
+        <w:rPr>
+          <w:rFonts w:ascii="Calibri" w:eastAsia="Times New Roman" w:hAnsi="Calibri" w:cs="Calibri"/>
+          <w:color w:val="000000"/>
+          <w:sz w:val="22"/>
+          <w:szCs w:val="22"/>
+          <w:lang w:val="en-GB" w:eastAsia="fr-FR"/>
+        </w:rPr>
+        <w:t>e constructed several dataset</w:t>
+      </w:r>
+      <w:r>
+        <w:rPr>
+          <w:rFonts w:ascii="Calibri" w:eastAsia="Times New Roman" w:hAnsi="Calibri" w:cs="Calibri"/>
+          <w:color w:val="000000"/>
+          <w:sz w:val="22"/>
+          <w:szCs w:val="22"/>
+          <w:lang w:val="en-GB" w:eastAsia="fr-FR"/>
+        </w:rPr>
         <w:t>s</w:t>
       </w:r>
       <w:r>
         <w:rPr>
-          <w:rFonts w:ascii="Calibri" w:hAnsi="Calibri" w:cs="Calibri"/>
-          <w:sz w:val="22"/>
-          <w:szCs w:val="22"/>
-          <w:lang w:val="en-GB"/>
-        </w:rPr>
-        <w:t xml:space="preserve"> S1</w:t>
-      </w:r>
-      <w:r>
-        <w:rPr>
-          <w:rFonts w:ascii="Calibri" w:hAnsi="Calibri" w:cs="Calibri"/>
-          <w:sz w:val="22"/>
-          <w:szCs w:val="22"/>
-          <w:lang w:val="en-GB"/>
-        </w:rPr>
-        <w:t xml:space="preserve"> to </w:t>
-      </w:r>
-      <w:r>
-        <w:rPr>
-          <w:rFonts w:ascii="Calibri" w:hAnsi="Calibri" w:cs="Calibri"/>
-          <w:sz w:val="22"/>
-          <w:szCs w:val="22"/>
-          <w:lang w:val="en-GB"/>
-        </w:rPr>
-        <w:t>S</w:t>
-      </w:r>
-      <w:r>
-        <w:rPr>
-          <w:rFonts w:ascii="Calibri" w:hAnsi="Calibri" w:cs="Calibri"/>
-          <w:sz w:val="22"/>
-          <w:szCs w:val="22"/>
-          <w:lang w:val="en-GB"/>
-        </w:rPr>
-        <w:t>2</w:t>
-      </w:r>
-      <w:r>
-        <w:rPr>
-          <w:rFonts w:ascii="Calibri" w:hAnsi="Calibri" w:cs="Calibri"/>
-          <w:sz w:val="22"/>
-          <w:szCs w:val="22"/>
-          <w:lang w:val="en-GB"/>
+          <w:rFonts w:ascii="Calibri" w:eastAsia="Times New Roman" w:hAnsi="Calibri" w:cs="Calibri"/>
+          <w:color w:val="000000"/>
+          <w:sz w:val="22"/>
+          <w:szCs w:val="22"/>
+          <w:lang w:val="en-GB" w:eastAsia="fr-FR"/>
+        </w:rPr>
+        <w:t xml:space="preserve">. The first dataset consists of biochemical measurements from serum. The second dataset is derived from mid-infrared (MIR) spectroscopy performed on serum, providing molecular fingerprints specific to each mouse. The third dataset comprises quantitative measurements of metals and trace elements in the </w:t>
+      </w:r>
+      <w:r>
+        <w:rPr>
+          <w:rFonts w:ascii="Calibri" w:eastAsia="Times New Roman" w:hAnsi="Calibri" w:cs="Calibri"/>
+          <w:color w:val="000000"/>
+          <w:sz w:val="22"/>
+          <w:szCs w:val="22"/>
+          <w:lang w:val="en-GB" w:eastAsia="fr-FR"/>
+        </w:rPr>
+        <w:t>serum</w:t>
+      </w:r>
+      <w:r>
+        <w:rPr>
+          <w:rFonts w:ascii="Calibri" w:eastAsia="Times New Roman" w:hAnsi="Calibri" w:cs="Calibri"/>
+          <w:color w:val="000000"/>
+          <w:sz w:val="22"/>
+          <w:szCs w:val="22"/>
+          <w:lang w:val="en-GB" w:eastAsia="fr-FR"/>
         </w:rPr>
         <w:t>.</w:t>
       </w:r>
     </w:p>
     <w:p>
       <w:pPr>
+        <w:rPr>
+          <w:rFonts w:ascii="Calibri" w:hAnsi="Calibri" w:cs="Calibri"/>
+          <w:b/>
+          <w:bCs/>
+          <w:sz w:val="22"/>
+          <w:szCs w:val="22"/>
+        </w:rPr>
+      </w:pPr>
+    </w:p>
+    <w:p>
+      <w:pPr>
         <w:spacing w:line="276" w:lineRule="auto"/>
         <w:rPr>
           <w:rFonts w:ascii="Calibri" w:hAnsi="Calibri" w:cs="Calibri"/>
@@ -499,14 +878,6 @@
           <w:szCs w:val="22"/>
         </w:rPr>
       </w:pPr>
-      <w:r>
-        <w:rPr>
-          <w:rFonts w:ascii="Calibri" w:hAnsi="Calibri" w:cs="Calibri"/>
-          <w:sz w:val="22"/>
-          <w:szCs w:val="22"/>
-        </w:rPr>
-        <w:br w:type="page"/>
-      </w:r>
     </w:p>
     <w:p>
       <w:pPr>
@@ -547,89 +918,6 @@
           <w:szCs w:val="22"/>
         </w:rPr>
       </w:pPr>
-    </w:p>
-    <w:p>
-      <w:pPr>
-        <w:spacing w:line="276" w:lineRule="auto"/>
-        <w:rPr>
-          <w:rFonts w:ascii="Calibri" w:hAnsi="Calibri" w:cs="Calibri"/>
-          <w:sz w:val="22"/>
-          <w:szCs w:val="22"/>
-        </w:rPr>
-      </w:pPr>
-    </w:p>
-    <w:p>
-      <w:pPr>
-        <w:spacing w:line="276" w:lineRule="auto"/>
-        <w:rPr>
-          <w:rFonts w:ascii="Calibri" w:hAnsi="Calibri" w:cs="Calibri"/>
-          <w:sz w:val="22"/>
-          <w:szCs w:val="22"/>
-        </w:rPr>
-      </w:pPr>
-    </w:p>
-    <w:p>
-      <w:pPr>
-        <w:spacing w:line="276" w:lineRule="auto"/>
-        <w:rPr>
-          <w:rFonts w:ascii="Calibri" w:hAnsi="Calibri" w:cs="Calibri"/>
-          <w:sz w:val="22"/>
-          <w:szCs w:val="22"/>
-        </w:rPr>
-      </w:pPr>
-    </w:p>
-    <w:p>
-      <w:pPr>
-        <w:spacing w:line="276" w:lineRule="auto"/>
-        <w:rPr>
-          <w:rFonts w:ascii="Calibri" w:hAnsi="Calibri" w:cs="Calibri"/>
-          <w:sz w:val="22"/>
-          <w:szCs w:val="22"/>
-        </w:rPr>
-      </w:pPr>
-    </w:p>
-    <w:p>
-      <w:pPr>
-        <w:rPr>
-          <w:rFonts w:ascii="Calibri" w:hAnsi="Calibri" w:cs="Calibri"/>
-          <w:sz w:val="22"/>
-          <w:szCs w:val="22"/>
-        </w:rPr>
-      </w:pPr>
-      <w:r>
-        <w:rPr>
-          <w:rFonts w:ascii="Calibri" w:hAnsi="Calibri" w:cs="Calibri"/>
-          <w:sz w:val="22"/>
-          <w:szCs w:val="22"/>
-        </w:rPr>
-        <w:t xml:space="preserve">Figure S1 : </w:t>
-      </w:r>
-      <w:proofErr w:type="spellStart"/>
-      <w:r>
-        <w:rPr>
-          <w:rFonts w:ascii="Calibri" w:hAnsi="Calibri" w:cs="Calibri"/>
-          <w:sz w:val="22"/>
-          <w:szCs w:val="22"/>
-        </w:rPr>
-        <w:t>Experimental</w:t>
-      </w:r>
-      <w:proofErr w:type="spellEnd"/>
-      <w:r>
-        <w:rPr>
-          <w:rFonts w:ascii="Calibri" w:hAnsi="Calibri" w:cs="Calibri"/>
-          <w:sz w:val="22"/>
-          <w:szCs w:val="22"/>
-        </w:rPr>
-        <w:t xml:space="preserve"> design. </w:t>
-      </w:r>
-      <w:r>
-        <w:rPr>
-          <w:rFonts w:ascii="Calibri" w:hAnsi="Calibri" w:cs="Calibri"/>
-          <w:sz w:val="22"/>
-          <w:szCs w:val="22"/>
-        </w:rPr>
-        <w:br w:type="page"/>
-      </w:r>
     </w:p>
     <w:p>
       <w:pPr>
@@ -1075,7 +1363,7 @@
                               <pic:cNvPicPr/>
                             </pic:nvPicPr>
                             <pic:blipFill>
-                              <a:blip r:embed="rId4"/>
+                              <a:blip r:embed="rId5"/>
                               <a:stretch/>
                             </pic:blipFill>
                             <pic:spPr>
@@ -1154,7 +1442,7 @@
                               <pic:cNvPicPr/>
                             </pic:nvPicPr>
                             <pic:blipFill>
-                              <a:blip r:embed="rId5"/>
+                              <a:blip r:embed="rId6"/>
                               <a:stretch/>
                             </pic:blipFill>
                             <pic:spPr>
@@ -1233,7 +1521,7 @@
                               <pic:cNvPicPr/>
                             </pic:nvPicPr>
                             <pic:blipFill>
-                              <a:blip r:embed="rId6"/>
+                              <a:blip r:embed="rId7"/>
                               <a:stretch/>
                             </pic:blipFill>
                             <pic:spPr>
@@ -1312,7 +1600,7 @@
                               <pic:cNvPicPr/>
                             </pic:nvPicPr>
                             <pic:blipFill>
-                              <a:blip r:embed="rId7"/>
+                              <a:blip r:embed="rId8"/>
                               <a:stretch/>
                             </pic:blipFill>
                             <pic:spPr>
@@ -1391,7 +1679,7 @@
                               <pic:cNvPicPr/>
                             </pic:nvPicPr>
                             <pic:blipFill>
-                              <a:blip r:embed="rId8"/>
+                              <a:blip r:embed="rId9"/>
                               <a:stretch/>
                             </pic:blipFill>
                             <pic:spPr>
@@ -1470,7 +1758,7 @@
                               <pic:cNvPicPr/>
                             </pic:nvPicPr>
                             <pic:blipFill>
-                              <a:blip r:embed="rId9"/>
+                              <a:blip r:embed="rId10"/>
                               <a:stretch/>
                             </pic:blipFill>
                             <pic:spPr>
@@ -1699,7 +1987,7 @@
                               <pic:cNvPicPr/>
                             </pic:nvPicPr>
                             <pic:blipFill>
-                              <a:blip r:embed="rId10"/>
+                              <a:blip r:embed="rId11"/>
                               <a:stretch/>
                             </pic:blipFill>
                             <pic:spPr>
@@ -1928,7 +2216,7 @@
                               <pic:cNvPicPr/>
                             </pic:nvPicPr>
                             <pic:blipFill>
-                              <a:blip r:embed="rId11"/>
+                              <a:blip r:embed="rId12"/>
                               <a:stretch/>
                             </pic:blipFill>
                             <pic:spPr>
@@ -2234,7 +2522,7 @@
                       <o:lock v:ext="edit" aspectratio="t"/>
                     </v:shapetype>
                     <v:shape id="Image 614295229" o:spid="_x0000_s1034" type="#_x0000_t75" style="position:absolute;left:49455;top:10483;width:14825;height:12125;visibility:visible;mso-wrap-style:square" o:gfxdata="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">
-                      <v:imagedata r:id="rId12" o:title=""/>
+                      <v:imagedata r:id="rId13" o:title=""/>
                     </v:shape>
                     <v:line id="Line 3" o:spid="_x0000_s1035" style="position:absolute;visibility:visible;mso-wrap-style:square" from="49642,22068" to="55942,22068" o:connectortype="straight" o:gfxdata="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" strokecolor="black [3200]" strokeweight=".5pt">
                       <v:stroke joinstyle="miter"/>
@@ -2242,7 +2530,7 @@
                   </v:group>
                   <v:group id="Group 4" o:spid="_x0000_s1036" style="position:absolute;left:15400;width:14825;height:12124" coordorigin="19046,10551" coordsize="14824,12124" o:gfxdata="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">
                     <v:shape id="Image 892146329" o:spid="_x0000_s1037" type="#_x0000_t75" style="position:absolute;left:19046;top:10551;width:14825;height:12125;visibility:visible;mso-wrap-style:square" o:gfxdata="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">
-                      <v:imagedata r:id="rId13" o:title=""/>
+                      <v:imagedata r:id="rId14" o:title=""/>
                     </v:shape>
                     <v:line id="Line 5" o:spid="_x0000_s1038" style="position:absolute;visibility:visible;mso-wrap-style:square" from="19068,22349" to="25576,22349" o:connectortype="straight" o:gfxdata="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" strokecolor="black [3200]" strokeweight=".5pt">
                       <v:stroke joinstyle="miter"/>
@@ -2250,7 +2538,7 @@
                   </v:group>
                   <v:group id="Group 6" o:spid="_x0000_s1039" style="position:absolute;left:120;top:120;width:14825;height:12125" coordorigin="3696,10605" coordsize="14824,12124" o:gfxdata="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">
                     <v:shape id="Image 1658006412" o:spid="_x0000_s1040" type="#_x0000_t75" style="position:absolute;left:3696;top:10605;width:14824;height:12125;visibility:visible;mso-wrap-style:square" o:gfxdata="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">
-                      <v:imagedata r:id="rId14" o:title=""/>
+                      <v:imagedata r:id="rId15" o:title=""/>
                     </v:shape>
                     <v:line id="Line 7" o:spid="_x0000_s1041" style="position:absolute;visibility:visible;mso-wrap-style:square" from="3818,22320" to="10158,22320" o:connectortype="straight" o:gfxdata="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" strokecolor="black [3200]" strokeweight=".5pt">
                       <v:stroke joinstyle="miter"/>
@@ -2258,7 +2546,7 @@
                   </v:group>
                   <v:group id="Group 8" o:spid="_x0000_s1042" style="position:absolute;left:30680;width:14825;height:12124" coordorigin="34296,10505" coordsize="14824,12124" o:gfxdata="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">
                     <v:shape id="Image 453591905" o:spid="_x0000_s1043" type="#_x0000_t75" style="position:absolute;left:34296;top:10505;width:14824;height:12124;visibility:visible;mso-wrap-style:square" o:gfxdata="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">
-                      <v:imagedata r:id="rId15" o:title=""/>
+                      <v:imagedata r:id="rId16" o:title=""/>
                     </v:shape>
                     <v:line id="Line 9" o:spid="_x0000_s1044" style="position:absolute;visibility:visible;mso-wrap-style:square" from="34414,22230" to="40750,22230" o:connectortype="straight" o:gfxdata="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" strokecolor="black [3200]" strokeweight=".5pt">
                       <v:stroke joinstyle="miter"/>
@@ -2266,7 +2554,7 @@
                   </v:group>
                   <v:group id="Group 25" o:spid="_x0000_s1045" style="position:absolute;top:12392;width:14824;height:12125" coordorigin="3676,22912" coordsize="14824,12124" o:gfxdata="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">
                     <v:shape id="Image 2107259912" o:spid="_x0000_s1046" type="#_x0000_t75" style="position:absolute;left:3676;top:22912;width:14825;height:12124;visibility:visible;mso-wrap-style:square" o:gfxdata="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">
-                      <v:imagedata r:id="rId16" o:title=""/>
+                      <v:imagedata r:id="rId17" o:title=""/>
                     </v:shape>
                     <v:line id="Line 26" o:spid="_x0000_s1047" style="position:absolute;visibility:visible;mso-wrap-style:square" from="3856,34565" to="10145,34565" o:connectortype="straight" o:gfxdata="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" strokecolor="black [3200]" strokeweight=".5pt">
                       <v:stroke joinstyle="miter"/>
@@ -2274,7 +2562,7 @@
                   </v:group>
                   <v:group id="Group 27" o:spid="_x0000_s1048" style="position:absolute;left:30680;top:12392;width:14825;height:12125" coordorigin="34287,22904" coordsize="14824,12124" o:gfxdata="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">
                     <v:shape id="Image 200997622" o:spid="_x0000_s1049" type="#_x0000_t75" style="position:absolute;left:34287;top:22904;width:14825;height:12125;visibility:visible;mso-wrap-style:square" o:gfxdata="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">
-                      <v:imagedata r:id="rId17" o:title=""/>
+                      <v:imagedata r:id="rId18" o:title=""/>
                     </v:shape>
                     <v:shape id="CustomShape 28" o:spid="_x0000_s1050" style="position:absolute;left:39964;top:25846;width:1113;height:903;visibility:visible;mso-wrap-style:square;v-text-anchor:top" coordsize="21600,21600" o:gfxdata="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" path="m,l21600,21600e" filled="f" strokecolor="black [3200]" strokeweight=".79mm">
                       <v:stroke endarrow="block" joinstyle="miter"/>
@@ -2294,7 +2582,7 @@
                   </v:group>
                   <v:group id="Group 32" o:spid="_x0000_s1054" style="position:absolute;left:45720;top:12392;width:14824;height:12125" coordorigin="49393,22904" coordsize="14824,12124" o:gfxdata="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">
                     <v:shape id="Image 734290865" o:spid="_x0000_s1055" type="#_x0000_t75" style="position:absolute;left:49393;top:22904;width:14824;height:12125;visibility:visible;mso-wrap-style:square" o:gfxdata="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">
-                      <v:imagedata r:id="rId18" o:title=""/>
+                      <v:imagedata r:id="rId19" o:title=""/>
                     </v:shape>
                     <v:shape id="CustomShape 33" o:spid="_x0000_s1056" style="position:absolute;left:52060;top:28042;width:1113;height:903;visibility:visible;mso-wrap-style:square;v-text-anchor:top" coordsize="21600,21600" o:gfxdata="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" path="m,l21600,21600e" filled="f" strokecolor="black [3200]" strokeweight=".79mm">
                       <v:stroke endarrow="block" joinstyle="miter"/>
@@ -2314,7 +2602,7 @@
                   </v:group>
                   <v:group id="Group 37" o:spid="_x0000_s1060" style="position:absolute;left:15400;top:12392;width:14825;height:12125" coordorigin="19037,22904" coordsize="14824,12124" o:gfxdata="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">
                     <v:shape id="Image 1087527134" o:spid="_x0000_s1061" type="#_x0000_t75" style="position:absolute;left:19037;top:22904;width:14825;height:12125;visibility:visible;mso-wrap-style:square" o:gfxdata="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">
-                      <v:imagedata r:id="rId19" o:title=""/>
+                      <v:imagedata r:id="rId20" o:title=""/>
                     </v:shape>
                     <v:line id="Line 38" o:spid="_x0000_s1062" style="position:absolute;visibility:visible;mso-wrap-style:square" from="19207,34651" to="25496,34651" o:connectortype="straight" o:gfxdata="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" strokecolor="black [3200]" strokeweight=".5pt">
                       <v:stroke joinstyle="miter"/>
@@ -2809,10 +3097,2583 @@
           <w:sz w:val="22"/>
           <w:szCs w:val="22"/>
           <w:lang w:val="en-CA"/>
+        </w:rPr>
+      </w:pPr>
+    </w:p>
+    <w:p>
+      <w:pPr>
+        <w:spacing w:line="276" w:lineRule="auto"/>
+        <w:jc w:val="center"/>
+        <w:rPr>
+          <w:rFonts w:ascii="Calibri" w:hAnsi="Calibri" w:cs="Calibri"/>
+          <w:b/>
+          <w:bCs/>
+          <w:color w:val="000000"/>
+          <w:sz w:val="22"/>
+          <w:szCs w:val="22"/>
+          <w:lang w:val="en-GB"/>
+        </w:rPr>
+      </w:pPr>
+      <w:r>
+        <w:rPr>
+          <w:rFonts w:ascii="Calibri" w:hAnsi="Calibri" w:cs="Calibri"/>
+          <w:b/>
+          <w:bCs/>
+          <w:noProof/>
+          <w:color w:val="000000"/>
+          <w:sz w:val="22"/>
+          <w:szCs w:val="22"/>
+          <w:lang w:val="en-GB"/>
+        </w:rPr>
+        <mc:AlternateContent>
+          <mc:Choice Requires="wps">
+            <w:drawing>
+              <wp:anchor distT="0" distB="0" distL="114300" distR="114300" simplePos="0" relativeHeight="251726848" behindDoc="0" locked="0" layoutInCell="1" allowOverlap="1" wp14:anchorId="6C6ADFAF" wp14:editId="107726AD">
+                <wp:simplePos x="0" y="0"/>
+                <wp:positionH relativeFrom="column">
+                  <wp:posOffset>3958478</wp:posOffset>
+                </wp:positionH>
+                <wp:positionV relativeFrom="paragraph">
+                  <wp:posOffset>2566670</wp:posOffset>
+                </wp:positionV>
+                <wp:extent cx="914400" cy="320400"/>
+                <wp:effectExtent l="0" t="0" r="0" b="0"/>
+                <wp:wrapNone/>
+                <wp:docPr id="1988797931" name="Zone de texte 22"/>
+                <wp:cNvGraphicFramePr/>
+                <a:graphic xmlns:a="http://schemas.openxmlformats.org/drawingml/2006/main">
+                  <a:graphicData uri="http://schemas.microsoft.com/office/word/2010/wordprocessingShape">
+                    <wps:wsp>
+                      <wps:cNvSpPr txBox="1"/>
+                      <wps:spPr>
+                        <a:xfrm>
+                          <a:off x="0" y="0"/>
+                          <a:ext cx="914400" cy="320400"/>
+                        </a:xfrm>
+                        <a:prstGeom prst="rect">
+                          <a:avLst/>
+                        </a:prstGeom>
+                        <a:noFill/>
+                        <a:ln w="6350">
+                          <a:noFill/>
+                        </a:ln>
+                      </wps:spPr>
+                      <wps:txbx>
+                        <w:txbxContent>
+                          <w:p>
+                            <w:proofErr w:type="gramStart"/>
+                            <w:r>
+                              <w:t>a</w:t>
+                            </w:r>
+                            <w:proofErr w:type="gramEnd"/>
+                          </w:p>
+                        </w:txbxContent>
+                      </wps:txbx>
+                      <wps:bodyPr rot="0" spcFirstLastPara="0" vertOverflow="overflow" horzOverflow="overflow" vert="horz" wrap="none" lIns="91440" tIns="45720" rIns="91440" bIns="45720" numCol="1" spcCol="0" rtlCol="0" fromWordArt="0" anchor="t" anchorCtr="0" forceAA="0" compatLnSpc="1">
+                        <a:prstTxWarp prst="textNoShape">
+                          <a:avLst/>
+                        </a:prstTxWarp>
+                        <a:noAutofit/>
+                      </wps:bodyPr>
+                    </wps:wsp>
+                  </a:graphicData>
+                </a:graphic>
+                <wp14:sizeRelH relativeFrom="margin">
+                  <wp14:pctWidth>0</wp14:pctWidth>
+                </wp14:sizeRelH>
+                <wp14:sizeRelV relativeFrom="margin">
+                  <wp14:pctHeight>0</wp14:pctHeight>
+                </wp14:sizeRelV>
+              </wp:anchor>
+            </w:drawing>
+          </mc:Choice>
+          <mc:Fallback>
+            <w:pict>
+              <v:shapetype w14:anchorId="6C6ADFAF" id="_x0000_t202" coordsize="21600,21600" o:spt="202" path="m,l,21600r21600,l21600,xe">
+                <v:stroke joinstyle="miter"/>
+                <v:path gradientshapeok="t" o:connecttype="rect"/>
+              </v:shapetype>
+              <v:shape id="Zone de texte 22" o:spid="_x0000_s1064" type="#_x0000_t202" style="position:absolute;left:0;text-align:left;margin-left:311.7pt;margin-top:202.1pt;width:1in;height:25.25pt;z-index:251726848;visibility:visible;mso-wrap-style:none;mso-width-percent:0;mso-height-percent:0;mso-wrap-distance-left:9pt;mso-wrap-distance-top:0;mso-wrap-distance-right:9pt;mso-wrap-distance-bottom:0;mso-position-horizontal:absolute;mso-position-horizontal-relative:text;mso-position-vertical:absolute;mso-position-vertical-relative:text;mso-width-percent:0;mso-height-percent:0;mso-width-relative:margin;mso-height-relative:margin;v-text-anchor:top" o:gfxdata="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" filled="f" stroked="f" strokeweight=".5pt">
+                <v:textbox>
+                  <w:txbxContent>
+                    <w:p>
+                      <w:proofErr w:type="gramStart"/>
+                      <w:r>
+                        <w:t>a</w:t>
+                      </w:r>
+                      <w:proofErr w:type="gramEnd"/>
+                    </w:p>
+                  </w:txbxContent>
+                </v:textbox>
+              </v:shape>
+            </w:pict>
+          </mc:Fallback>
+        </mc:AlternateContent>
+      </w:r>
+      <w:r>
+        <w:rPr>
+          <w:rFonts w:ascii="Calibri" w:hAnsi="Calibri" w:cs="Calibri"/>
+          <w:b/>
+          <w:bCs/>
+          <w:noProof/>
+          <w:color w:val="000000"/>
+          <w:sz w:val="22"/>
+          <w:szCs w:val="22"/>
+          <w:lang w:val="en-GB"/>
+        </w:rPr>
+        <mc:AlternateContent>
+          <mc:Choice Requires="wps">
+            <w:drawing>
+              <wp:anchor distT="0" distB="0" distL="114300" distR="114300" simplePos="0" relativeHeight="251724800" behindDoc="0" locked="0" layoutInCell="1" allowOverlap="1" wp14:anchorId="2D329620" wp14:editId="75F82D46">
+                <wp:simplePos x="0" y="0"/>
+                <wp:positionH relativeFrom="column">
+                  <wp:posOffset>3277609</wp:posOffset>
+                </wp:positionH>
+                <wp:positionV relativeFrom="paragraph">
+                  <wp:posOffset>2566670</wp:posOffset>
+                </wp:positionV>
+                <wp:extent cx="914400" cy="320400"/>
+                <wp:effectExtent l="0" t="0" r="0" b="0"/>
+                <wp:wrapNone/>
+                <wp:docPr id="797293564" name="Zone de texte 22"/>
+                <wp:cNvGraphicFramePr/>
+                <a:graphic xmlns:a="http://schemas.openxmlformats.org/drawingml/2006/main">
+                  <a:graphicData uri="http://schemas.microsoft.com/office/word/2010/wordprocessingShape">
+                    <wps:wsp>
+                      <wps:cNvSpPr txBox="1"/>
+                      <wps:spPr>
+                        <a:xfrm>
+                          <a:off x="0" y="0"/>
+                          <a:ext cx="914400" cy="320400"/>
+                        </a:xfrm>
+                        <a:prstGeom prst="rect">
+                          <a:avLst/>
+                        </a:prstGeom>
+                        <a:noFill/>
+                        <a:ln w="6350">
+                          <a:noFill/>
+                        </a:ln>
+                      </wps:spPr>
+                      <wps:txbx>
+                        <w:txbxContent>
+                          <w:p>
+                            <w:proofErr w:type="gramStart"/>
+                            <w:r>
+                              <w:t>b</w:t>
+                            </w:r>
+                            <w:proofErr w:type="gramEnd"/>
+                          </w:p>
+                        </w:txbxContent>
+                      </wps:txbx>
+                      <wps:bodyPr rot="0" spcFirstLastPara="0" vertOverflow="overflow" horzOverflow="overflow" vert="horz" wrap="none" lIns="91440" tIns="45720" rIns="91440" bIns="45720" numCol="1" spcCol="0" rtlCol="0" fromWordArt="0" anchor="t" anchorCtr="0" forceAA="0" compatLnSpc="1">
+                        <a:prstTxWarp prst="textNoShape">
+                          <a:avLst/>
+                        </a:prstTxWarp>
+                        <a:noAutofit/>
+                      </wps:bodyPr>
+                    </wps:wsp>
+                  </a:graphicData>
+                </a:graphic>
+                <wp14:sizeRelH relativeFrom="margin">
+                  <wp14:pctWidth>0</wp14:pctWidth>
+                </wp14:sizeRelH>
+                <wp14:sizeRelV relativeFrom="margin">
+                  <wp14:pctHeight>0</wp14:pctHeight>
+                </wp14:sizeRelV>
+              </wp:anchor>
+            </w:drawing>
+          </mc:Choice>
+          <mc:Fallback>
+            <w:pict>
+              <v:shape w14:anchorId="2D329620" id="_x0000_s1065" type="#_x0000_t202" style="position:absolute;left:0;text-align:left;margin-left:258.1pt;margin-top:202.1pt;width:1in;height:25.25pt;z-index:251724800;visibility:visible;mso-wrap-style:none;mso-width-percent:0;mso-height-percent:0;mso-wrap-distance-left:9pt;mso-wrap-distance-top:0;mso-wrap-distance-right:9pt;mso-wrap-distance-bottom:0;mso-position-horizontal:absolute;mso-position-horizontal-relative:text;mso-position-vertical:absolute;mso-position-vertical-relative:text;mso-width-percent:0;mso-height-percent:0;mso-width-relative:margin;mso-height-relative:margin;v-text-anchor:top" o:gfxdata="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" filled="f" stroked="f" strokeweight=".5pt">
+                <v:textbox>
+                  <w:txbxContent>
+                    <w:p>
+                      <w:proofErr w:type="gramStart"/>
+                      <w:r>
+                        <w:t>b</w:t>
+                      </w:r>
+                      <w:proofErr w:type="gramEnd"/>
+                    </w:p>
+                  </w:txbxContent>
+                </v:textbox>
+              </v:shape>
+            </w:pict>
+          </mc:Fallback>
+        </mc:AlternateContent>
+      </w:r>
+      <w:r>
+        <w:rPr>
+          <w:rFonts w:ascii="Calibri" w:hAnsi="Calibri" w:cs="Calibri"/>
+          <w:b/>
+          <w:bCs/>
+          <w:noProof/>
+          <w:color w:val="000000"/>
+          <w:sz w:val="22"/>
+          <w:szCs w:val="22"/>
+          <w:lang w:val="en-GB"/>
+        </w:rPr>
+        <mc:AlternateContent>
+          <mc:Choice Requires="wps">
+            <w:drawing>
+              <wp:anchor distT="0" distB="0" distL="114300" distR="114300" simplePos="0" relativeHeight="251722752" behindDoc="0" locked="0" layoutInCell="1" allowOverlap="1" wp14:anchorId="34F8761E" wp14:editId="0D491FF8">
+                <wp:simplePos x="0" y="0"/>
+                <wp:positionH relativeFrom="column">
+                  <wp:posOffset>3881008</wp:posOffset>
+                </wp:positionH>
+                <wp:positionV relativeFrom="paragraph">
+                  <wp:posOffset>2826348</wp:posOffset>
+                </wp:positionV>
+                <wp:extent cx="914400" cy="320400"/>
+                <wp:effectExtent l="0" t="0" r="0" b="1270"/>
+                <wp:wrapNone/>
+                <wp:docPr id="240083555" name="Zone de texte 22"/>
+                <wp:cNvGraphicFramePr/>
+                <a:graphic xmlns:a="http://schemas.openxmlformats.org/drawingml/2006/main">
+                  <a:graphicData uri="http://schemas.microsoft.com/office/word/2010/wordprocessingShape">
+                    <wps:wsp>
+                      <wps:cNvSpPr txBox="1"/>
+                      <wps:spPr>
+                        <a:xfrm>
+                          <a:off x="0" y="0"/>
+                          <a:ext cx="914400" cy="320400"/>
+                        </a:xfrm>
+                        <a:prstGeom prst="rect">
+                          <a:avLst/>
+                        </a:prstGeom>
+                        <a:noFill/>
+                        <a:ln w="6350">
+                          <a:noFill/>
+                        </a:ln>
+                      </wps:spPr>
+                      <wps:txbx>
+                        <w:txbxContent>
+                          <w:p>
+                            <w:proofErr w:type="spellStart"/>
+                            <w:proofErr w:type="gramStart"/>
+                            <w:r>
+                              <w:t>a,b</w:t>
+                            </w:r>
+                            <w:proofErr w:type="spellEnd"/>
+                            <w:proofErr w:type="gramEnd"/>
+                          </w:p>
+                        </w:txbxContent>
+                      </wps:txbx>
+                      <wps:bodyPr rot="0" spcFirstLastPara="0" vertOverflow="overflow" horzOverflow="overflow" vert="horz" wrap="none" lIns="91440" tIns="45720" rIns="91440" bIns="45720" numCol="1" spcCol="0" rtlCol="0" fromWordArt="0" anchor="t" anchorCtr="0" forceAA="0" compatLnSpc="1">
+                        <a:prstTxWarp prst="textNoShape">
+                          <a:avLst/>
+                        </a:prstTxWarp>
+                        <a:noAutofit/>
+                      </wps:bodyPr>
+                    </wps:wsp>
+                  </a:graphicData>
+                </a:graphic>
+                <wp14:sizeRelH relativeFrom="margin">
+                  <wp14:pctWidth>0</wp14:pctWidth>
+                </wp14:sizeRelH>
+                <wp14:sizeRelV relativeFrom="margin">
+                  <wp14:pctHeight>0</wp14:pctHeight>
+                </wp14:sizeRelV>
+              </wp:anchor>
+            </w:drawing>
+          </mc:Choice>
+          <mc:Fallback>
+            <w:pict>
+              <v:shape w14:anchorId="34F8761E" id="_x0000_s1066" type="#_x0000_t202" style="position:absolute;left:0;text-align:left;margin-left:305.6pt;margin-top:222.55pt;width:1in;height:25.25pt;z-index:251722752;visibility:visible;mso-wrap-style:none;mso-width-percent:0;mso-height-percent:0;mso-wrap-distance-left:9pt;mso-wrap-distance-top:0;mso-wrap-distance-right:9pt;mso-wrap-distance-bottom:0;mso-position-horizontal:absolute;mso-position-horizontal-relative:text;mso-position-vertical:absolute;mso-position-vertical-relative:text;mso-width-percent:0;mso-height-percent:0;mso-width-relative:margin;mso-height-relative:margin;v-text-anchor:top" o:gfxdata="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" filled="f" stroked="f" strokeweight=".5pt">
+                <v:textbox>
+                  <w:txbxContent>
+                    <w:p>
+                      <w:proofErr w:type="spellStart"/>
+                      <w:proofErr w:type="gramStart"/>
+                      <w:r>
+                        <w:t>a,b</w:t>
+                      </w:r>
+                      <w:proofErr w:type="spellEnd"/>
+                      <w:proofErr w:type="gramEnd"/>
+                    </w:p>
+                  </w:txbxContent>
+                </v:textbox>
+              </v:shape>
+            </w:pict>
+          </mc:Fallback>
+        </mc:AlternateContent>
+      </w:r>
+      <w:r>
+        <w:rPr>
+          <w:rFonts w:ascii="Calibri" w:hAnsi="Calibri" w:cs="Calibri"/>
+          <w:b/>
+          <w:bCs/>
+          <w:noProof/>
+          <w:color w:val="000000"/>
+          <w:sz w:val="22"/>
+          <w:szCs w:val="22"/>
+          <w:lang w:val="en-GB"/>
+        </w:rPr>
+        <mc:AlternateContent>
+          <mc:Choice Requires="wps">
+            <w:drawing>
+              <wp:anchor distT="0" distB="0" distL="114300" distR="114300" simplePos="0" relativeHeight="251720704" behindDoc="0" locked="0" layoutInCell="1" allowOverlap="1" wp14:anchorId="1A142583" wp14:editId="5CABBECE">
+                <wp:simplePos x="0" y="0"/>
+                <wp:positionH relativeFrom="column">
+                  <wp:posOffset>3223522</wp:posOffset>
+                </wp:positionH>
+                <wp:positionV relativeFrom="paragraph">
+                  <wp:posOffset>3059430</wp:posOffset>
+                </wp:positionV>
+                <wp:extent cx="914400" cy="320400"/>
+                <wp:effectExtent l="0" t="0" r="0" b="0"/>
+                <wp:wrapNone/>
+                <wp:docPr id="1316962642" name="Zone de texte 22"/>
+                <wp:cNvGraphicFramePr/>
+                <a:graphic xmlns:a="http://schemas.openxmlformats.org/drawingml/2006/main">
+                  <a:graphicData uri="http://schemas.microsoft.com/office/word/2010/wordprocessingShape">
+                    <wps:wsp>
+                      <wps:cNvSpPr txBox="1"/>
+                      <wps:spPr>
+                        <a:xfrm>
+                          <a:off x="0" y="0"/>
+                          <a:ext cx="914400" cy="320400"/>
+                        </a:xfrm>
+                        <a:prstGeom prst="rect">
+                          <a:avLst/>
+                        </a:prstGeom>
+                        <a:noFill/>
+                        <a:ln w="6350">
+                          <a:noFill/>
+                        </a:ln>
+                      </wps:spPr>
+                      <wps:txbx>
+                        <w:txbxContent>
+                          <w:p>
+                            <w:proofErr w:type="spellStart"/>
+                            <w:proofErr w:type="gramStart"/>
+                            <w:r>
+                              <w:t>a,</w:t>
+                            </w:r>
+                            <w:r>
+                              <w:t>b</w:t>
+                            </w:r>
+                            <w:proofErr w:type="spellEnd"/>
+                            <w:proofErr w:type="gramEnd"/>
+                          </w:p>
+                        </w:txbxContent>
+                      </wps:txbx>
+                      <wps:bodyPr rot="0" spcFirstLastPara="0" vertOverflow="overflow" horzOverflow="overflow" vert="horz" wrap="none" lIns="91440" tIns="45720" rIns="91440" bIns="45720" numCol="1" spcCol="0" rtlCol="0" fromWordArt="0" anchor="t" anchorCtr="0" forceAA="0" compatLnSpc="1">
+                        <a:prstTxWarp prst="textNoShape">
+                          <a:avLst/>
+                        </a:prstTxWarp>
+                        <a:noAutofit/>
+                      </wps:bodyPr>
+                    </wps:wsp>
+                  </a:graphicData>
+                </a:graphic>
+                <wp14:sizeRelH relativeFrom="margin">
+                  <wp14:pctWidth>0</wp14:pctWidth>
+                </wp14:sizeRelH>
+                <wp14:sizeRelV relativeFrom="margin">
+                  <wp14:pctHeight>0</wp14:pctHeight>
+                </wp14:sizeRelV>
+              </wp:anchor>
+            </w:drawing>
+          </mc:Choice>
+          <mc:Fallback>
+            <w:pict>
+              <v:shape w14:anchorId="1A142583" id="_x0000_s1067" type="#_x0000_t202" style="position:absolute;left:0;text-align:left;margin-left:253.8pt;margin-top:240.9pt;width:1in;height:25.25pt;z-index:251720704;visibility:visible;mso-wrap-style:none;mso-width-percent:0;mso-height-percent:0;mso-wrap-distance-left:9pt;mso-wrap-distance-top:0;mso-wrap-distance-right:9pt;mso-wrap-distance-bottom:0;mso-position-horizontal:absolute;mso-position-horizontal-relative:text;mso-position-vertical:absolute;mso-position-vertical-relative:text;mso-width-percent:0;mso-height-percent:0;mso-width-relative:margin;mso-height-relative:margin;v-text-anchor:top" o:gfxdata="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" filled="f" stroked="f" strokeweight=".5pt">
+                <v:textbox>
+                  <w:txbxContent>
+                    <w:p>
+                      <w:proofErr w:type="spellStart"/>
+                      <w:proofErr w:type="gramStart"/>
+                      <w:r>
+                        <w:t>a,</w:t>
+                      </w:r>
+                      <w:r>
+                        <w:t>b</w:t>
+                      </w:r>
+                      <w:proofErr w:type="spellEnd"/>
+                      <w:proofErr w:type="gramEnd"/>
+                    </w:p>
+                  </w:txbxContent>
+                </v:textbox>
+              </v:shape>
+            </w:pict>
+          </mc:Fallback>
+        </mc:AlternateContent>
+      </w:r>
+      <w:r>
+        <w:rPr>
+          <w:rFonts w:ascii="Calibri" w:hAnsi="Calibri" w:cs="Calibri"/>
+          <w:b/>
+          <w:bCs/>
+          <w:noProof/>
+          <w:color w:val="000000"/>
+          <w:sz w:val="22"/>
+          <w:szCs w:val="22"/>
+          <w:lang w:val="en-GB"/>
+        </w:rPr>
+        <mc:AlternateContent>
+          <mc:Choice Requires="wps">
+            <w:drawing>
+              <wp:anchor distT="0" distB="0" distL="114300" distR="114300" simplePos="0" relativeHeight="251692032" behindDoc="0" locked="0" layoutInCell="1" allowOverlap="1" wp14:anchorId="182B506E" wp14:editId="1DD965F4">
+                <wp:simplePos x="0" y="0"/>
+                <wp:positionH relativeFrom="column">
+                  <wp:posOffset>3841936</wp:posOffset>
+                </wp:positionH>
+                <wp:positionV relativeFrom="paragraph">
+                  <wp:posOffset>3059430</wp:posOffset>
+                </wp:positionV>
+                <wp:extent cx="914400" cy="320400"/>
+                <wp:effectExtent l="0" t="0" r="0" b="0"/>
+                <wp:wrapNone/>
+                <wp:docPr id="1496890479" name="Zone de texte 22"/>
+                <wp:cNvGraphicFramePr/>
+                <a:graphic xmlns:a="http://schemas.openxmlformats.org/drawingml/2006/main">
+                  <a:graphicData uri="http://schemas.microsoft.com/office/word/2010/wordprocessingShape">
+                    <wps:wsp>
+                      <wps:cNvSpPr txBox="1"/>
+                      <wps:spPr>
+                        <a:xfrm>
+                          <a:off x="0" y="0"/>
+                          <a:ext cx="914400" cy="320400"/>
+                        </a:xfrm>
+                        <a:prstGeom prst="rect">
+                          <a:avLst/>
+                        </a:prstGeom>
+                        <a:noFill/>
+                        <a:ln w="6350">
+                          <a:noFill/>
+                        </a:ln>
+                      </wps:spPr>
+                      <wps:txbx>
+                        <w:txbxContent>
+                          <w:p>
+                            <w:proofErr w:type="spellStart"/>
+                            <w:proofErr w:type="gramStart"/>
+                            <w:r>
+                              <w:t>a,b</w:t>
+                            </w:r>
+                            <w:proofErr w:type="gramEnd"/>
+                            <w:r>
+                              <w:t>,c</w:t>
+                            </w:r>
+                            <w:proofErr w:type="spellEnd"/>
+                          </w:p>
+                        </w:txbxContent>
+                      </wps:txbx>
+                      <wps:bodyPr rot="0" spcFirstLastPara="0" vertOverflow="overflow" horzOverflow="overflow" vert="horz" wrap="none" lIns="91440" tIns="45720" rIns="91440" bIns="45720" numCol="1" spcCol="0" rtlCol="0" fromWordArt="0" anchor="t" anchorCtr="0" forceAA="0" compatLnSpc="1">
+                        <a:prstTxWarp prst="textNoShape">
+                          <a:avLst/>
+                        </a:prstTxWarp>
+                        <a:noAutofit/>
+                      </wps:bodyPr>
+                    </wps:wsp>
+                  </a:graphicData>
+                </a:graphic>
+                <wp14:sizeRelH relativeFrom="margin">
+                  <wp14:pctWidth>0</wp14:pctWidth>
+                </wp14:sizeRelH>
+                <wp14:sizeRelV relativeFrom="margin">
+                  <wp14:pctHeight>0</wp14:pctHeight>
+                </wp14:sizeRelV>
+              </wp:anchor>
+            </w:drawing>
+          </mc:Choice>
+          <mc:Fallback>
+            <w:pict>
+              <v:shape w14:anchorId="182B506E" id="_x0000_s1068" type="#_x0000_t202" style="position:absolute;left:0;text-align:left;margin-left:302.5pt;margin-top:240.9pt;width:1in;height:25.25pt;z-index:251692032;visibility:visible;mso-wrap-style:none;mso-width-percent:0;mso-height-percent:0;mso-wrap-distance-left:9pt;mso-wrap-distance-top:0;mso-wrap-distance-right:9pt;mso-wrap-distance-bottom:0;mso-position-horizontal:absolute;mso-position-horizontal-relative:text;mso-position-vertical:absolute;mso-position-vertical-relative:text;mso-width-percent:0;mso-height-percent:0;mso-width-relative:margin;mso-height-relative:margin;v-text-anchor:top" o:gfxdata="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" filled="f" stroked="f" strokeweight=".5pt">
+                <v:textbox>
+                  <w:txbxContent>
+                    <w:p>
+                      <w:proofErr w:type="spellStart"/>
+                      <w:proofErr w:type="gramStart"/>
+                      <w:r>
+                        <w:t>a,b</w:t>
+                      </w:r>
+                      <w:proofErr w:type="gramEnd"/>
+                      <w:r>
+                        <w:t>,c</w:t>
+                      </w:r>
+                      <w:proofErr w:type="spellEnd"/>
+                    </w:p>
+                  </w:txbxContent>
+                </v:textbox>
+              </v:shape>
+            </w:pict>
+          </mc:Fallback>
+        </mc:AlternateContent>
+      </w:r>
+      <w:r>
+        <w:rPr>
+          <w:rFonts w:ascii="Calibri" w:hAnsi="Calibri" w:cs="Calibri"/>
+          <w:b/>
+          <w:bCs/>
+          <w:noProof/>
+          <w:color w:val="000000"/>
+          <w:sz w:val="22"/>
+          <w:szCs w:val="22"/>
+          <w:lang w:val="en-GB"/>
+        </w:rPr>
+        <mc:AlternateContent>
+          <mc:Choice Requires="wps">
+            <w:drawing>
+              <wp:anchor distT="0" distB="0" distL="114300" distR="114300" simplePos="0" relativeHeight="251718656" behindDoc="0" locked="0" layoutInCell="1" allowOverlap="1" wp14:anchorId="0AC1C39A" wp14:editId="5661EE13">
+                <wp:simplePos x="0" y="0"/>
+                <wp:positionH relativeFrom="column">
+                  <wp:posOffset>3958927</wp:posOffset>
+                </wp:positionH>
+                <wp:positionV relativeFrom="paragraph">
+                  <wp:posOffset>3570419</wp:posOffset>
+                </wp:positionV>
+                <wp:extent cx="914400" cy="320400"/>
+                <wp:effectExtent l="0" t="0" r="0" b="0"/>
+                <wp:wrapNone/>
+                <wp:docPr id="137524516" name="Zone de texte 22"/>
+                <wp:cNvGraphicFramePr/>
+                <a:graphic xmlns:a="http://schemas.openxmlformats.org/drawingml/2006/main">
+                  <a:graphicData uri="http://schemas.microsoft.com/office/word/2010/wordprocessingShape">
+                    <wps:wsp>
+                      <wps:cNvSpPr txBox="1"/>
+                      <wps:spPr>
+                        <a:xfrm>
+                          <a:off x="0" y="0"/>
+                          <a:ext cx="914400" cy="320400"/>
+                        </a:xfrm>
+                        <a:prstGeom prst="rect">
+                          <a:avLst/>
+                        </a:prstGeom>
+                        <a:noFill/>
+                        <a:ln w="6350">
+                          <a:noFill/>
+                        </a:ln>
+                      </wps:spPr>
+                      <wps:txbx>
+                        <w:txbxContent>
+                          <w:p>
+                            <w:proofErr w:type="gramStart"/>
+                            <w:r>
+                              <w:t>a</w:t>
+                            </w:r>
+                            <w:proofErr w:type="gramEnd"/>
+                          </w:p>
+                        </w:txbxContent>
+                      </wps:txbx>
+                      <wps:bodyPr rot="0" spcFirstLastPara="0" vertOverflow="overflow" horzOverflow="overflow" vert="horz" wrap="none" lIns="91440" tIns="45720" rIns="91440" bIns="45720" numCol="1" spcCol="0" rtlCol="0" fromWordArt="0" anchor="t" anchorCtr="0" forceAA="0" compatLnSpc="1">
+                        <a:prstTxWarp prst="textNoShape">
+                          <a:avLst/>
+                        </a:prstTxWarp>
+                        <a:noAutofit/>
+                      </wps:bodyPr>
+                    </wps:wsp>
+                  </a:graphicData>
+                </a:graphic>
+                <wp14:sizeRelH relativeFrom="margin">
+                  <wp14:pctWidth>0</wp14:pctWidth>
+                </wp14:sizeRelH>
+                <wp14:sizeRelV relativeFrom="margin">
+                  <wp14:pctHeight>0</wp14:pctHeight>
+                </wp14:sizeRelV>
+              </wp:anchor>
+            </w:drawing>
+          </mc:Choice>
+          <mc:Fallback>
+            <w:pict>
+              <v:shape w14:anchorId="0AC1C39A" id="_x0000_s1069" type="#_x0000_t202" style="position:absolute;left:0;text-align:left;margin-left:311.75pt;margin-top:281.15pt;width:1in;height:25.25pt;z-index:251718656;visibility:visible;mso-wrap-style:none;mso-width-percent:0;mso-height-percent:0;mso-wrap-distance-left:9pt;mso-wrap-distance-top:0;mso-wrap-distance-right:9pt;mso-wrap-distance-bottom:0;mso-position-horizontal:absolute;mso-position-horizontal-relative:text;mso-position-vertical:absolute;mso-position-vertical-relative:text;mso-width-percent:0;mso-height-percent:0;mso-width-relative:margin;mso-height-relative:margin;v-text-anchor:top" o:gfxdata="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" filled="f" stroked="f" strokeweight=".5pt">
+                <v:textbox>
+                  <w:txbxContent>
+                    <w:p>
+                      <w:proofErr w:type="gramStart"/>
+                      <w:r>
+                        <w:t>a</w:t>
+                      </w:r>
+                      <w:proofErr w:type="gramEnd"/>
+                    </w:p>
+                  </w:txbxContent>
+                </v:textbox>
+              </v:shape>
+            </w:pict>
+          </mc:Fallback>
+        </mc:AlternateContent>
+      </w:r>
+      <w:r>
+        <w:rPr>
+          <w:rFonts w:ascii="Calibri" w:hAnsi="Calibri" w:cs="Calibri"/>
+          <w:b/>
+          <w:bCs/>
+          <w:noProof/>
+          <w:color w:val="000000"/>
+          <w:sz w:val="22"/>
+          <w:szCs w:val="22"/>
+          <w:lang w:val="en-GB"/>
+        </w:rPr>
+        <mc:AlternateContent>
+          <mc:Choice Requires="wps">
+            <w:drawing>
+              <wp:anchor distT="0" distB="0" distL="114300" distR="114300" simplePos="0" relativeHeight="251716608" behindDoc="0" locked="0" layoutInCell="1" allowOverlap="1" wp14:anchorId="78F14C77" wp14:editId="1AAACEA2">
+                <wp:simplePos x="0" y="0"/>
+                <wp:positionH relativeFrom="column">
+                  <wp:posOffset>3841936</wp:posOffset>
+                </wp:positionH>
+                <wp:positionV relativeFrom="paragraph">
+                  <wp:posOffset>1302385</wp:posOffset>
+                </wp:positionV>
+                <wp:extent cx="914400" cy="320400"/>
+                <wp:effectExtent l="0" t="0" r="0" b="0"/>
+                <wp:wrapNone/>
+                <wp:docPr id="26071291" name="Zone de texte 22"/>
+                <wp:cNvGraphicFramePr/>
+                <a:graphic xmlns:a="http://schemas.openxmlformats.org/drawingml/2006/main">
+                  <a:graphicData uri="http://schemas.microsoft.com/office/word/2010/wordprocessingShape">
+                    <wps:wsp>
+                      <wps:cNvSpPr txBox="1"/>
+                      <wps:spPr>
+                        <a:xfrm>
+                          <a:off x="0" y="0"/>
+                          <a:ext cx="914400" cy="320400"/>
+                        </a:xfrm>
+                        <a:prstGeom prst="rect">
+                          <a:avLst/>
+                        </a:prstGeom>
+                        <a:noFill/>
+                        <a:ln w="6350">
+                          <a:noFill/>
+                        </a:ln>
+                      </wps:spPr>
+                      <wps:txbx>
+                        <w:txbxContent>
+                          <w:p>
+                            <w:proofErr w:type="spellStart"/>
+                            <w:proofErr w:type="gramStart"/>
+                            <w:r>
+                              <w:t>a,</w:t>
+                            </w:r>
+                            <w:r>
+                              <w:t>b</w:t>
+                            </w:r>
+                            <w:proofErr w:type="gramEnd"/>
+                            <w:r>
+                              <w:t>,</w:t>
+                            </w:r>
+                            <w:r>
+                              <w:t>c</w:t>
+                            </w:r>
+                            <w:proofErr w:type="spellEnd"/>
+                          </w:p>
+                        </w:txbxContent>
+                      </wps:txbx>
+                      <wps:bodyPr rot="0" spcFirstLastPara="0" vertOverflow="overflow" horzOverflow="overflow" vert="horz" wrap="none" lIns="91440" tIns="45720" rIns="91440" bIns="45720" numCol="1" spcCol="0" rtlCol="0" fromWordArt="0" anchor="t" anchorCtr="0" forceAA="0" compatLnSpc="1">
+                        <a:prstTxWarp prst="textNoShape">
+                          <a:avLst/>
+                        </a:prstTxWarp>
+                        <a:noAutofit/>
+                      </wps:bodyPr>
+                    </wps:wsp>
+                  </a:graphicData>
+                </a:graphic>
+                <wp14:sizeRelH relativeFrom="margin">
+                  <wp14:pctWidth>0</wp14:pctWidth>
+                </wp14:sizeRelH>
+                <wp14:sizeRelV relativeFrom="margin">
+                  <wp14:pctHeight>0</wp14:pctHeight>
+                </wp14:sizeRelV>
+              </wp:anchor>
+            </w:drawing>
+          </mc:Choice>
+          <mc:Fallback>
+            <w:pict>
+              <v:shape w14:anchorId="78F14C77" id="_x0000_s1070" type="#_x0000_t202" style="position:absolute;left:0;text-align:left;margin-left:302.5pt;margin-top:102.55pt;width:1in;height:25.25pt;z-index:251716608;visibility:visible;mso-wrap-style:none;mso-width-percent:0;mso-height-percent:0;mso-wrap-distance-left:9pt;mso-wrap-distance-top:0;mso-wrap-distance-right:9pt;mso-wrap-distance-bottom:0;mso-position-horizontal:absolute;mso-position-horizontal-relative:text;mso-position-vertical:absolute;mso-position-vertical-relative:text;mso-width-percent:0;mso-height-percent:0;mso-width-relative:margin;mso-height-relative:margin;v-text-anchor:top" o:gfxdata="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" filled="f" stroked="f" strokeweight=".5pt">
+                <v:textbox>
+                  <w:txbxContent>
+                    <w:p>
+                      <w:proofErr w:type="spellStart"/>
+                      <w:proofErr w:type="gramStart"/>
+                      <w:r>
+                        <w:t>a,</w:t>
+                      </w:r>
+                      <w:r>
+                        <w:t>b</w:t>
+                      </w:r>
+                      <w:proofErr w:type="gramEnd"/>
+                      <w:r>
+                        <w:t>,</w:t>
+                      </w:r>
+                      <w:r>
+                        <w:t>c</w:t>
+                      </w:r>
+                      <w:proofErr w:type="spellEnd"/>
+                    </w:p>
+                  </w:txbxContent>
+                </v:textbox>
+              </v:shape>
+            </w:pict>
+          </mc:Fallback>
+        </mc:AlternateContent>
+      </w:r>
+      <w:r>
+        <w:rPr>
+          <w:rFonts w:ascii="Calibri" w:hAnsi="Calibri" w:cs="Calibri"/>
+          <w:b/>
+          <w:bCs/>
+          <w:noProof/>
+          <w:color w:val="000000"/>
+          <w:sz w:val="22"/>
+          <w:szCs w:val="22"/>
+          <w:lang w:val="en-GB"/>
+        </w:rPr>
+        <mc:AlternateContent>
+          <mc:Choice Requires="wps">
+            <w:drawing>
+              <wp:anchor distT="0" distB="0" distL="114300" distR="114300" simplePos="0" relativeHeight="251714560" behindDoc="0" locked="0" layoutInCell="1" allowOverlap="1" wp14:anchorId="4089F207" wp14:editId="36ABD6A4">
+                <wp:simplePos x="0" y="0"/>
+                <wp:positionH relativeFrom="column">
+                  <wp:posOffset>3269615</wp:posOffset>
+                </wp:positionH>
+                <wp:positionV relativeFrom="paragraph">
+                  <wp:posOffset>809364</wp:posOffset>
+                </wp:positionV>
+                <wp:extent cx="914400" cy="320400"/>
+                <wp:effectExtent l="0" t="0" r="0" b="0"/>
+                <wp:wrapNone/>
+                <wp:docPr id="266843221" name="Zone de texte 22"/>
+                <wp:cNvGraphicFramePr/>
+                <a:graphic xmlns:a="http://schemas.openxmlformats.org/drawingml/2006/main">
+                  <a:graphicData uri="http://schemas.microsoft.com/office/word/2010/wordprocessingShape">
+                    <wps:wsp>
+                      <wps:cNvSpPr txBox="1"/>
+                      <wps:spPr>
+                        <a:xfrm>
+                          <a:off x="0" y="0"/>
+                          <a:ext cx="914400" cy="320400"/>
+                        </a:xfrm>
+                        <a:prstGeom prst="rect">
+                          <a:avLst/>
+                        </a:prstGeom>
+                        <a:noFill/>
+                        <a:ln w="6350">
+                          <a:noFill/>
+                        </a:ln>
+                      </wps:spPr>
+                      <wps:txbx>
+                        <w:txbxContent>
+                          <w:p>
+                            <w:proofErr w:type="gramStart"/>
+                            <w:r>
+                              <w:t>b</w:t>
+                            </w:r>
+                            <w:proofErr w:type="gramEnd"/>
+                          </w:p>
+                        </w:txbxContent>
+                      </wps:txbx>
+                      <wps:bodyPr rot="0" spcFirstLastPara="0" vertOverflow="overflow" horzOverflow="overflow" vert="horz" wrap="none" lIns="91440" tIns="45720" rIns="91440" bIns="45720" numCol="1" spcCol="0" rtlCol="0" fromWordArt="0" anchor="t" anchorCtr="0" forceAA="0" compatLnSpc="1">
+                        <a:prstTxWarp prst="textNoShape">
+                          <a:avLst/>
+                        </a:prstTxWarp>
+                        <a:noAutofit/>
+                      </wps:bodyPr>
+                    </wps:wsp>
+                  </a:graphicData>
+                </a:graphic>
+                <wp14:sizeRelH relativeFrom="margin">
+                  <wp14:pctWidth>0</wp14:pctWidth>
+                </wp14:sizeRelH>
+                <wp14:sizeRelV relativeFrom="margin">
+                  <wp14:pctHeight>0</wp14:pctHeight>
+                </wp14:sizeRelV>
+              </wp:anchor>
+            </w:drawing>
+          </mc:Choice>
+          <mc:Fallback>
+            <w:pict>
+              <v:shape w14:anchorId="4089F207" id="_x0000_s1071" type="#_x0000_t202" style="position:absolute;left:0;text-align:left;margin-left:257.45pt;margin-top:63.75pt;width:1in;height:25.25pt;z-index:251714560;visibility:visible;mso-wrap-style:none;mso-width-percent:0;mso-height-percent:0;mso-wrap-distance-left:9pt;mso-wrap-distance-top:0;mso-wrap-distance-right:9pt;mso-wrap-distance-bottom:0;mso-position-horizontal:absolute;mso-position-horizontal-relative:text;mso-position-vertical:absolute;mso-position-vertical-relative:text;mso-width-percent:0;mso-height-percent:0;mso-width-relative:margin;mso-height-relative:margin;v-text-anchor:top" o:gfxdata="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" filled="f" stroked="f" strokeweight=".5pt">
+                <v:textbox>
+                  <w:txbxContent>
+                    <w:p>
+                      <w:proofErr w:type="gramStart"/>
+                      <w:r>
+                        <w:t>b</w:t>
+                      </w:r>
+                      <w:proofErr w:type="gramEnd"/>
+                    </w:p>
+                  </w:txbxContent>
+                </v:textbox>
+              </v:shape>
+            </w:pict>
+          </mc:Fallback>
+        </mc:AlternateContent>
+      </w:r>
+      <w:r>
+        <w:rPr>
+          <w:rFonts w:ascii="Calibri" w:hAnsi="Calibri" w:cs="Calibri"/>
+          <w:b/>
+          <w:bCs/>
+          <w:noProof/>
+          <w:color w:val="000000"/>
+          <w:sz w:val="22"/>
+          <w:szCs w:val="22"/>
+          <w:lang w:val="en-GB"/>
+        </w:rPr>
+        <mc:AlternateContent>
+          <mc:Choice Requires="wps">
+            <w:drawing>
+              <wp:anchor distT="0" distB="0" distL="114300" distR="114300" simplePos="0" relativeHeight="251712512" behindDoc="0" locked="0" layoutInCell="1" allowOverlap="1" wp14:anchorId="573ECC65" wp14:editId="7806CDDB">
+                <wp:simplePos x="0" y="0"/>
+                <wp:positionH relativeFrom="column">
+                  <wp:posOffset>3896174</wp:posOffset>
+                </wp:positionH>
+                <wp:positionV relativeFrom="paragraph">
+                  <wp:posOffset>809625</wp:posOffset>
+                </wp:positionV>
+                <wp:extent cx="914400" cy="320400"/>
+                <wp:effectExtent l="0" t="0" r="0" b="0"/>
+                <wp:wrapNone/>
+                <wp:docPr id="468300964" name="Zone de texte 22"/>
+                <wp:cNvGraphicFramePr/>
+                <a:graphic xmlns:a="http://schemas.openxmlformats.org/drawingml/2006/main">
+                  <a:graphicData uri="http://schemas.microsoft.com/office/word/2010/wordprocessingShape">
+                    <wps:wsp>
+                      <wps:cNvSpPr txBox="1"/>
+                      <wps:spPr>
+                        <a:xfrm>
+                          <a:off x="0" y="0"/>
+                          <a:ext cx="914400" cy="320400"/>
+                        </a:xfrm>
+                        <a:prstGeom prst="rect">
+                          <a:avLst/>
+                        </a:prstGeom>
+                        <a:noFill/>
+                        <a:ln w="6350">
+                          <a:noFill/>
+                        </a:ln>
+                      </wps:spPr>
+                      <wps:txbx>
+                        <w:txbxContent>
+                          <w:p>
+                            <w:proofErr w:type="spellStart"/>
+                            <w:proofErr w:type="gramStart"/>
+                            <w:r>
+                              <w:t>a,c</w:t>
+                            </w:r>
+                            <w:proofErr w:type="spellEnd"/>
+                            <w:proofErr w:type="gramEnd"/>
+                          </w:p>
+                        </w:txbxContent>
+                      </wps:txbx>
+                      <wps:bodyPr rot="0" spcFirstLastPara="0" vertOverflow="overflow" horzOverflow="overflow" vert="horz" wrap="none" lIns="91440" tIns="45720" rIns="91440" bIns="45720" numCol="1" spcCol="0" rtlCol="0" fromWordArt="0" anchor="t" anchorCtr="0" forceAA="0" compatLnSpc="1">
+                        <a:prstTxWarp prst="textNoShape">
+                          <a:avLst/>
+                        </a:prstTxWarp>
+                        <a:noAutofit/>
+                      </wps:bodyPr>
+                    </wps:wsp>
+                  </a:graphicData>
+                </a:graphic>
+                <wp14:sizeRelH relativeFrom="margin">
+                  <wp14:pctWidth>0</wp14:pctWidth>
+                </wp14:sizeRelH>
+                <wp14:sizeRelV relativeFrom="margin">
+                  <wp14:pctHeight>0</wp14:pctHeight>
+                </wp14:sizeRelV>
+              </wp:anchor>
+            </w:drawing>
+          </mc:Choice>
+          <mc:Fallback>
+            <w:pict>
+              <v:shape w14:anchorId="573ECC65" id="_x0000_s1072" type="#_x0000_t202" style="position:absolute;left:0;text-align:left;margin-left:306.8pt;margin-top:63.75pt;width:1in;height:25.25pt;z-index:251712512;visibility:visible;mso-wrap-style:none;mso-width-percent:0;mso-height-percent:0;mso-wrap-distance-left:9pt;mso-wrap-distance-top:0;mso-wrap-distance-right:9pt;mso-wrap-distance-bottom:0;mso-position-horizontal:absolute;mso-position-horizontal-relative:text;mso-position-vertical:absolute;mso-position-vertical-relative:text;mso-width-percent:0;mso-height-percent:0;mso-width-relative:margin;mso-height-relative:margin;v-text-anchor:top" o:gfxdata="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" filled="f" stroked="f" strokeweight=".5pt">
+                <v:textbox>
+                  <w:txbxContent>
+                    <w:p>
+                      <w:proofErr w:type="spellStart"/>
+                      <w:proofErr w:type="gramStart"/>
+                      <w:r>
+                        <w:t>a,c</w:t>
+                      </w:r>
+                      <w:proofErr w:type="spellEnd"/>
+                      <w:proofErr w:type="gramEnd"/>
+                    </w:p>
+                  </w:txbxContent>
+                </v:textbox>
+              </v:shape>
+            </w:pict>
+          </mc:Fallback>
+        </mc:AlternateContent>
+      </w:r>
+      <w:r>
+        <w:rPr>
+          <w:rFonts w:ascii="Calibri" w:hAnsi="Calibri" w:cs="Calibri"/>
+          <w:b/>
+          <w:bCs/>
+          <w:noProof/>
+          <w:color w:val="000000"/>
+          <w:sz w:val="22"/>
+          <w:szCs w:val="22"/>
+          <w:lang w:val="en-GB"/>
+        </w:rPr>
+        <mc:AlternateContent>
+          <mc:Choice Requires="wps">
+            <w:drawing>
+              <wp:anchor distT="0" distB="0" distL="114300" distR="114300" simplePos="0" relativeHeight="251708416" behindDoc="0" locked="0" layoutInCell="1" allowOverlap="1" wp14:anchorId="763700FD" wp14:editId="688185F9">
+                <wp:simplePos x="0" y="0"/>
+                <wp:positionH relativeFrom="column">
+                  <wp:posOffset>3895837</wp:posOffset>
+                </wp:positionH>
+                <wp:positionV relativeFrom="paragraph">
+                  <wp:posOffset>56515</wp:posOffset>
+                </wp:positionV>
+                <wp:extent cx="412376" cy="320040"/>
+                <wp:effectExtent l="0" t="0" r="0" b="0"/>
+                <wp:wrapNone/>
+                <wp:docPr id="1902174019" name="Zone de texte 22"/>
+                <wp:cNvGraphicFramePr/>
+                <a:graphic xmlns:a="http://schemas.openxmlformats.org/drawingml/2006/main">
+                  <a:graphicData uri="http://schemas.microsoft.com/office/word/2010/wordprocessingShape">
+                    <wps:wsp>
+                      <wps:cNvSpPr txBox="1"/>
+                      <wps:spPr>
+                        <a:xfrm>
+                          <a:off x="0" y="0"/>
+                          <a:ext cx="412376" cy="320040"/>
+                        </a:xfrm>
+                        <a:prstGeom prst="rect">
+                          <a:avLst/>
+                        </a:prstGeom>
+                        <a:noFill/>
+                        <a:ln w="6350">
+                          <a:noFill/>
+                        </a:ln>
+                      </wps:spPr>
+                      <wps:txbx>
+                        <w:txbxContent>
+                          <w:p>
+                            <w:proofErr w:type="spellStart"/>
+                            <w:proofErr w:type="gramStart"/>
+                            <w:r>
+                              <w:t>a,c</w:t>
+                            </w:r>
+                            <w:proofErr w:type="spellEnd"/>
+                            <w:proofErr w:type="gramEnd"/>
+                          </w:p>
+                        </w:txbxContent>
+                      </wps:txbx>
+                      <wps:bodyPr rot="0" spcFirstLastPara="0" vertOverflow="overflow" horzOverflow="overflow" vert="horz" wrap="square" lIns="91440" tIns="45720" rIns="91440" bIns="45720" numCol="1" spcCol="0" rtlCol="0" fromWordArt="0" anchor="t" anchorCtr="0" forceAA="0" compatLnSpc="1">
+                        <a:prstTxWarp prst="textNoShape">
+                          <a:avLst/>
+                        </a:prstTxWarp>
+                        <a:noAutofit/>
+                      </wps:bodyPr>
+                    </wps:wsp>
+                  </a:graphicData>
+                </a:graphic>
+                <wp14:sizeRelH relativeFrom="margin">
+                  <wp14:pctWidth>0</wp14:pctWidth>
+                </wp14:sizeRelH>
+                <wp14:sizeRelV relativeFrom="margin">
+                  <wp14:pctHeight>0</wp14:pctHeight>
+                </wp14:sizeRelV>
+              </wp:anchor>
+            </w:drawing>
+          </mc:Choice>
+          <mc:Fallback>
+            <w:pict>
+              <v:shape w14:anchorId="763700FD" id="_x0000_s1073" type="#_x0000_t202" style="position:absolute;left:0;text-align:left;margin-left:306.75pt;margin-top:4.45pt;width:32.45pt;height:25.2pt;z-index:251708416;visibility:visible;mso-wrap-style:square;mso-width-percent:0;mso-height-percent:0;mso-wrap-distance-left:9pt;mso-wrap-distance-top:0;mso-wrap-distance-right:9pt;mso-wrap-distance-bottom:0;mso-position-horizontal:absolute;mso-position-horizontal-relative:text;mso-position-vertical:absolute;mso-position-vertical-relative:text;mso-width-percent:0;mso-height-percent:0;mso-width-relative:margin;mso-height-relative:margin;v-text-anchor:top" o:gfxdata="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" filled="f" stroked="f" strokeweight=".5pt">
+                <v:textbox>
+                  <w:txbxContent>
+                    <w:p>
+                      <w:proofErr w:type="spellStart"/>
+                      <w:proofErr w:type="gramStart"/>
+                      <w:r>
+                        <w:t>a,c</w:t>
+                      </w:r>
+                      <w:proofErr w:type="spellEnd"/>
+                      <w:proofErr w:type="gramEnd"/>
+                    </w:p>
+                  </w:txbxContent>
+                </v:textbox>
+              </v:shape>
+            </w:pict>
+          </mc:Fallback>
+        </mc:AlternateContent>
+      </w:r>
+      <w:r>
+        <w:rPr>
+          <w:rFonts w:ascii="Calibri" w:hAnsi="Calibri" w:cs="Calibri"/>
+          <w:b/>
+          <w:bCs/>
+          <w:noProof/>
+          <w:color w:val="000000"/>
+          <w:sz w:val="22"/>
+          <w:szCs w:val="22"/>
+          <w:lang w:val="en-GB"/>
+        </w:rPr>
+        <mc:AlternateContent>
+          <mc:Choice Requires="wps">
+            <w:drawing>
+              <wp:anchor distT="0" distB="0" distL="114300" distR="114300" simplePos="0" relativeHeight="251710464" behindDoc="0" locked="0" layoutInCell="1" allowOverlap="1" wp14:anchorId="66FBAC22" wp14:editId="45FA951D">
+                <wp:simplePos x="0" y="0"/>
+                <wp:positionH relativeFrom="column">
+                  <wp:posOffset>3277235</wp:posOffset>
+                </wp:positionH>
+                <wp:positionV relativeFrom="paragraph">
+                  <wp:posOffset>55880</wp:posOffset>
+                </wp:positionV>
+                <wp:extent cx="914400" cy="320400"/>
+                <wp:effectExtent l="0" t="0" r="0" b="0"/>
+                <wp:wrapNone/>
+                <wp:docPr id="1274021749" name="Zone de texte 22"/>
+                <wp:cNvGraphicFramePr/>
+                <a:graphic xmlns:a="http://schemas.openxmlformats.org/drawingml/2006/main">
+                  <a:graphicData uri="http://schemas.microsoft.com/office/word/2010/wordprocessingShape">
+                    <wps:wsp>
+                      <wps:cNvSpPr txBox="1"/>
+                      <wps:spPr>
+                        <a:xfrm>
+                          <a:off x="0" y="0"/>
+                          <a:ext cx="914400" cy="320400"/>
+                        </a:xfrm>
+                        <a:prstGeom prst="rect">
+                          <a:avLst/>
+                        </a:prstGeom>
+                        <a:noFill/>
+                        <a:ln w="6350">
+                          <a:noFill/>
+                        </a:ln>
+                      </wps:spPr>
+                      <wps:txbx>
+                        <w:txbxContent>
+                          <w:p>
+                            <w:proofErr w:type="gramStart"/>
+                            <w:r>
+                              <w:t>b</w:t>
+                            </w:r>
+                            <w:proofErr w:type="gramEnd"/>
+                          </w:p>
+                        </w:txbxContent>
+                      </wps:txbx>
+                      <wps:bodyPr rot="0" spcFirstLastPara="0" vertOverflow="overflow" horzOverflow="overflow" vert="horz" wrap="none" lIns="91440" tIns="45720" rIns="91440" bIns="45720" numCol="1" spcCol="0" rtlCol="0" fromWordArt="0" anchor="t" anchorCtr="0" forceAA="0" compatLnSpc="1">
+                        <a:prstTxWarp prst="textNoShape">
+                          <a:avLst/>
+                        </a:prstTxWarp>
+                        <a:noAutofit/>
+                      </wps:bodyPr>
+                    </wps:wsp>
+                  </a:graphicData>
+                </a:graphic>
+                <wp14:sizeRelH relativeFrom="margin">
+                  <wp14:pctWidth>0</wp14:pctWidth>
+                </wp14:sizeRelH>
+                <wp14:sizeRelV relativeFrom="margin">
+                  <wp14:pctHeight>0</wp14:pctHeight>
+                </wp14:sizeRelV>
+              </wp:anchor>
+            </w:drawing>
+          </mc:Choice>
+          <mc:Fallback>
+            <w:pict>
+              <v:shape w14:anchorId="66FBAC22" id="_x0000_s1074" type="#_x0000_t202" style="position:absolute;left:0;text-align:left;margin-left:258.05pt;margin-top:4.4pt;width:1in;height:25.25pt;z-index:251710464;visibility:visible;mso-wrap-style:none;mso-width-percent:0;mso-height-percent:0;mso-wrap-distance-left:9pt;mso-wrap-distance-top:0;mso-wrap-distance-right:9pt;mso-wrap-distance-bottom:0;mso-position-horizontal:absolute;mso-position-horizontal-relative:text;mso-position-vertical:absolute;mso-position-vertical-relative:text;mso-width-percent:0;mso-height-percent:0;mso-width-relative:margin;mso-height-relative:margin;v-text-anchor:top" o:gfxdata="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" filled="f" stroked="f" strokeweight=".5pt">
+                <v:textbox>
+                  <w:txbxContent>
+                    <w:p>
+                      <w:proofErr w:type="gramStart"/>
+                      <w:r>
+                        <w:t>b</w:t>
+                      </w:r>
+                      <w:proofErr w:type="gramEnd"/>
+                    </w:p>
+                  </w:txbxContent>
+                </v:textbox>
+              </v:shape>
+            </w:pict>
+          </mc:Fallback>
+        </mc:AlternateContent>
+      </w:r>
+      <w:r>
+        <w:rPr>
+          <w:rFonts w:ascii="Calibri" w:hAnsi="Calibri" w:cs="Calibri"/>
+          <w:b/>
+          <w:bCs/>
+          <w:noProof/>
+          <w:color w:val="000000"/>
+          <w:sz w:val="22"/>
+          <w:szCs w:val="22"/>
+          <w:lang w:val="en-GB"/>
+        </w:rPr>
+        <mc:AlternateContent>
+          <mc:Choice Requires="wps">
+            <w:drawing>
+              <wp:anchor distT="0" distB="0" distL="114300" distR="114300" simplePos="0" relativeHeight="251706368" behindDoc="0" locked="0" layoutInCell="1" allowOverlap="1" wp14:anchorId="2C090F13" wp14:editId="7FCD821A">
+                <wp:simplePos x="0" y="0"/>
+                <wp:positionH relativeFrom="column">
+                  <wp:posOffset>3277609</wp:posOffset>
+                </wp:positionH>
+                <wp:positionV relativeFrom="paragraph">
+                  <wp:posOffset>307602</wp:posOffset>
+                </wp:positionV>
+                <wp:extent cx="914400" cy="320400"/>
+                <wp:effectExtent l="0" t="0" r="0" b="0"/>
+                <wp:wrapNone/>
+                <wp:docPr id="1834332555" name="Zone de texte 22"/>
+                <wp:cNvGraphicFramePr/>
+                <a:graphic xmlns:a="http://schemas.openxmlformats.org/drawingml/2006/main">
+                  <a:graphicData uri="http://schemas.microsoft.com/office/word/2010/wordprocessingShape">
+                    <wps:wsp>
+                      <wps:cNvSpPr txBox="1"/>
+                      <wps:spPr>
+                        <a:xfrm>
+                          <a:off x="0" y="0"/>
+                          <a:ext cx="914400" cy="320400"/>
+                        </a:xfrm>
+                        <a:prstGeom prst="rect">
+                          <a:avLst/>
+                        </a:prstGeom>
+                        <a:noFill/>
+                        <a:ln w="6350">
+                          <a:noFill/>
+                        </a:ln>
+                      </wps:spPr>
+                      <wps:txbx>
+                        <w:txbxContent>
+                          <w:p>
+                            <w:proofErr w:type="gramStart"/>
+                            <w:r>
+                              <w:t>b</w:t>
+                            </w:r>
+                            <w:proofErr w:type="gramEnd"/>
+                          </w:p>
+                        </w:txbxContent>
+                      </wps:txbx>
+                      <wps:bodyPr rot="0" spcFirstLastPara="0" vertOverflow="overflow" horzOverflow="overflow" vert="horz" wrap="none" lIns="91440" tIns="45720" rIns="91440" bIns="45720" numCol="1" spcCol="0" rtlCol="0" fromWordArt="0" anchor="t" anchorCtr="0" forceAA="0" compatLnSpc="1">
+                        <a:prstTxWarp prst="textNoShape">
+                          <a:avLst/>
+                        </a:prstTxWarp>
+                        <a:noAutofit/>
+                      </wps:bodyPr>
+                    </wps:wsp>
+                  </a:graphicData>
+                </a:graphic>
+                <wp14:sizeRelH relativeFrom="margin">
+                  <wp14:pctWidth>0</wp14:pctWidth>
+                </wp14:sizeRelH>
+                <wp14:sizeRelV relativeFrom="margin">
+                  <wp14:pctHeight>0</wp14:pctHeight>
+                </wp14:sizeRelV>
+              </wp:anchor>
+            </w:drawing>
+          </mc:Choice>
+          <mc:Fallback>
+            <w:pict>
+              <v:shape w14:anchorId="2C090F13" id="_x0000_s1075" type="#_x0000_t202" style="position:absolute;left:0;text-align:left;margin-left:258.1pt;margin-top:24.2pt;width:1in;height:25.25pt;z-index:251706368;visibility:visible;mso-wrap-style:none;mso-width-percent:0;mso-height-percent:0;mso-wrap-distance-left:9pt;mso-wrap-distance-top:0;mso-wrap-distance-right:9pt;mso-wrap-distance-bottom:0;mso-position-horizontal:absolute;mso-position-horizontal-relative:text;mso-position-vertical:absolute;mso-position-vertical-relative:text;mso-width-percent:0;mso-height-percent:0;mso-width-relative:margin;mso-height-relative:margin;v-text-anchor:top" o:gfxdata="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" filled="f" stroked="f" strokeweight=".5pt">
+                <v:textbox>
+                  <w:txbxContent>
+                    <w:p>
+                      <w:proofErr w:type="gramStart"/>
+                      <w:r>
+                        <w:t>b</w:t>
+                      </w:r>
+                      <w:proofErr w:type="gramEnd"/>
+                    </w:p>
+                  </w:txbxContent>
+                </v:textbox>
+              </v:shape>
+            </w:pict>
+          </mc:Fallback>
+        </mc:AlternateContent>
+      </w:r>
+      <w:r>
+        <w:rPr>
+          <w:rFonts w:ascii="Calibri" w:hAnsi="Calibri" w:cs="Calibri"/>
+          <w:b/>
+          <w:bCs/>
+          <w:noProof/>
+          <w:color w:val="000000"/>
+          <w:sz w:val="22"/>
+          <w:szCs w:val="22"/>
+          <w:lang w:val="en-GB"/>
+        </w:rPr>
+        <mc:AlternateContent>
+          <mc:Choice Requires="wps">
+            <w:drawing>
+              <wp:anchor distT="0" distB="0" distL="114300" distR="114300" simplePos="0" relativeHeight="251704320" behindDoc="0" locked="0" layoutInCell="1" allowOverlap="1" wp14:anchorId="08F16FE1" wp14:editId="737594D7">
+                <wp:simplePos x="0" y="0"/>
+                <wp:positionH relativeFrom="column">
+                  <wp:posOffset>3895800</wp:posOffset>
+                </wp:positionH>
+                <wp:positionV relativeFrom="paragraph">
+                  <wp:posOffset>2059305</wp:posOffset>
+                </wp:positionV>
+                <wp:extent cx="914400" cy="320400"/>
+                <wp:effectExtent l="0" t="12700" r="0" b="5715"/>
+                <wp:wrapNone/>
+                <wp:docPr id="443618335" name="Zone de texte 22"/>
+                <wp:cNvGraphicFramePr/>
+                <a:graphic xmlns:a="http://schemas.openxmlformats.org/drawingml/2006/main">
+                  <a:graphicData uri="http://schemas.microsoft.com/office/word/2010/wordprocessingShape">
+                    <wps:wsp>
+                      <wps:cNvSpPr txBox="1"/>
+                      <wps:spPr>
+                        <a:xfrm>
+                          <a:off x="0" y="0"/>
+                          <a:ext cx="914400" cy="320400"/>
+                        </a:xfrm>
+                        <a:prstGeom prst="rect">
+                          <a:avLst/>
+                        </a:prstGeom>
+                        <a:noFill/>
+                        <a:ln w="6350">
+                          <a:noFill/>
+                        </a:ln>
+                      </wps:spPr>
+                      <wps:txbx>
+                        <w:txbxContent>
+                          <w:p>
+                            <w:proofErr w:type="spellStart"/>
+                            <w:proofErr w:type="gramStart"/>
+                            <w:r>
+                              <w:t>a,b</w:t>
+                            </w:r>
+                            <w:proofErr w:type="spellEnd"/>
+                            <w:proofErr w:type="gramEnd"/>
+                          </w:p>
+                        </w:txbxContent>
+                      </wps:txbx>
+                      <wps:bodyPr rot="0" spcFirstLastPara="0" vertOverflow="overflow" horzOverflow="overflow" vert="horz" wrap="none" lIns="91440" tIns="45720" rIns="91440" bIns="45720" numCol="1" spcCol="0" rtlCol="0" fromWordArt="0" anchor="t" anchorCtr="0" forceAA="0" compatLnSpc="1">
+                        <a:prstTxWarp prst="textNoShape">
+                          <a:avLst/>
+                        </a:prstTxWarp>
+                        <a:noAutofit/>
+                      </wps:bodyPr>
+                    </wps:wsp>
+                  </a:graphicData>
+                </a:graphic>
+                <wp14:sizeRelH relativeFrom="margin">
+                  <wp14:pctWidth>0</wp14:pctWidth>
+                </wp14:sizeRelH>
+                <wp14:sizeRelV relativeFrom="margin">
+                  <wp14:pctHeight>0</wp14:pctHeight>
+                </wp14:sizeRelV>
+              </wp:anchor>
+            </w:drawing>
+          </mc:Choice>
+          <mc:Fallback>
+            <w:pict>
+              <v:shape w14:anchorId="08F16FE1" id="_x0000_s1076" type="#_x0000_t202" style="position:absolute;left:0;text-align:left;margin-left:306.75pt;margin-top:162.15pt;width:1in;height:25.25pt;z-index:251704320;visibility:visible;mso-wrap-style:none;mso-width-percent:0;mso-height-percent:0;mso-wrap-distance-left:9pt;mso-wrap-distance-top:0;mso-wrap-distance-right:9pt;mso-wrap-distance-bottom:0;mso-position-horizontal:absolute;mso-position-horizontal-relative:text;mso-position-vertical:absolute;mso-position-vertical-relative:text;mso-width-percent:0;mso-height-percent:0;mso-width-relative:margin;mso-height-relative:margin;v-text-anchor:top" o:gfxdata="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" filled="f" stroked="f" strokeweight=".5pt">
+                <v:textbox>
+                  <w:txbxContent>
+                    <w:p>
+                      <w:proofErr w:type="spellStart"/>
+                      <w:proofErr w:type="gramStart"/>
+                      <w:r>
+                        <w:t>a,b</w:t>
+                      </w:r>
+                      <w:proofErr w:type="spellEnd"/>
+                      <w:proofErr w:type="gramEnd"/>
+                    </w:p>
+                  </w:txbxContent>
+                </v:textbox>
+              </v:shape>
+            </w:pict>
+          </mc:Fallback>
+        </mc:AlternateContent>
+      </w:r>
+      <w:r>
+        <w:rPr>
+          <w:rFonts w:ascii="Calibri" w:hAnsi="Calibri" w:cs="Calibri"/>
+          <w:b/>
+          <w:bCs/>
+          <w:noProof/>
+          <w:color w:val="000000"/>
+          <w:sz w:val="22"/>
+          <w:szCs w:val="22"/>
+          <w:lang w:val="en-GB"/>
+        </w:rPr>
+        <mc:AlternateContent>
+          <mc:Choice Requires="wps">
+            <w:drawing>
+              <wp:anchor distT="0" distB="0" distL="114300" distR="114300" simplePos="0" relativeHeight="251702272" behindDoc="0" locked="0" layoutInCell="1" allowOverlap="1" wp14:anchorId="00469391" wp14:editId="110079CF">
+                <wp:simplePos x="0" y="0"/>
+                <wp:positionH relativeFrom="column">
+                  <wp:posOffset>3277609</wp:posOffset>
+                </wp:positionH>
+                <wp:positionV relativeFrom="paragraph">
+                  <wp:posOffset>2055869</wp:posOffset>
+                </wp:positionV>
+                <wp:extent cx="914400" cy="320400"/>
+                <wp:effectExtent l="0" t="12700" r="0" b="5715"/>
+                <wp:wrapNone/>
+                <wp:docPr id="591726247" name="Zone de texte 22"/>
+                <wp:cNvGraphicFramePr/>
+                <a:graphic xmlns:a="http://schemas.openxmlformats.org/drawingml/2006/main">
+                  <a:graphicData uri="http://schemas.microsoft.com/office/word/2010/wordprocessingShape">
+                    <wps:wsp>
+                      <wps:cNvSpPr txBox="1"/>
+                      <wps:spPr>
+                        <a:xfrm>
+                          <a:off x="0" y="0"/>
+                          <a:ext cx="914400" cy="320400"/>
+                        </a:xfrm>
+                        <a:prstGeom prst="rect">
+                          <a:avLst/>
+                        </a:prstGeom>
+                        <a:noFill/>
+                        <a:ln w="6350">
+                          <a:noFill/>
+                        </a:ln>
+                      </wps:spPr>
+                      <wps:txbx>
+                        <w:txbxContent>
+                          <w:p>
+                            <w:proofErr w:type="gramStart"/>
+                            <w:r>
+                              <w:t>a</w:t>
+                            </w:r>
+                            <w:proofErr w:type="gramEnd"/>
+                          </w:p>
+                        </w:txbxContent>
+                      </wps:txbx>
+                      <wps:bodyPr rot="0" spcFirstLastPara="0" vertOverflow="overflow" horzOverflow="overflow" vert="horz" wrap="none" lIns="91440" tIns="45720" rIns="91440" bIns="45720" numCol="1" spcCol="0" rtlCol="0" fromWordArt="0" anchor="t" anchorCtr="0" forceAA="0" compatLnSpc="1">
+                        <a:prstTxWarp prst="textNoShape">
+                          <a:avLst/>
+                        </a:prstTxWarp>
+                        <a:noAutofit/>
+                      </wps:bodyPr>
+                    </wps:wsp>
+                  </a:graphicData>
+                </a:graphic>
+                <wp14:sizeRelH relativeFrom="margin">
+                  <wp14:pctWidth>0</wp14:pctWidth>
+                </wp14:sizeRelH>
+                <wp14:sizeRelV relativeFrom="margin">
+                  <wp14:pctHeight>0</wp14:pctHeight>
+                </wp14:sizeRelV>
+              </wp:anchor>
+            </w:drawing>
+          </mc:Choice>
+          <mc:Fallback>
+            <w:pict>
+              <v:shape w14:anchorId="00469391" id="_x0000_s1077" type="#_x0000_t202" style="position:absolute;left:0;text-align:left;margin-left:258.1pt;margin-top:161.9pt;width:1in;height:25.25pt;z-index:251702272;visibility:visible;mso-wrap-style:none;mso-width-percent:0;mso-height-percent:0;mso-wrap-distance-left:9pt;mso-wrap-distance-top:0;mso-wrap-distance-right:9pt;mso-wrap-distance-bottom:0;mso-position-horizontal:absolute;mso-position-horizontal-relative:text;mso-position-vertical:absolute;mso-position-vertical-relative:text;mso-width-percent:0;mso-height-percent:0;mso-width-relative:margin;mso-height-relative:margin;v-text-anchor:top" o:gfxdata="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" filled="f" stroked="f" strokeweight=".5pt">
+                <v:textbox>
+                  <w:txbxContent>
+                    <w:p>
+                      <w:proofErr w:type="gramStart"/>
+                      <w:r>
+                        <w:t>a</w:t>
+                      </w:r>
+                      <w:proofErr w:type="gramEnd"/>
+                    </w:p>
+                  </w:txbxContent>
+                </v:textbox>
+              </v:shape>
+            </w:pict>
+          </mc:Fallback>
+        </mc:AlternateContent>
+      </w:r>
+      <w:r>
+        <w:rPr>
+          <w:rFonts w:ascii="Calibri" w:hAnsi="Calibri" w:cs="Calibri"/>
+          <w:b/>
+          <w:bCs/>
+          <w:noProof/>
+          <w:color w:val="000000"/>
+          <w:sz w:val="22"/>
+          <w:szCs w:val="22"/>
+          <w:lang w:val="en-GB"/>
+        </w:rPr>
+        <mc:AlternateContent>
+          <mc:Choice Requires="wps">
+            <w:drawing>
+              <wp:anchor distT="0" distB="0" distL="114300" distR="114300" simplePos="0" relativeHeight="251700224" behindDoc="0" locked="0" layoutInCell="1" allowOverlap="1" wp14:anchorId="01812382" wp14:editId="03A61F06">
+                <wp:simplePos x="0" y="0"/>
+                <wp:positionH relativeFrom="column">
+                  <wp:posOffset>3958552</wp:posOffset>
+                </wp:positionH>
+                <wp:positionV relativeFrom="paragraph">
+                  <wp:posOffset>1042670</wp:posOffset>
+                </wp:positionV>
+                <wp:extent cx="914400" cy="320400"/>
+                <wp:effectExtent l="0" t="0" r="0" b="0"/>
+                <wp:wrapNone/>
+                <wp:docPr id="1223610848" name="Zone de texte 22"/>
+                <wp:cNvGraphicFramePr/>
+                <a:graphic xmlns:a="http://schemas.openxmlformats.org/drawingml/2006/main">
+                  <a:graphicData uri="http://schemas.microsoft.com/office/word/2010/wordprocessingShape">
+                    <wps:wsp>
+                      <wps:cNvSpPr txBox="1"/>
+                      <wps:spPr>
+                        <a:xfrm>
+                          <a:off x="0" y="0"/>
+                          <a:ext cx="914400" cy="320400"/>
+                        </a:xfrm>
+                        <a:prstGeom prst="rect">
+                          <a:avLst/>
+                        </a:prstGeom>
+                        <a:noFill/>
+                        <a:ln w="6350">
+                          <a:noFill/>
+                        </a:ln>
+                      </wps:spPr>
+                      <wps:txbx>
+                        <w:txbxContent>
+                          <w:p>
+                            <w:proofErr w:type="gramStart"/>
+                            <w:r>
+                              <w:t>a</w:t>
+                            </w:r>
+                            <w:proofErr w:type="gramEnd"/>
+                          </w:p>
+                        </w:txbxContent>
+                      </wps:txbx>
+                      <wps:bodyPr rot="0" spcFirstLastPara="0" vertOverflow="overflow" horzOverflow="overflow" vert="horz" wrap="none" lIns="91440" tIns="45720" rIns="91440" bIns="45720" numCol="1" spcCol="0" rtlCol="0" fromWordArt="0" anchor="t" anchorCtr="0" forceAA="0" compatLnSpc="1">
+                        <a:prstTxWarp prst="textNoShape">
+                          <a:avLst/>
+                        </a:prstTxWarp>
+                        <a:noAutofit/>
+                      </wps:bodyPr>
+                    </wps:wsp>
+                  </a:graphicData>
+                </a:graphic>
+                <wp14:sizeRelH relativeFrom="margin">
+                  <wp14:pctWidth>0</wp14:pctWidth>
+                </wp14:sizeRelH>
+                <wp14:sizeRelV relativeFrom="margin">
+                  <wp14:pctHeight>0</wp14:pctHeight>
+                </wp14:sizeRelV>
+              </wp:anchor>
+            </w:drawing>
+          </mc:Choice>
+          <mc:Fallback>
+            <w:pict>
+              <v:shape w14:anchorId="01812382" id="_x0000_s1078" type="#_x0000_t202" style="position:absolute;left:0;text-align:left;margin-left:311.7pt;margin-top:82.1pt;width:1in;height:25.25pt;z-index:251700224;visibility:visible;mso-wrap-style:none;mso-width-percent:0;mso-height-percent:0;mso-wrap-distance-left:9pt;mso-wrap-distance-top:0;mso-wrap-distance-right:9pt;mso-wrap-distance-bottom:0;mso-position-horizontal:absolute;mso-position-horizontal-relative:text;mso-position-vertical:absolute;mso-position-vertical-relative:text;mso-width-percent:0;mso-height-percent:0;mso-width-relative:margin;mso-height-relative:margin;v-text-anchor:top" o:gfxdata="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" filled="f" stroked="f" strokeweight=".5pt">
+                <v:textbox>
+                  <w:txbxContent>
+                    <w:p>
+                      <w:proofErr w:type="gramStart"/>
+                      <w:r>
+                        <w:t>a</w:t>
+                      </w:r>
+                      <w:proofErr w:type="gramEnd"/>
+                    </w:p>
+                  </w:txbxContent>
+                </v:textbox>
+              </v:shape>
+            </w:pict>
+          </mc:Fallback>
+        </mc:AlternateContent>
+      </w:r>
+      <w:r>
+        <w:rPr>
+          <w:rFonts w:ascii="Calibri" w:hAnsi="Calibri" w:cs="Calibri"/>
+          <w:b/>
+          <w:bCs/>
+          <w:noProof/>
+          <w:color w:val="000000"/>
+          <w:sz w:val="22"/>
+          <w:szCs w:val="22"/>
+          <w:lang w:val="en-GB"/>
+        </w:rPr>
+        <mc:AlternateContent>
+          <mc:Choice Requires="wps">
+            <w:drawing>
+              <wp:anchor distT="0" distB="0" distL="114300" distR="114300" simplePos="0" relativeHeight="251698176" behindDoc="0" locked="0" layoutInCell="1" allowOverlap="1" wp14:anchorId="144C8FF6" wp14:editId="562B2815">
+                <wp:simplePos x="0" y="0"/>
+                <wp:positionH relativeFrom="column">
+                  <wp:posOffset>3277608</wp:posOffset>
+                </wp:positionH>
+                <wp:positionV relativeFrom="paragraph">
+                  <wp:posOffset>1042670</wp:posOffset>
+                </wp:positionV>
+                <wp:extent cx="914400" cy="320400"/>
+                <wp:effectExtent l="0" t="0" r="0" b="0"/>
+                <wp:wrapNone/>
+                <wp:docPr id="2124484142" name="Zone de texte 22"/>
+                <wp:cNvGraphicFramePr/>
+                <a:graphic xmlns:a="http://schemas.openxmlformats.org/drawingml/2006/main">
+                  <a:graphicData uri="http://schemas.microsoft.com/office/word/2010/wordprocessingShape">
+                    <wps:wsp>
+                      <wps:cNvSpPr txBox="1"/>
+                      <wps:spPr>
+                        <a:xfrm>
+                          <a:off x="0" y="0"/>
+                          <a:ext cx="914400" cy="320400"/>
+                        </a:xfrm>
+                        <a:prstGeom prst="rect">
+                          <a:avLst/>
+                        </a:prstGeom>
+                        <a:noFill/>
+                        <a:ln w="6350">
+                          <a:noFill/>
+                        </a:ln>
+                      </wps:spPr>
+                      <wps:txbx>
+                        <w:txbxContent>
+                          <w:p>
+                            <w:proofErr w:type="gramStart"/>
+                            <w:r>
+                              <w:t>a</w:t>
+                            </w:r>
+                            <w:proofErr w:type="gramEnd"/>
+                          </w:p>
+                        </w:txbxContent>
+                      </wps:txbx>
+                      <wps:bodyPr rot="0" spcFirstLastPara="0" vertOverflow="overflow" horzOverflow="overflow" vert="horz" wrap="none" lIns="91440" tIns="45720" rIns="91440" bIns="45720" numCol="1" spcCol="0" rtlCol="0" fromWordArt="0" anchor="t" anchorCtr="0" forceAA="0" compatLnSpc="1">
+                        <a:prstTxWarp prst="textNoShape">
+                          <a:avLst/>
+                        </a:prstTxWarp>
+                        <a:noAutofit/>
+                      </wps:bodyPr>
+                    </wps:wsp>
+                  </a:graphicData>
+                </a:graphic>
+                <wp14:sizeRelH relativeFrom="margin">
+                  <wp14:pctWidth>0</wp14:pctWidth>
+                </wp14:sizeRelH>
+                <wp14:sizeRelV relativeFrom="margin">
+                  <wp14:pctHeight>0</wp14:pctHeight>
+                </wp14:sizeRelV>
+              </wp:anchor>
+            </w:drawing>
+          </mc:Choice>
+          <mc:Fallback>
+            <w:pict>
+              <v:shape w14:anchorId="144C8FF6" id="_x0000_s1079" type="#_x0000_t202" style="position:absolute;left:0;text-align:left;margin-left:258.1pt;margin-top:82.1pt;width:1in;height:25.25pt;z-index:251698176;visibility:visible;mso-wrap-style:none;mso-width-percent:0;mso-height-percent:0;mso-wrap-distance-left:9pt;mso-wrap-distance-top:0;mso-wrap-distance-right:9pt;mso-wrap-distance-bottom:0;mso-position-horizontal:absolute;mso-position-horizontal-relative:text;mso-position-vertical:absolute;mso-position-vertical-relative:text;mso-width-percent:0;mso-height-percent:0;mso-width-relative:margin;mso-height-relative:margin;v-text-anchor:top" o:gfxdata="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" filled="f" stroked="f" strokeweight=".5pt">
+                <v:textbox>
+                  <w:txbxContent>
+                    <w:p>
+                      <w:proofErr w:type="gramStart"/>
+                      <w:r>
+                        <w:t>a</w:t>
+                      </w:r>
+                      <w:proofErr w:type="gramEnd"/>
+                    </w:p>
+                  </w:txbxContent>
+                </v:textbox>
+              </v:shape>
+            </w:pict>
+          </mc:Fallback>
+        </mc:AlternateContent>
+      </w:r>
+      <w:r>
+        <w:rPr>
+          <w:rFonts w:ascii="Calibri" w:hAnsi="Calibri" w:cs="Calibri"/>
+          <w:b/>
+          <w:bCs/>
+          <w:noProof/>
+          <w:color w:val="000000"/>
+          <w:sz w:val="22"/>
+          <w:szCs w:val="22"/>
+          <w:lang w:val="en-GB"/>
+        </w:rPr>
+        <mc:AlternateContent>
+          <mc:Choice Requires="wps">
+            <w:drawing>
+              <wp:anchor distT="0" distB="0" distL="114300" distR="114300" simplePos="0" relativeHeight="251696128" behindDoc="0" locked="0" layoutInCell="1" allowOverlap="1" wp14:anchorId="7C0AC905" wp14:editId="7F9FA0C7">
+                <wp:simplePos x="0" y="0"/>
+                <wp:positionH relativeFrom="column">
+                  <wp:posOffset>2623185</wp:posOffset>
+                </wp:positionH>
+                <wp:positionV relativeFrom="paragraph">
+                  <wp:posOffset>1042707</wp:posOffset>
+                </wp:positionV>
+                <wp:extent cx="914400" cy="320400"/>
+                <wp:effectExtent l="0" t="0" r="0" b="0"/>
+                <wp:wrapNone/>
+                <wp:docPr id="633680484" name="Zone de texte 22"/>
+                <wp:cNvGraphicFramePr/>
+                <a:graphic xmlns:a="http://schemas.openxmlformats.org/drawingml/2006/main">
+                  <a:graphicData uri="http://schemas.microsoft.com/office/word/2010/wordprocessingShape">
+                    <wps:wsp>
+                      <wps:cNvSpPr txBox="1"/>
+                      <wps:spPr>
+                        <a:xfrm>
+                          <a:off x="0" y="0"/>
+                          <a:ext cx="914400" cy="320400"/>
+                        </a:xfrm>
+                        <a:prstGeom prst="rect">
+                          <a:avLst/>
+                        </a:prstGeom>
+                        <a:noFill/>
+                        <a:ln w="6350">
+                          <a:noFill/>
+                        </a:ln>
+                      </wps:spPr>
+                      <wps:txbx>
+                        <w:txbxContent>
+                          <w:p>
+                            <w:proofErr w:type="gramStart"/>
+                            <w:r>
+                              <w:t>a</w:t>
+                            </w:r>
+                            <w:proofErr w:type="gramEnd"/>
+                          </w:p>
+                        </w:txbxContent>
+                      </wps:txbx>
+                      <wps:bodyPr rot="0" spcFirstLastPara="0" vertOverflow="overflow" horzOverflow="overflow" vert="horz" wrap="none" lIns="91440" tIns="45720" rIns="91440" bIns="45720" numCol="1" spcCol="0" rtlCol="0" fromWordArt="0" anchor="t" anchorCtr="0" forceAA="0" compatLnSpc="1">
+                        <a:prstTxWarp prst="textNoShape">
+                          <a:avLst/>
+                        </a:prstTxWarp>
+                        <a:noAutofit/>
+                      </wps:bodyPr>
+                    </wps:wsp>
+                  </a:graphicData>
+                </a:graphic>
+                <wp14:sizeRelH relativeFrom="margin">
+                  <wp14:pctWidth>0</wp14:pctWidth>
+                </wp14:sizeRelH>
+                <wp14:sizeRelV relativeFrom="margin">
+                  <wp14:pctHeight>0</wp14:pctHeight>
+                </wp14:sizeRelV>
+              </wp:anchor>
+            </w:drawing>
+          </mc:Choice>
+          <mc:Fallback>
+            <w:pict>
+              <v:shape w14:anchorId="7C0AC905" id="_x0000_s1080" type="#_x0000_t202" style="position:absolute;left:0;text-align:left;margin-left:206.55pt;margin-top:82.1pt;width:1in;height:25.25pt;z-index:251696128;visibility:visible;mso-wrap-style:none;mso-width-percent:0;mso-height-percent:0;mso-wrap-distance-left:9pt;mso-wrap-distance-top:0;mso-wrap-distance-right:9pt;mso-wrap-distance-bottom:0;mso-position-horizontal:absolute;mso-position-horizontal-relative:text;mso-position-vertical:absolute;mso-position-vertical-relative:text;mso-width-percent:0;mso-height-percent:0;mso-width-relative:margin;mso-height-relative:margin;v-text-anchor:top" o:gfxdata="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" filled="f" stroked="f" strokeweight=".5pt">
+                <v:textbox>
+                  <w:txbxContent>
+                    <w:p>
+                      <w:proofErr w:type="gramStart"/>
+                      <w:r>
+                        <w:t>a</w:t>
+                      </w:r>
+                      <w:proofErr w:type="gramEnd"/>
+                    </w:p>
+                  </w:txbxContent>
+                </v:textbox>
+              </v:shape>
+            </w:pict>
+          </mc:Fallback>
+        </mc:AlternateContent>
+      </w:r>
+      <w:r>
+        <w:rPr>
+          <w:rFonts w:ascii="Calibri" w:hAnsi="Calibri" w:cs="Calibri"/>
+          <w:b/>
+          <w:bCs/>
+          <w:noProof/>
+          <w:color w:val="000000"/>
+          <w:sz w:val="22"/>
+          <w:szCs w:val="22"/>
+          <w:lang w:val="en-GB"/>
+        </w:rPr>
+        <mc:AlternateContent>
+          <mc:Choice Requires="wps">
+            <w:drawing>
+              <wp:anchor distT="0" distB="0" distL="114300" distR="114300" simplePos="0" relativeHeight="251694080" behindDoc="0" locked="0" layoutInCell="1" allowOverlap="1" wp14:anchorId="5CDD706F" wp14:editId="1E914581">
+                <wp:simplePos x="0" y="0"/>
+                <wp:positionH relativeFrom="column">
+                  <wp:posOffset>2623185</wp:posOffset>
+                </wp:positionH>
+                <wp:positionV relativeFrom="paragraph">
+                  <wp:posOffset>809289</wp:posOffset>
+                </wp:positionV>
+                <wp:extent cx="914400" cy="320400"/>
+                <wp:effectExtent l="0" t="0" r="0" b="0"/>
+                <wp:wrapNone/>
+                <wp:docPr id="1455733736" name="Zone de texte 22"/>
+                <wp:cNvGraphicFramePr/>
+                <a:graphic xmlns:a="http://schemas.openxmlformats.org/drawingml/2006/main">
+                  <a:graphicData uri="http://schemas.microsoft.com/office/word/2010/wordprocessingShape">
+                    <wps:wsp>
+                      <wps:cNvSpPr txBox="1"/>
+                      <wps:spPr>
+                        <a:xfrm>
+                          <a:off x="0" y="0"/>
+                          <a:ext cx="914400" cy="320400"/>
+                        </a:xfrm>
+                        <a:prstGeom prst="rect">
+                          <a:avLst/>
+                        </a:prstGeom>
+                        <a:noFill/>
+                        <a:ln w="6350">
+                          <a:noFill/>
+                        </a:ln>
+                      </wps:spPr>
+                      <wps:txbx>
+                        <w:txbxContent>
+                          <w:p>
+                            <w:proofErr w:type="gramStart"/>
+                            <w:r>
+                              <w:t>a</w:t>
+                            </w:r>
+                            <w:proofErr w:type="gramEnd"/>
+                          </w:p>
+                        </w:txbxContent>
+                      </wps:txbx>
+                      <wps:bodyPr rot="0" spcFirstLastPara="0" vertOverflow="overflow" horzOverflow="overflow" vert="horz" wrap="none" lIns="91440" tIns="45720" rIns="91440" bIns="45720" numCol="1" spcCol="0" rtlCol="0" fromWordArt="0" anchor="t" anchorCtr="0" forceAA="0" compatLnSpc="1">
+                        <a:prstTxWarp prst="textNoShape">
+                          <a:avLst/>
+                        </a:prstTxWarp>
+                        <a:noAutofit/>
+                      </wps:bodyPr>
+                    </wps:wsp>
+                  </a:graphicData>
+                </a:graphic>
+                <wp14:sizeRelH relativeFrom="margin">
+                  <wp14:pctWidth>0</wp14:pctWidth>
+                </wp14:sizeRelH>
+                <wp14:sizeRelV relativeFrom="margin">
+                  <wp14:pctHeight>0</wp14:pctHeight>
+                </wp14:sizeRelV>
+              </wp:anchor>
+            </w:drawing>
+          </mc:Choice>
+          <mc:Fallback>
+            <w:pict>
+              <v:shape w14:anchorId="5CDD706F" id="_x0000_s1081" type="#_x0000_t202" style="position:absolute;left:0;text-align:left;margin-left:206.55pt;margin-top:63.7pt;width:1in;height:25.25pt;z-index:251694080;visibility:visible;mso-wrap-style:none;mso-width-percent:0;mso-height-percent:0;mso-wrap-distance-left:9pt;mso-wrap-distance-top:0;mso-wrap-distance-right:9pt;mso-wrap-distance-bottom:0;mso-position-horizontal:absolute;mso-position-horizontal-relative:text;mso-position-vertical:absolute;mso-position-vertical-relative:text;mso-width-percent:0;mso-height-percent:0;mso-width-relative:margin;mso-height-relative:margin;v-text-anchor:top" o:gfxdata="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" filled="f" stroked="f" strokeweight=".5pt">
+                <v:textbox>
+                  <w:txbxContent>
+                    <w:p>
+                      <w:proofErr w:type="gramStart"/>
+                      <w:r>
+                        <w:t>a</w:t>
+                      </w:r>
+                      <w:proofErr w:type="gramEnd"/>
+                    </w:p>
+                  </w:txbxContent>
+                </v:textbox>
+              </v:shape>
+            </w:pict>
+          </mc:Fallback>
+        </mc:AlternateContent>
+      </w:r>
+      <w:r>
+        <w:rPr>
+          <w:rFonts w:ascii="Calibri" w:hAnsi="Calibri" w:cs="Calibri"/>
+          <w:b/>
+          <w:bCs/>
+          <w:noProof/>
+          <w:color w:val="000000"/>
+          <w:sz w:val="22"/>
+          <w:szCs w:val="22"/>
+          <w:lang w:val="en-GB"/>
+        </w:rPr>
+        <mc:AlternateContent>
+          <mc:Choice Requires="wps">
+            <w:drawing>
+              <wp:anchor distT="0" distB="0" distL="114300" distR="114300" simplePos="0" relativeHeight="251689984" behindDoc="0" locked="0" layoutInCell="1" allowOverlap="1" wp14:anchorId="3316F3EF" wp14:editId="2EB8706E">
+                <wp:simplePos x="0" y="0"/>
+                <wp:positionH relativeFrom="column">
+                  <wp:posOffset>2623185</wp:posOffset>
+                </wp:positionH>
+                <wp:positionV relativeFrom="paragraph">
+                  <wp:posOffset>3059729</wp:posOffset>
+                </wp:positionV>
+                <wp:extent cx="914400" cy="320400"/>
+                <wp:effectExtent l="0" t="0" r="0" b="0"/>
+                <wp:wrapNone/>
+                <wp:docPr id="893663307" name="Zone de texte 22"/>
+                <wp:cNvGraphicFramePr/>
+                <a:graphic xmlns:a="http://schemas.openxmlformats.org/drawingml/2006/main">
+                  <a:graphicData uri="http://schemas.microsoft.com/office/word/2010/wordprocessingShape">
+                    <wps:wsp>
+                      <wps:cNvSpPr txBox="1"/>
+                      <wps:spPr>
+                        <a:xfrm>
+                          <a:off x="0" y="0"/>
+                          <a:ext cx="914400" cy="320400"/>
+                        </a:xfrm>
+                        <a:prstGeom prst="rect">
+                          <a:avLst/>
+                        </a:prstGeom>
+                        <a:noFill/>
+                        <a:ln w="6350">
+                          <a:noFill/>
+                        </a:ln>
+                      </wps:spPr>
+                      <wps:txbx>
+                        <w:txbxContent>
+                          <w:p>
+                            <w:proofErr w:type="gramStart"/>
+                            <w:r>
+                              <w:t>a</w:t>
+                            </w:r>
+                            <w:proofErr w:type="gramEnd"/>
+                          </w:p>
+                        </w:txbxContent>
+                      </wps:txbx>
+                      <wps:bodyPr rot="0" spcFirstLastPara="0" vertOverflow="overflow" horzOverflow="overflow" vert="horz" wrap="none" lIns="91440" tIns="45720" rIns="91440" bIns="45720" numCol="1" spcCol="0" rtlCol="0" fromWordArt="0" anchor="t" anchorCtr="0" forceAA="0" compatLnSpc="1">
+                        <a:prstTxWarp prst="textNoShape">
+                          <a:avLst/>
+                        </a:prstTxWarp>
+                        <a:noAutofit/>
+                      </wps:bodyPr>
+                    </wps:wsp>
+                  </a:graphicData>
+                </a:graphic>
+                <wp14:sizeRelH relativeFrom="margin">
+                  <wp14:pctWidth>0</wp14:pctWidth>
+                </wp14:sizeRelH>
+                <wp14:sizeRelV relativeFrom="margin">
+                  <wp14:pctHeight>0</wp14:pctHeight>
+                </wp14:sizeRelV>
+              </wp:anchor>
+            </w:drawing>
+          </mc:Choice>
+          <mc:Fallback>
+            <w:pict>
+              <v:shape w14:anchorId="3316F3EF" id="_x0000_s1082" type="#_x0000_t202" style="position:absolute;left:0;text-align:left;margin-left:206.55pt;margin-top:240.9pt;width:1in;height:25.25pt;z-index:251689984;visibility:visible;mso-wrap-style:none;mso-width-percent:0;mso-height-percent:0;mso-wrap-distance-left:9pt;mso-wrap-distance-top:0;mso-wrap-distance-right:9pt;mso-wrap-distance-bottom:0;mso-position-horizontal:absolute;mso-position-horizontal-relative:text;mso-position-vertical:absolute;mso-position-vertical-relative:text;mso-width-percent:0;mso-height-percent:0;mso-width-relative:margin;mso-height-relative:margin;v-text-anchor:top" o:gfxdata="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" filled="f" stroked="f" strokeweight=".5pt">
+                <v:textbox>
+                  <w:txbxContent>
+                    <w:p>
+                      <w:proofErr w:type="gramStart"/>
+                      <w:r>
+                        <w:t>a</w:t>
+                      </w:r>
+                      <w:proofErr w:type="gramEnd"/>
+                    </w:p>
+                  </w:txbxContent>
+                </v:textbox>
+              </v:shape>
+            </w:pict>
+          </mc:Fallback>
+        </mc:AlternateContent>
+      </w:r>
+      <w:r>
+        <w:rPr>
+          <w:rFonts w:ascii="Calibri" w:hAnsi="Calibri" w:cs="Calibri"/>
+          <w:b/>
+          <w:bCs/>
+          <w:noProof/>
+          <w:color w:val="000000"/>
+          <w:sz w:val="22"/>
+          <w:szCs w:val="22"/>
+          <w:lang w:val="en-GB"/>
+        </w:rPr>
+        <mc:AlternateContent>
+          <mc:Choice Requires="wps">
+            <w:drawing>
+              <wp:anchor distT="0" distB="0" distL="114300" distR="114300" simplePos="0" relativeHeight="251687936" behindDoc="0" locked="0" layoutInCell="1" allowOverlap="1" wp14:anchorId="66CBB0BE" wp14:editId="64B494A0">
+                <wp:simplePos x="0" y="0"/>
+                <wp:positionH relativeFrom="column">
+                  <wp:posOffset>2623185</wp:posOffset>
+                </wp:positionH>
+                <wp:positionV relativeFrom="paragraph">
+                  <wp:posOffset>2566632</wp:posOffset>
+                </wp:positionV>
+                <wp:extent cx="914400" cy="320400"/>
+                <wp:effectExtent l="0" t="0" r="0" b="0"/>
+                <wp:wrapNone/>
+                <wp:docPr id="822701239" name="Zone de texte 22"/>
+                <wp:cNvGraphicFramePr/>
+                <a:graphic xmlns:a="http://schemas.openxmlformats.org/drawingml/2006/main">
+                  <a:graphicData uri="http://schemas.microsoft.com/office/word/2010/wordprocessingShape">
+                    <wps:wsp>
+                      <wps:cNvSpPr txBox="1"/>
+                      <wps:spPr>
+                        <a:xfrm>
+                          <a:off x="0" y="0"/>
+                          <a:ext cx="914400" cy="320400"/>
+                        </a:xfrm>
+                        <a:prstGeom prst="rect">
+                          <a:avLst/>
+                        </a:prstGeom>
+                        <a:noFill/>
+                        <a:ln w="6350">
+                          <a:noFill/>
+                        </a:ln>
+                      </wps:spPr>
+                      <wps:txbx>
+                        <w:txbxContent>
+                          <w:p>
+                            <w:proofErr w:type="gramStart"/>
+                            <w:r>
+                              <w:t>a</w:t>
+                            </w:r>
+                            <w:proofErr w:type="gramEnd"/>
+                          </w:p>
+                        </w:txbxContent>
+                      </wps:txbx>
+                      <wps:bodyPr rot="0" spcFirstLastPara="0" vertOverflow="overflow" horzOverflow="overflow" vert="horz" wrap="none" lIns="91440" tIns="45720" rIns="91440" bIns="45720" numCol="1" spcCol="0" rtlCol="0" fromWordArt="0" anchor="t" anchorCtr="0" forceAA="0" compatLnSpc="1">
+                        <a:prstTxWarp prst="textNoShape">
+                          <a:avLst/>
+                        </a:prstTxWarp>
+                        <a:noAutofit/>
+                      </wps:bodyPr>
+                    </wps:wsp>
+                  </a:graphicData>
+                </a:graphic>
+                <wp14:sizeRelH relativeFrom="margin">
+                  <wp14:pctWidth>0</wp14:pctWidth>
+                </wp14:sizeRelH>
+                <wp14:sizeRelV relativeFrom="margin">
+                  <wp14:pctHeight>0</wp14:pctHeight>
+                </wp14:sizeRelV>
+              </wp:anchor>
+            </w:drawing>
+          </mc:Choice>
+          <mc:Fallback>
+            <w:pict>
+              <v:shape w14:anchorId="66CBB0BE" id="_x0000_s1083" type="#_x0000_t202" style="position:absolute;left:0;text-align:left;margin-left:206.55pt;margin-top:202.1pt;width:1in;height:25.25pt;z-index:251687936;visibility:visible;mso-wrap-style:none;mso-width-percent:0;mso-height-percent:0;mso-wrap-distance-left:9pt;mso-wrap-distance-top:0;mso-wrap-distance-right:9pt;mso-wrap-distance-bottom:0;mso-position-horizontal:absolute;mso-position-horizontal-relative:text;mso-position-vertical:absolute;mso-position-vertical-relative:text;mso-width-percent:0;mso-height-percent:0;mso-width-relative:margin;mso-height-relative:margin;v-text-anchor:top" o:gfxdata="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" filled="f" stroked="f" strokeweight=".5pt">
+                <v:textbox>
+                  <w:txbxContent>
+                    <w:p>
+                      <w:proofErr w:type="gramStart"/>
+                      <w:r>
+                        <w:t>a</w:t>
+                      </w:r>
+                      <w:proofErr w:type="gramEnd"/>
+                    </w:p>
+                  </w:txbxContent>
+                </v:textbox>
+              </v:shape>
+            </w:pict>
+          </mc:Fallback>
+        </mc:AlternateContent>
+      </w:r>
+      <w:r>
+        <w:rPr>
+          <w:rFonts w:ascii="Calibri" w:hAnsi="Calibri" w:cs="Calibri"/>
+          <w:b/>
+          <w:bCs/>
+          <w:noProof/>
+          <w:color w:val="000000"/>
+          <w:sz w:val="22"/>
+          <w:szCs w:val="22"/>
+          <w:lang w:val="en-GB"/>
+        </w:rPr>
+        <mc:AlternateContent>
+          <mc:Choice Requires="wps">
+            <w:drawing>
+              <wp:anchor distT="0" distB="0" distL="114300" distR="114300" simplePos="0" relativeHeight="251685888" behindDoc="0" locked="0" layoutInCell="1" allowOverlap="1" wp14:anchorId="61911E65" wp14:editId="501EE6CA">
+                <wp:simplePos x="0" y="0"/>
+                <wp:positionH relativeFrom="column">
+                  <wp:posOffset>2623185</wp:posOffset>
+                </wp:positionH>
+                <wp:positionV relativeFrom="paragraph">
+                  <wp:posOffset>56739</wp:posOffset>
+                </wp:positionV>
+                <wp:extent cx="914400" cy="320400"/>
+                <wp:effectExtent l="0" t="0" r="0" b="0"/>
+                <wp:wrapNone/>
+                <wp:docPr id="609264311" name="Zone de texte 22"/>
+                <wp:cNvGraphicFramePr/>
+                <a:graphic xmlns:a="http://schemas.openxmlformats.org/drawingml/2006/main">
+                  <a:graphicData uri="http://schemas.microsoft.com/office/word/2010/wordprocessingShape">
+                    <wps:wsp>
+                      <wps:cNvSpPr txBox="1"/>
+                      <wps:spPr>
+                        <a:xfrm>
+                          <a:off x="0" y="0"/>
+                          <a:ext cx="914400" cy="320400"/>
+                        </a:xfrm>
+                        <a:prstGeom prst="rect">
+                          <a:avLst/>
+                        </a:prstGeom>
+                        <a:noFill/>
+                        <a:ln w="6350">
+                          <a:noFill/>
+                        </a:ln>
+                      </wps:spPr>
+                      <wps:txbx>
+                        <w:txbxContent>
+                          <w:p>
+                            <w:proofErr w:type="gramStart"/>
+                            <w:r>
+                              <w:t>a</w:t>
+                            </w:r>
+                            <w:proofErr w:type="gramEnd"/>
+                          </w:p>
+                        </w:txbxContent>
+                      </wps:txbx>
+                      <wps:bodyPr rot="0" spcFirstLastPara="0" vertOverflow="overflow" horzOverflow="overflow" vert="horz" wrap="none" lIns="91440" tIns="45720" rIns="91440" bIns="45720" numCol="1" spcCol="0" rtlCol="0" fromWordArt="0" anchor="t" anchorCtr="0" forceAA="0" compatLnSpc="1">
+                        <a:prstTxWarp prst="textNoShape">
+                          <a:avLst/>
+                        </a:prstTxWarp>
+                        <a:noAutofit/>
+                      </wps:bodyPr>
+                    </wps:wsp>
+                  </a:graphicData>
+                </a:graphic>
+                <wp14:sizeRelH relativeFrom="margin">
+                  <wp14:pctWidth>0</wp14:pctWidth>
+                </wp14:sizeRelH>
+                <wp14:sizeRelV relativeFrom="margin">
+                  <wp14:pctHeight>0</wp14:pctHeight>
+                </wp14:sizeRelV>
+              </wp:anchor>
+            </w:drawing>
+          </mc:Choice>
+          <mc:Fallback>
+            <w:pict>
+              <v:shape w14:anchorId="61911E65" id="_x0000_s1084" type="#_x0000_t202" style="position:absolute;left:0;text-align:left;margin-left:206.55pt;margin-top:4.45pt;width:1in;height:25.25pt;z-index:251685888;visibility:visible;mso-wrap-style:none;mso-width-percent:0;mso-height-percent:0;mso-wrap-distance-left:9pt;mso-wrap-distance-top:0;mso-wrap-distance-right:9pt;mso-wrap-distance-bottom:0;mso-position-horizontal:absolute;mso-position-horizontal-relative:text;mso-position-vertical:absolute;mso-position-vertical-relative:text;mso-width-percent:0;mso-height-percent:0;mso-width-relative:margin;mso-height-relative:margin;v-text-anchor:top" o:gfxdata="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" filled="f" stroked="f" strokeweight=".5pt">
+                <v:textbox>
+                  <w:txbxContent>
+                    <w:p>
+                      <w:proofErr w:type="gramStart"/>
+                      <w:r>
+                        <w:t>a</w:t>
+                      </w:r>
+                      <w:proofErr w:type="gramEnd"/>
+                    </w:p>
+                  </w:txbxContent>
+                </v:textbox>
+              </v:shape>
+            </w:pict>
+          </mc:Fallback>
+        </mc:AlternateContent>
+      </w:r>
+      <w:r>
+        <w:rPr>
+          <w:rFonts w:ascii="Calibri" w:hAnsi="Calibri" w:cs="Calibri"/>
+          <w:b/>
+          <w:bCs/>
+          <w:noProof/>
+          <w:color w:val="000000"/>
+          <w:sz w:val="22"/>
+          <w:szCs w:val="22"/>
+          <w:lang w:val="en-GB"/>
+        </w:rPr>
+        <mc:AlternateContent>
+          <mc:Choice Requires="wps">
+            <w:drawing>
+              <wp:anchor distT="0" distB="0" distL="114300" distR="114300" simplePos="0" relativeHeight="251683840" behindDoc="0" locked="0" layoutInCell="1" allowOverlap="1" wp14:anchorId="244140F5" wp14:editId="2B29877E">
+                <wp:simplePos x="0" y="0"/>
+                <wp:positionH relativeFrom="column">
+                  <wp:posOffset>3842198</wp:posOffset>
+                </wp:positionH>
+                <wp:positionV relativeFrom="paragraph">
+                  <wp:posOffset>2315845</wp:posOffset>
+                </wp:positionV>
+                <wp:extent cx="914400" cy="320400"/>
+                <wp:effectExtent l="0" t="0" r="0" b="0"/>
+                <wp:wrapNone/>
+                <wp:docPr id="982275697" name="Zone de texte 22"/>
+                <wp:cNvGraphicFramePr/>
+                <a:graphic xmlns:a="http://schemas.openxmlformats.org/drawingml/2006/main">
+                  <a:graphicData uri="http://schemas.microsoft.com/office/word/2010/wordprocessingShape">
+                    <wps:wsp>
+                      <wps:cNvSpPr txBox="1"/>
+                      <wps:spPr>
+                        <a:xfrm>
+                          <a:off x="0" y="0"/>
+                          <a:ext cx="914400" cy="320400"/>
+                        </a:xfrm>
+                        <a:prstGeom prst="rect">
+                          <a:avLst/>
+                        </a:prstGeom>
+                        <a:noFill/>
+                        <a:ln w="6350">
+                          <a:noFill/>
+                        </a:ln>
+                      </wps:spPr>
+                      <wps:txbx>
+                        <w:txbxContent>
+                          <w:p>
+                            <w:proofErr w:type="spellStart"/>
+                            <w:proofErr w:type="gramStart"/>
+                            <w:r>
+                              <w:t>a,b</w:t>
+                            </w:r>
+                            <w:proofErr w:type="gramEnd"/>
+                            <w:r>
+                              <w:t>,c</w:t>
+                            </w:r>
+                            <w:proofErr w:type="spellEnd"/>
+                          </w:p>
+                        </w:txbxContent>
+                      </wps:txbx>
+                      <wps:bodyPr rot="0" spcFirstLastPara="0" vertOverflow="overflow" horzOverflow="overflow" vert="horz" wrap="none" lIns="91440" tIns="45720" rIns="91440" bIns="45720" numCol="1" spcCol="0" rtlCol="0" fromWordArt="0" anchor="t" anchorCtr="0" forceAA="0" compatLnSpc="1">
+                        <a:prstTxWarp prst="textNoShape">
+                          <a:avLst/>
+                        </a:prstTxWarp>
+                        <a:noAutofit/>
+                      </wps:bodyPr>
+                    </wps:wsp>
+                  </a:graphicData>
+                </a:graphic>
+                <wp14:sizeRelH relativeFrom="margin">
+                  <wp14:pctWidth>0</wp14:pctWidth>
+                </wp14:sizeRelH>
+                <wp14:sizeRelV relativeFrom="margin">
+                  <wp14:pctHeight>0</wp14:pctHeight>
+                </wp14:sizeRelV>
+              </wp:anchor>
+            </w:drawing>
+          </mc:Choice>
+          <mc:Fallback>
+            <w:pict>
+              <v:shape w14:anchorId="244140F5" id="_x0000_s1085" type="#_x0000_t202" style="position:absolute;left:0;text-align:left;margin-left:302.55pt;margin-top:182.35pt;width:1in;height:25.25pt;z-index:251683840;visibility:visible;mso-wrap-style:none;mso-width-percent:0;mso-height-percent:0;mso-wrap-distance-left:9pt;mso-wrap-distance-top:0;mso-wrap-distance-right:9pt;mso-wrap-distance-bottom:0;mso-position-horizontal:absolute;mso-position-horizontal-relative:text;mso-position-vertical:absolute;mso-position-vertical-relative:text;mso-width-percent:0;mso-height-percent:0;mso-width-relative:margin;mso-height-relative:margin;v-text-anchor:top" o:gfxdata="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" filled="f" stroked="f" strokeweight=".5pt">
+                <v:textbox>
+                  <w:txbxContent>
+                    <w:p>
+                      <w:proofErr w:type="spellStart"/>
+                      <w:proofErr w:type="gramStart"/>
+                      <w:r>
+                        <w:t>a,b</w:t>
+                      </w:r>
+                      <w:proofErr w:type="gramEnd"/>
+                      <w:r>
+                        <w:t>,c</w:t>
+                      </w:r>
+                      <w:proofErr w:type="spellEnd"/>
+                    </w:p>
+                  </w:txbxContent>
+                </v:textbox>
+              </v:shape>
+            </w:pict>
+          </mc:Fallback>
+        </mc:AlternateContent>
+      </w:r>
+      <w:r>
+        <w:rPr>
+          <w:rFonts w:ascii="Calibri" w:hAnsi="Calibri" w:cs="Calibri"/>
+          <w:b/>
+          <w:bCs/>
+          <w:noProof/>
+          <w:color w:val="000000"/>
+          <w:sz w:val="22"/>
+          <w:szCs w:val="22"/>
+          <w:lang w:val="en-GB"/>
+        </w:rPr>
+        <mc:AlternateContent>
+          <mc:Choice Requires="wps">
+            <w:drawing>
+              <wp:anchor distT="0" distB="0" distL="114300" distR="114300" simplePos="0" relativeHeight="251679744" behindDoc="0" locked="0" layoutInCell="1" allowOverlap="1" wp14:anchorId="6BC7CD3C" wp14:editId="17F91460">
+                <wp:simplePos x="0" y="0"/>
+                <wp:positionH relativeFrom="column">
+                  <wp:posOffset>2626285</wp:posOffset>
+                </wp:positionH>
+                <wp:positionV relativeFrom="paragraph">
+                  <wp:posOffset>2312670</wp:posOffset>
+                </wp:positionV>
+                <wp:extent cx="914400" cy="320400"/>
+                <wp:effectExtent l="0" t="0" r="0" b="0"/>
+                <wp:wrapNone/>
+                <wp:docPr id="244228604" name="Zone de texte 22"/>
+                <wp:cNvGraphicFramePr/>
+                <a:graphic xmlns:a="http://schemas.openxmlformats.org/drawingml/2006/main">
+                  <a:graphicData uri="http://schemas.microsoft.com/office/word/2010/wordprocessingShape">
+                    <wps:wsp>
+                      <wps:cNvSpPr txBox="1"/>
+                      <wps:spPr>
+                        <a:xfrm>
+                          <a:off x="0" y="0"/>
+                          <a:ext cx="914400" cy="320400"/>
+                        </a:xfrm>
+                        <a:prstGeom prst="rect">
+                          <a:avLst/>
+                        </a:prstGeom>
+                        <a:noFill/>
+                        <a:ln w="6350">
+                          <a:noFill/>
+                        </a:ln>
+                      </wps:spPr>
+                      <wps:txbx>
+                        <w:txbxContent>
+                          <w:p>
+                            <w:proofErr w:type="gramStart"/>
+                            <w:r>
+                              <w:t>a</w:t>
+                            </w:r>
+                            <w:proofErr w:type="gramEnd"/>
+                          </w:p>
+                        </w:txbxContent>
+                      </wps:txbx>
+                      <wps:bodyPr rot="0" spcFirstLastPara="0" vertOverflow="overflow" horzOverflow="overflow" vert="horz" wrap="none" lIns="91440" tIns="45720" rIns="91440" bIns="45720" numCol="1" spcCol="0" rtlCol="0" fromWordArt="0" anchor="t" anchorCtr="0" forceAA="0" compatLnSpc="1">
+                        <a:prstTxWarp prst="textNoShape">
+                          <a:avLst/>
+                        </a:prstTxWarp>
+                        <a:noAutofit/>
+                      </wps:bodyPr>
+                    </wps:wsp>
+                  </a:graphicData>
+                </a:graphic>
+                <wp14:sizeRelH relativeFrom="margin">
+                  <wp14:pctWidth>0</wp14:pctWidth>
+                </wp14:sizeRelH>
+                <wp14:sizeRelV relativeFrom="margin">
+                  <wp14:pctHeight>0</wp14:pctHeight>
+                </wp14:sizeRelV>
+              </wp:anchor>
+            </w:drawing>
+          </mc:Choice>
+          <mc:Fallback>
+            <w:pict>
+              <v:shape w14:anchorId="6BC7CD3C" id="_x0000_s1086" type="#_x0000_t202" style="position:absolute;left:0;text-align:left;margin-left:206.8pt;margin-top:182.1pt;width:1in;height:25.25pt;z-index:251679744;visibility:visible;mso-wrap-style:none;mso-width-percent:0;mso-height-percent:0;mso-wrap-distance-left:9pt;mso-wrap-distance-top:0;mso-wrap-distance-right:9pt;mso-wrap-distance-bottom:0;mso-position-horizontal:absolute;mso-position-horizontal-relative:text;mso-position-vertical:absolute;mso-position-vertical-relative:text;mso-width-percent:0;mso-height-percent:0;mso-width-relative:margin;mso-height-relative:margin;v-text-anchor:top" o:gfxdata="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" filled="f" stroked="f" strokeweight=".5pt">
+                <v:textbox>
+                  <w:txbxContent>
+                    <w:p>
+                      <w:proofErr w:type="gramStart"/>
+                      <w:r>
+                        <w:t>a</w:t>
+                      </w:r>
+                      <w:proofErr w:type="gramEnd"/>
+                    </w:p>
+                  </w:txbxContent>
+                </v:textbox>
+              </v:shape>
+            </w:pict>
+          </mc:Fallback>
+        </mc:AlternateContent>
+      </w:r>
+      <w:r>
+        <w:rPr>
+          <w:rFonts w:ascii="Calibri" w:hAnsi="Calibri" w:cs="Calibri"/>
+          <w:b/>
+          <w:bCs/>
+          <w:noProof/>
+          <w:color w:val="000000"/>
+          <w:sz w:val="22"/>
+          <w:szCs w:val="22"/>
+          <w:lang w:val="en-GB"/>
+        </w:rPr>
+        <mc:AlternateContent>
+          <mc:Choice Requires="wps">
+            <w:drawing>
+              <wp:anchor distT="0" distB="0" distL="114300" distR="114300" simplePos="0" relativeHeight="251681792" behindDoc="0" locked="0" layoutInCell="1" allowOverlap="1" wp14:anchorId="5577EE60" wp14:editId="7CB69FA3">
+                <wp:simplePos x="0" y="0"/>
+                <wp:positionH relativeFrom="column">
+                  <wp:posOffset>3220272</wp:posOffset>
+                </wp:positionH>
+                <wp:positionV relativeFrom="paragraph">
+                  <wp:posOffset>2316442</wp:posOffset>
+                </wp:positionV>
+                <wp:extent cx="914400" cy="320400"/>
+                <wp:effectExtent l="0" t="0" r="0" b="0"/>
+                <wp:wrapNone/>
+                <wp:docPr id="353778304" name="Zone de texte 22"/>
+                <wp:cNvGraphicFramePr/>
+                <a:graphic xmlns:a="http://schemas.openxmlformats.org/drawingml/2006/main">
+                  <a:graphicData uri="http://schemas.microsoft.com/office/word/2010/wordprocessingShape">
+                    <wps:wsp>
+                      <wps:cNvSpPr txBox="1"/>
+                      <wps:spPr>
+                        <a:xfrm>
+                          <a:off x="0" y="0"/>
+                          <a:ext cx="914400" cy="320400"/>
+                        </a:xfrm>
+                        <a:prstGeom prst="rect">
+                          <a:avLst/>
+                        </a:prstGeom>
+                        <a:noFill/>
+                        <a:ln w="6350">
+                          <a:noFill/>
+                        </a:ln>
+                      </wps:spPr>
+                      <wps:txbx>
+                        <w:txbxContent>
+                          <w:p>
+                            <w:proofErr w:type="spellStart"/>
+                            <w:proofErr w:type="gramStart"/>
+                            <w:r>
+                              <w:t>a,b</w:t>
+                            </w:r>
+                            <w:proofErr w:type="spellEnd"/>
+                            <w:proofErr w:type="gramEnd"/>
+                          </w:p>
+                        </w:txbxContent>
+                      </wps:txbx>
+                      <wps:bodyPr rot="0" spcFirstLastPara="0" vertOverflow="overflow" horzOverflow="overflow" vert="horz" wrap="none" lIns="91440" tIns="45720" rIns="91440" bIns="45720" numCol="1" spcCol="0" rtlCol="0" fromWordArt="0" anchor="t" anchorCtr="0" forceAA="0" compatLnSpc="1">
+                        <a:prstTxWarp prst="textNoShape">
+                          <a:avLst/>
+                        </a:prstTxWarp>
+                        <a:noAutofit/>
+                      </wps:bodyPr>
+                    </wps:wsp>
+                  </a:graphicData>
+                </a:graphic>
+                <wp14:sizeRelH relativeFrom="margin">
+                  <wp14:pctWidth>0</wp14:pctWidth>
+                </wp14:sizeRelH>
+                <wp14:sizeRelV relativeFrom="margin">
+                  <wp14:pctHeight>0</wp14:pctHeight>
+                </wp14:sizeRelV>
+              </wp:anchor>
+            </w:drawing>
+          </mc:Choice>
+          <mc:Fallback>
+            <w:pict>
+              <v:shape w14:anchorId="5577EE60" id="_x0000_s1087" type="#_x0000_t202" style="position:absolute;left:0;text-align:left;margin-left:253.55pt;margin-top:182.4pt;width:1in;height:25.25pt;z-index:251681792;visibility:visible;mso-wrap-style:none;mso-width-percent:0;mso-height-percent:0;mso-wrap-distance-left:9pt;mso-wrap-distance-top:0;mso-wrap-distance-right:9pt;mso-wrap-distance-bottom:0;mso-position-horizontal:absolute;mso-position-horizontal-relative:text;mso-position-vertical:absolute;mso-position-vertical-relative:text;mso-width-percent:0;mso-height-percent:0;mso-width-relative:margin;mso-height-relative:margin;v-text-anchor:top" o:gfxdata="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" filled="f" stroked="f" strokeweight=".5pt">
+                <v:textbox>
+                  <w:txbxContent>
+                    <w:p>
+                      <w:proofErr w:type="spellStart"/>
+                      <w:proofErr w:type="gramStart"/>
+                      <w:r>
+                        <w:t>a,b</w:t>
+                      </w:r>
+                      <w:proofErr w:type="spellEnd"/>
+                      <w:proofErr w:type="gramEnd"/>
+                    </w:p>
+                  </w:txbxContent>
+                </v:textbox>
+              </v:shape>
+            </w:pict>
+          </mc:Fallback>
+        </mc:AlternateContent>
+      </w:r>
+      <w:r>
+        <w:rPr>
+          <w:rFonts w:ascii="Calibri" w:hAnsi="Calibri" w:cs="Calibri"/>
+          <w:b/>
+          <w:bCs/>
+          <w:noProof/>
+          <w:color w:val="000000"/>
+          <w:sz w:val="22"/>
+          <w:szCs w:val="22"/>
+          <w:lang w:val="en-GB"/>
+        </w:rPr>
+        <w:drawing>
+          <wp:inline distT="0" distB="0" distL="0" distR="0" wp14:anchorId="3A0CA29F" wp14:editId="5DA4091A">
+            <wp:extent cx="3314700" cy="4711700"/>
+            <wp:effectExtent l="0" t="0" r="0" b="0"/>
+            <wp:docPr id="1858462960" name="Image 23"/>
+            <wp:cNvGraphicFramePr>
+              <a:graphicFrameLocks xmlns:a="http://schemas.openxmlformats.org/drawingml/2006/main" noChangeAspect="1"/>
+            </wp:cNvGraphicFramePr>
+            <a:graphic xmlns:a="http://schemas.openxmlformats.org/drawingml/2006/main">
+              <a:graphicData uri="http://schemas.openxmlformats.org/drawingml/2006/picture">
+                <pic:pic xmlns:pic="http://schemas.openxmlformats.org/drawingml/2006/picture">
+                  <pic:nvPicPr>
+                    <pic:cNvPr id="1858462960" name="Image 1858462960"/>
+                    <pic:cNvPicPr/>
+                  </pic:nvPicPr>
+                  <pic:blipFill>
+                    <a:blip r:embed="rId21"/>
+                    <a:stretch>
+                      <a:fillRect/>
+                    </a:stretch>
+                  </pic:blipFill>
+                  <pic:spPr>
+                    <a:xfrm>
+                      <a:off x="0" y="0"/>
+                      <a:ext cx="3314700" cy="4711700"/>
+                    </a:xfrm>
+                    <a:prstGeom prst="rect">
+                      <a:avLst/>
+                    </a:prstGeom>
+                  </pic:spPr>
+                </pic:pic>
+              </a:graphicData>
+            </a:graphic>
+          </wp:inline>
+        </w:drawing>
+      </w:r>
+    </w:p>
+    <w:p>
+      <w:pPr>
+        <w:spacing w:line="276" w:lineRule="auto"/>
+        <w:jc w:val="both"/>
+        <w:rPr>
+          <w:rFonts w:ascii="Calibri" w:hAnsi="Calibri" w:cs="Calibri"/>
+          <w:b/>
+          <w:bCs/>
+          <w:color w:val="000000"/>
+          <w:sz w:val="22"/>
+          <w:szCs w:val="22"/>
+          <w:lang w:val="en-GB"/>
+        </w:rPr>
+      </w:pPr>
+    </w:p>
+    <w:p>
+      <w:pPr>
+        <w:spacing w:line="276" w:lineRule="auto"/>
+        <w:jc w:val="both"/>
+        <w:rPr>
+          <w:rFonts w:ascii="Calibri" w:hAnsi="Calibri" w:cs="Calibri"/>
+          <w:b/>
+          <w:bCs/>
+          <w:sz w:val="22"/>
+          <w:szCs w:val="22"/>
+          <w:lang w:val="en-GB"/>
+        </w:rPr>
+      </w:pPr>
+      <w:r>
+        <w:rPr>
+          <w:rFonts w:ascii="Calibri" w:hAnsi="Calibri" w:cs="Calibri"/>
+          <w:b/>
+          <w:bCs/>
+          <w:color w:val="000000"/>
+          <w:sz w:val="22"/>
+          <w:szCs w:val="22"/>
+          <w:lang w:val="en-GB"/>
+        </w:rPr>
+        <w:t xml:space="preserve">Figure S3. Heatmap of trace element levels across experimental </w:t>
+      </w:r>
+      <w:commentRangeStart w:id="0"/>
+      <w:r>
+        <w:rPr>
+          <w:rFonts w:ascii="Calibri" w:hAnsi="Calibri" w:cs="Calibri"/>
+          <w:b/>
+          <w:bCs/>
+          <w:color w:val="000000"/>
+          <w:sz w:val="22"/>
+          <w:szCs w:val="22"/>
+          <w:lang w:val="en-GB"/>
+        </w:rPr>
+        <w:t>grou</w:t>
+      </w:r>
+      <w:commentRangeEnd w:id="0"/>
+      <w:r>
+        <w:rPr>
+          <w:rStyle w:val="Marquedecommentaire"/>
+          <w:kern w:val="0"/>
           <w14:ligatures w14:val="none"/>
         </w:rPr>
-      </w:pPr>
-      <w:r>
+        <w:commentReference w:id="0"/>
+      </w:r>
+      <w:r>
+        <w:rPr>
+          <w:rFonts w:ascii="Calibri" w:hAnsi="Calibri" w:cs="Calibri"/>
+          <w:b/>
+          <w:bCs/>
+          <w:color w:val="000000"/>
+          <w:sz w:val="22"/>
+          <w:szCs w:val="22"/>
+          <w:lang w:val="en-GB"/>
+        </w:rPr>
+        <w:t>ps.</w:t>
+      </w:r>
+      <w:r>
+        <w:rPr>
+          <w:rFonts w:ascii="Calibri" w:hAnsi="Calibri" w:cs="Calibri"/>
+          <w:color w:val="000000"/>
+          <w:sz w:val="22"/>
+          <w:szCs w:val="22"/>
+          <w:lang w:val="en-GB"/>
+        </w:rPr>
+        <w:t xml:space="preserve"> Increasing intensity of blue indicates higher values. Statistically significant differences are annotated as follows:</w:t>
+      </w:r>
+      <w:r>
+        <w:rPr>
+          <w:rStyle w:val="apple-converted-space"/>
+          <w:rFonts w:ascii="Calibri" w:hAnsi="Calibri" w:cs="Calibri"/>
+          <w:color w:val="000000"/>
+          <w:sz w:val="22"/>
+          <w:szCs w:val="22"/>
+          <w:lang w:val="en-GB"/>
+        </w:rPr>
+        <w:t> </w:t>
+      </w:r>
+      <w:r>
+        <w:rPr>
+          <w:rStyle w:val="Accentuation"/>
+          <w:rFonts w:ascii="Calibri" w:hAnsi="Calibri" w:cs="Calibri"/>
+          <w:color w:val="000000"/>
+          <w:sz w:val="22"/>
+          <w:szCs w:val="22"/>
+          <w:lang w:val="en-GB"/>
+        </w:rPr>
+        <w:t>a</w:t>
+      </w:r>
+      <w:r>
+        <w:rPr>
+          <w:rStyle w:val="apple-converted-space"/>
+          <w:rFonts w:ascii="Calibri" w:hAnsi="Calibri" w:cs="Calibri"/>
+          <w:color w:val="000000"/>
+          <w:sz w:val="22"/>
+          <w:szCs w:val="22"/>
+          <w:lang w:val="en-GB"/>
+        </w:rPr>
+        <w:t> </w:t>
+      </w:r>
+      <w:r>
+        <w:rPr>
+          <w:rFonts w:ascii="Calibri" w:hAnsi="Calibri" w:cs="Calibri"/>
+          <w:color w:val="000000"/>
+          <w:sz w:val="22"/>
+          <w:szCs w:val="22"/>
+          <w:lang w:val="en-GB"/>
+        </w:rPr>
+        <w:t>denotes a significant difference versus CTL,</w:t>
+      </w:r>
+      <w:r>
+        <w:rPr>
+          <w:rStyle w:val="apple-converted-space"/>
+          <w:rFonts w:ascii="Calibri" w:hAnsi="Calibri" w:cs="Calibri"/>
+          <w:color w:val="000000"/>
+          <w:sz w:val="22"/>
+          <w:szCs w:val="22"/>
+          <w:lang w:val="en-GB"/>
+        </w:rPr>
+        <w:t> </w:t>
+      </w:r>
+      <w:r>
+        <w:rPr>
+          <w:rStyle w:val="Accentuation"/>
+          <w:rFonts w:ascii="Calibri" w:hAnsi="Calibri" w:cs="Calibri"/>
+          <w:color w:val="000000"/>
+          <w:sz w:val="22"/>
+          <w:szCs w:val="22"/>
+          <w:lang w:val="en-GB"/>
+        </w:rPr>
+        <w:t>b</w:t>
+      </w:r>
+      <w:r>
+        <w:rPr>
+          <w:rStyle w:val="apple-converted-space"/>
+          <w:rFonts w:ascii="Calibri" w:hAnsi="Calibri" w:cs="Calibri"/>
+          <w:color w:val="000000"/>
+          <w:sz w:val="22"/>
+          <w:szCs w:val="22"/>
+          <w:lang w:val="en-GB"/>
+        </w:rPr>
+        <w:t> </w:t>
+      </w:r>
+      <w:r>
+        <w:rPr>
+          <w:rFonts w:ascii="Calibri" w:hAnsi="Calibri" w:cs="Calibri"/>
+          <w:color w:val="000000"/>
+          <w:sz w:val="22"/>
+          <w:szCs w:val="22"/>
+          <w:lang w:val="en-GB"/>
+        </w:rPr>
+        <w:t>versus HFHC, and</w:t>
+      </w:r>
+      <w:r>
+        <w:rPr>
+          <w:rStyle w:val="apple-converted-space"/>
+          <w:rFonts w:ascii="Calibri" w:hAnsi="Calibri" w:cs="Calibri"/>
+          <w:color w:val="000000"/>
+          <w:sz w:val="22"/>
+          <w:szCs w:val="22"/>
+          <w:lang w:val="en-GB"/>
+        </w:rPr>
+        <w:t> </w:t>
+      </w:r>
+      <w:r>
+        <w:rPr>
+          <w:rStyle w:val="Accentuation"/>
+          <w:rFonts w:ascii="Calibri" w:hAnsi="Calibri" w:cs="Calibri"/>
+          <w:color w:val="000000"/>
+          <w:sz w:val="22"/>
+          <w:szCs w:val="22"/>
+          <w:lang w:val="en-GB"/>
+        </w:rPr>
+        <w:t>c</w:t>
+      </w:r>
+      <w:r>
+        <w:rPr>
+          <w:rStyle w:val="apple-converted-space"/>
+          <w:rFonts w:ascii="Calibri" w:hAnsi="Calibri" w:cs="Calibri"/>
+          <w:color w:val="000000"/>
+          <w:sz w:val="22"/>
+          <w:szCs w:val="22"/>
+          <w:lang w:val="en-GB"/>
+        </w:rPr>
+        <w:t> </w:t>
+      </w:r>
+      <w:r>
+        <w:rPr>
+          <w:rFonts w:ascii="Calibri" w:hAnsi="Calibri" w:cs="Calibri"/>
+          <w:color w:val="000000"/>
+          <w:sz w:val="22"/>
+          <w:szCs w:val="22"/>
+          <w:lang w:val="en-GB"/>
+        </w:rPr>
+        <w:t>versus IRON. Statistical analysis was performed using multiple pairwise Wilcoxon tests with Bonferroni correction.</w:t>
+      </w:r>
+    </w:p>
+    <w:p>
+      <w:pPr>
+        <w:rPr>
+          <w:rFonts w:ascii="Calibri" w:hAnsi="Calibri" w:cs="Calibri"/>
+          <w:b/>
+          <w:bCs/>
+          <w:sz w:val="22"/>
+          <w:szCs w:val="22"/>
+        </w:rPr>
+      </w:pPr>
+    </w:p>
+    <w:p>
+      <w:pPr>
+        <w:jc w:val="both"/>
         <w:rPr>
           <w:rFonts w:ascii="Calibri" w:hAnsi="Calibri" w:cs="Calibri"/>
           <w:b/>
@@ -2823,6 +5684,364 @@
           <w:szCs w:val="22"/>
           <w:lang w:val="en-CA"/>
         </w:rPr>
+      </w:pPr>
+    </w:p>
+    <w:p>
+      <w:pPr>
+        <w:jc w:val="both"/>
+        <w:rPr>
+          <w:rFonts w:ascii="Calibri" w:hAnsi="Calibri" w:cs="Calibri"/>
+          <w:b/>
+          <w:bCs/>
+          <w:color w:val="000000"/>
+          <w:kern w:val="24"/>
+          <w:sz w:val="22"/>
+          <w:szCs w:val="22"/>
+          <w:lang w:val="en-CA"/>
+        </w:rPr>
+      </w:pPr>
+    </w:p>
+    <w:p>
+      <w:pPr>
+        <w:jc w:val="both"/>
+        <w:rPr>
+          <w:rFonts w:ascii="Calibri" w:hAnsi="Calibri" w:cs="Calibri"/>
+          <w:b/>
+          <w:bCs/>
+          <w:color w:val="000000"/>
+          <w:kern w:val="24"/>
+          <w:sz w:val="22"/>
+          <w:szCs w:val="22"/>
+          <w:lang w:val="en-CA"/>
+        </w:rPr>
+      </w:pPr>
+    </w:p>
+    <w:p>
+      <w:pPr>
+        <w:jc w:val="both"/>
+        <w:rPr>
+          <w:rFonts w:ascii="Calibri" w:hAnsi="Calibri" w:cs="Calibri"/>
+          <w:b/>
+          <w:bCs/>
+          <w:color w:val="000000"/>
+          <w:kern w:val="24"/>
+          <w:sz w:val="22"/>
+          <w:szCs w:val="22"/>
+          <w:lang w:val="en-CA"/>
+        </w:rPr>
+      </w:pPr>
+    </w:p>
+    <w:p>
+      <w:pPr>
+        <w:jc w:val="both"/>
+        <w:rPr>
+          <w:rFonts w:ascii="Calibri" w:hAnsi="Calibri" w:cs="Calibri"/>
+          <w:b/>
+          <w:bCs/>
+          <w:color w:val="000000"/>
+          <w:kern w:val="24"/>
+          <w:sz w:val="22"/>
+          <w:szCs w:val="22"/>
+          <w:lang w:val="en-CA"/>
+        </w:rPr>
+      </w:pPr>
+    </w:p>
+    <w:p>
+      <w:pPr>
+        <w:jc w:val="both"/>
+        <w:rPr>
+          <w:rFonts w:ascii="Calibri" w:hAnsi="Calibri" w:cs="Calibri"/>
+          <w:b/>
+          <w:bCs/>
+          <w:color w:val="000000"/>
+          <w:kern w:val="24"/>
+          <w:sz w:val="22"/>
+          <w:szCs w:val="22"/>
+          <w:lang w:val="en-CA"/>
+        </w:rPr>
+      </w:pPr>
+    </w:p>
+    <w:p>
+      <w:pPr>
+        <w:jc w:val="both"/>
+        <w:rPr>
+          <w:rFonts w:ascii="Calibri" w:hAnsi="Calibri" w:cs="Calibri"/>
+          <w:b/>
+          <w:bCs/>
+          <w:color w:val="000000"/>
+          <w:kern w:val="24"/>
+          <w:sz w:val="22"/>
+          <w:szCs w:val="22"/>
+          <w:lang w:val="en-CA"/>
+        </w:rPr>
+      </w:pPr>
+    </w:p>
+    <w:p>
+      <w:pPr>
+        <w:jc w:val="both"/>
+        <w:rPr>
+          <w:rFonts w:ascii="Calibri" w:hAnsi="Calibri" w:cs="Calibri"/>
+          <w:b/>
+          <w:bCs/>
+          <w:color w:val="000000"/>
+          <w:kern w:val="24"/>
+          <w:sz w:val="22"/>
+          <w:szCs w:val="22"/>
+          <w:lang w:val="en-CA"/>
+        </w:rPr>
+      </w:pPr>
+    </w:p>
+    <w:p>
+      <w:pPr>
+        <w:jc w:val="both"/>
+        <w:rPr>
+          <w:rFonts w:ascii="Calibri" w:hAnsi="Calibri" w:cs="Calibri"/>
+          <w:b/>
+          <w:bCs/>
+          <w:color w:val="000000"/>
+          <w:kern w:val="24"/>
+          <w:sz w:val="22"/>
+          <w:szCs w:val="22"/>
+          <w:lang w:val="en-CA"/>
+        </w:rPr>
+      </w:pPr>
+    </w:p>
+    <w:p>
+      <w:pPr>
+        <w:jc w:val="both"/>
+        <w:rPr>
+          <w:rFonts w:ascii="Calibri" w:hAnsi="Calibri" w:cs="Calibri"/>
+          <w:b/>
+          <w:bCs/>
+          <w:color w:val="000000"/>
+          <w:kern w:val="24"/>
+          <w:sz w:val="22"/>
+          <w:szCs w:val="22"/>
+          <w:lang w:val="en-CA"/>
+        </w:rPr>
+      </w:pPr>
+    </w:p>
+    <w:p>
+      <w:pPr>
+        <w:jc w:val="both"/>
+        <w:rPr>
+          <w:rFonts w:ascii="Calibri" w:hAnsi="Calibri" w:cs="Calibri"/>
+          <w:b/>
+          <w:bCs/>
+          <w:color w:val="000000"/>
+          <w:kern w:val="24"/>
+          <w:sz w:val="22"/>
+          <w:szCs w:val="22"/>
+          <w:lang w:val="en-CA"/>
+        </w:rPr>
+      </w:pPr>
+    </w:p>
+    <w:p>
+      <w:pPr>
+        <w:jc w:val="both"/>
+        <w:rPr>
+          <w:rFonts w:ascii="Calibri" w:hAnsi="Calibri" w:cs="Calibri"/>
+          <w:b/>
+          <w:bCs/>
+          <w:color w:val="000000"/>
+          <w:kern w:val="24"/>
+          <w:sz w:val="22"/>
+          <w:szCs w:val="22"/>
+          <w:lang w:val="en-CA"/>
+        </w:rPr>
+      </w:pPr>
+    </w:p>
+    <w:p>
+      <w:pPr>
+        <w:jc w:val="both"/>
+        <w:rPr>
+          <w:rFonts w:ascii="Calibri" w:hAnsi="Calibri" w:cs="Calibri"/>
+          <w:b/>
+          <w:bCs/>
+          <w:color w:val="000000"/>
+          <w:kern w:val="24"/>
+          <w:sz w:val="22"/>
+          <w:szCs w:val="22"/>
+          <w:lang w:val="en-CA"/>
+        </w:rPr>
+      </w:pPr>
+    </w:p>
+    <w:p>
+      <w:pPr>
+        <w:jc w:val="both"/>
+        <w:rPr>
+          <w:rFonts w:ascii="Calibri" w:hAnsi="Calibri" w:cs="Calibri"/>
+          <w:b/>
+          <w:bCs/>
+          <w:color w:val="000000"/>
+          <w:kern w:val="24"/>
+          <w:sz w:val="22"/>
+          <w:szCs w:val="22"/>
+          <w:lang w:val="en-CA"/>
+        </w:rPr>
+      </w:pPr>
+    </w:p>
+    <w:p>
+      <w:pPr>
+        <w:jc w:val="both"/>
+        <w:rPr>
+          <w:rFonts w:ascii="Calibri" w:hAnsi="Calibri" w:cs="Calibri"/>
+          <w:b/>
+          <w:bCs/>
+          <w:color w:val="000000"/>
+          <w:kern w:val="24"/>
+          <w:sz w:val="22"/>
+          <w:szCs w:val="22"/>
+          <w:lang w:val="en-CA"/>
+        </w:rPr>
+      </w:pPr>
+    </w:p>
+    <w:p>
+      <w:pPr>
+        <w:jc w:val="both"/>
+        <w:rPr>
+          <w:rFonts w:ascii="Calibri" w:hAnsi="Calibri" w:cs="Calibri"/>
+          <w:b/>
+          <w:bCs/>
+          <w:color w:val="000000"/>
+          <w:kern w:val="24"/>
+          <w:sz w:val="22"/>
+          <w:szCs w:val="22"/>
+          <w:lang w:val="en-CA"/>
+        </w:rPr>
+      </w:pPr>
+    </w:p>
+    <w:p>
+      <w:pPr>
+        <w:jc w:val="both"/>
+        <w:rPr>
+          <w:rFonts w:ascii="Calibri" w:hAnsi="Calibri" w:cs="Calibri"/>
+          <w:b/>
+          <w:bCs/>
+          <w:color w:val="000000"/>
+          <w:kern w:val="24"/>
+          <w:sz w:val="22"/>
+          <w:szCs w:val="22"/>
+          <w:lang w:val="en-CA"/>
+        </w:rPr>
+      </w:pPr>
+    </w:p>
+    <w:p>
+      <w:pPr>
+        <w:jc w:val="both"/>
+        <w:rPr>
+          <w:rFonts w:ascii="Calibri" w:hAnsi="Calibri" w:cs="Calibri"/>
+          <w:b/>
+          <w:bCs/>
+          <w:color w:val="000000"/>
+          <w:kern w:val="24"/>
+          <w:sz w:val="22"/>
+          <w:szCs w:val="22"/>
+          <w:lang w:val="en-CA"/>
+        </w:rPr>
+      </w:pPr>
+    </w:p>
+    <w:p>
+      <w:pPr>
+        <w:jc w:val="both"/>
+        <w:rPr>
+          <w:rFonts w:ascii="Calibri" w:hAnsi="Calibri" w:cs="Calibri"/>
+          <w:b/>
+          <w:bCs/>
+          <w:color w:val="000000"/>
+          <w:kern w:val="24"/>
+          <w:sz w:val="22"/>
+          <w:szCs w:val="22"/>
+          <w:lang w:val="en-CA"/>
+        </w:rPr>
+      </w:pPr>
+    </w:p>
+    <w:p>
+      <w:pPr>
+        <w:jc w:val="both"/>
+        <w:rPr>
+          <w:rFonts w:ascii="Calibri" w:hAnsi="Calibri" w:cs="Calibri"/>
+          <w:b/>
+          <w:bCs/>
+          <w:color w:val="000000"/>
+          <w:kern w:val="24"/>
+          <w:sz w:val="22"/>
+          <w:szCs w:val="22"/>
+          <w:lang w:val="en-CA"/>
+        </w:rPr>
+      </w:pPr>
+    </w:p>
+    <w:p>
+      <w:pPr>
+        <w:jc w:val="both"/>
+        <w:rPr>
+          <w:rFonts w:ascii="Calibri" w:hAnsi="Calibri" w:cs="Calibri"/>
+          <w:b/>
+          <w:bCs/>
+          <w:color w:val="000000"/>
+          <w:kern w:val="24"/>
+          <w:sz w:val="22"/>
+          <w:szCs w:val="22"/>
+          <w:lang w:val="en-CA"/>
+        </w:rPr>
+      </w:pPr>
+    </w:p>
+    <w:p>
+      <w:pPr>
+        <w:jc w:val="both"/>
+        <w:rPr>
+          <w:rFonts w:ascii="Calibri" w:hAnsi="Calibri" w:cs="Calibri"/>
+          <w:b/>
+          <w:bCs/>
+          <w:color w:val="000000"/>
+          <w:kern w:val="24"/>
+          <w:sz w:val="22"/>
+          <w:szCs w:val="22"/>
+          <w:lang w:val="en-CA"/>
+        </w:rPr>
+      </w:pPr>
+    </w:p>
+    <w:p>
+      <w:pPr>
+        <w:jc w:val="both"/>
+        <w:rPr>
+          <w:rFonts w:ascii="Calibri" w:hAnsi="Calibri" w:cs="Calibri"/>
+          <w:b/>
+          <w:bCs/>
+          <w:color w:val="000000"/>
+          <w:kern w:val="24"/>
+          <w:sz w:val="22"/>
+          <w:szCs w:val="22"/>
+          <w:lang w:val="en-CA"/>
+        </w:rPr>
+      </w:pPr>
+    </w:p>
+    <w:p>
+      <w:pPr>
+        <w:jc w:val="both"/>
+        <w:rPr>
+          <w:rFonts w:ascii="Calibri" w:hAnsi="Calibri" w:cs="Calibri"/>
+          <w:b/>
+          <w:bCs/>
+          <w:color w:val="000000"/>
+          <w:kern w:val="24"/>
+          <w:sz w:val="22"/>
+          <w:szCs w:val="22"/>
+          <w:lang w:val="en-CA"/>
+          <w14:ligatures w14:val="none"/>
+        </w:rPr>
+      </w:pPr>
+      <w:r>
+        <w:rPr>
+          <w:rFonts w:ascii="Calibri" w:hAnsi="Calibri" w:cs="Calibri"/>
+          <w:b/>
+          <w:bCs/>
+          <w:color w:val="000000"/>
+          <w:kern w:val="24"/>
+          <w:sz w:val="22"/>
+          <w:szCs w:val="22"/>
+          <w:lang w:val="en-CA"/>
+        </w:rPr>
         <w:t>Figure S</w:t>
       </w:r>
       <w:r>
@@ -2836,7 +6055,7 @@
           <w:szCs w:val="22"/>
           <w:lang w:val="en-CA"/>
         </w:rPr>
-        <w:t>3</w:t>
+        <w:t>4</w:t>
       </w:r>
       <w:r>
         <w:rPr>
@@ -3957,44 +7176,6 @@
         </w:rPr>
       </w:pPr>
     </w:p>
-    <w:p>
-      <w:pPr>
-        <w:spacing w:line="276" w:lineRule="auto"/>
-        <w:rPr>
-          <w:rFonts w:ascii="Calibri" w:hAnsi="Calibri" w:cs="Calibri"/>
-          <w:sz w:val="22"/>
-          <w:szCs w:val="22"/>
-        </w:rPr>
-      </w:pPr>
-    </w:p>
-    <w:p>
-      <w:r>
-        <w:br w:type="page"/>
-      </w:r>
-    </w:p>
-    <w:p>
-      <w:r>
-        <w:rPr>
-          <w:rFonts w:ascii="Calibri" w:hAnsi="Calibri" w:cs="Calibri"/>
-          <w:b/>
-          <w:bCs/>
-          <w:sz w:val="22"/>
-          <w:szCs w:val="22"/>
-        </w:rPr>
-        <w:lastRenderedPageBreak/>
-        <w:t>Table S</w:t>
-      </w:r>
-      <w:r>
-        <w:rPr>
-          <w:rFonts w:ascii="Calibri" w:hAnsi="Calibri" w:cs="Calibri"/>
-          <w:b/>
-          <w:bCs/>
-          <w:sz w:val="22"/>
-          <w:szCs w:val="22"/>
-        </w:rPr>
-        <w:t xml:space="preserve">2. </w:t>
-      </w:r>
-    </w:p>
     <w:p/>
     <w:p/>
     <w:p/>
@@ -4007,6 +7188,53 @@
     </w:sectPr>
   </w:body>
 </w:document>
+</file>
+
+<file path=word/comments.xml><?xml version="1.0" encoding="utf-8"?>
+<w:comments xmlns:wpc="http://schemas.microsoft.com/office/word/2010/wordprocessingCanvas" xmlns:cx="http://schemas.microsoft.com/office/drawing/2014/chartex" xmlns:cx1="http://schemas.microsoft.com/office/drawing/2015/9/8/chartex" xmlns:cx2="http://schemas.microsoft.com/office/drawing/2015/10/21/chartex" xmlns:cx3="http://schemas.microsoft.com/office/drawing/2016/5/9/chartex" xmlns:cx4="http://schemas.microsoft.com/office/drawing/2016/5/10/chartex" xmlns:cx5="http://schemas.microsoft.com/office/drawing/2016/5/11/chartex" xmlns:cx6="http://schemas.microsoft.com/office/drawing/2016/5/12/chartex" xmlns:cx7="http://schemas.microsoft.com/office/drawing/2016/5/13/chartex" xmlns:cx8="http://schemas.microsoft.com/office/drawing/2016/5/14/chartex" xmlns:mc="http://schemas.openxmlformats.org/markup-compatibility/2006" xmlns:aink="http://schemas.microsoft.com/office/drawing/2016/ink" xmlns:am3d="http://schemas.microsoft.com/office/drawing/2017/model3d" xmlns:o="urn:schemas-microsoft-com:office:office" xmlns:oel="http://schemas.microsoft.com/office/2019/extlst" xmlns:r="http://schemas.openxmlformats.org/officeDocument/2006/relationships" xmlns:m="http://schemas.openxmlformats.org/officeDocument/2006/math" xmlns:v="urn:schemas-microsoft-com:vml" xmlns:wp14="http://schemas.microsoft.com/office/word/2010/wordprocessingDrawing" xmlns:wp="http://schemas.openxmlformats.org/drawingml/2006/wordprocessingDrawing" xmlns:w10="urn:schemas-microsoft-com:office:word" xmlns:w="http://schemas.openxmlformats.org/wordprocessingml/2006/main" xmlns:w14="http://schemas.microsoft.com/office/word/2010/wordml" xmlns:w15="http://schemas.microsoft.com/office/word/2012/wordml" xmlns:w16cex="http://schemas.microsoft.com/office/word/2018/wordml/cex" xmlns:w16cid="http://schemas.microsoft.com/office/word/2016/wordml/cid" xmlns:w16="http://schemas.microsoft.com/office/word/2018/wordml" xmlns:w16du="http://schemas.microsoft.com/office/word/2023/wordml/word16du" xmlns:w16sdtdh="http://schemas.microsoft.com/office/word/2020/wordml/sdtdatahash" xmlns:w16sdtfl="http://schemas.microsoft.com/office/word/2024/wordml/sdtformatlock" xmlns:w16se="http://schemas.microsoft.com/office/word/2015/wordml/symex" xmlns:wpg="http://schemas.microsoft.com/office/word/2010/wordprocessingGroup" xmlns:wpi="http://schemas.microsoft.com/office/word/2010/wordprocessingInk" xmlns:wne="http://schemas.microsoft.com/office/word/2006/wordml" xmlns:wps="http://schemas.microsoft.com/office/word/2010/wordprocessingShape" mc:Ignorable="w14 w15 w16se w16cid w16 w16cex w16sdtdh w16sdtfl w16du wp14">
+  <w:comment w:id="0" w:author="Microsoft Office User" w:date="2025-07-30T17:35:00Z" w:initials="MOU">
+    <w:p>
+      <w:pPr>
+        <w:pStyle w:val="Commentaire"/>
+      </w:pPr>
+      <w:r>
+        <w:rPr>
+          <w:rStyle w:val="Marquedecommentaire"/>
+        </w:rPr>
+        <w:annotationRef/>
+      </w:r>
+      <w:r>
+        <w:t xml:space="preserve">Ajouter les correspondances des abréviations. </w:t>
+      </w:r>
+    </w:p>
+  </w:comment>
+</w:comments>
+</file>
+
+<file path=word/commentsExtended.xml><?xml version="1.0" encoding="utf-8"?>
+<w15:commentsEx xmlns:wpc="http://schemas.microsoft.com/office/word/2010/wordprocessingCanvas" xmlns:cx="http://schemas.microsoft.com/office/drawing/2014/chartex" xmlns:cx1="http://schemas.microsoft.com/office/drawing/2015/9/8/chartex" xmlns:cx2="http://schemas.microsoft.com/office/drawing/2015/10/21/chartex" xmlns:cx3="http://schemas.microsoft.com/office/drawing/2016/5/9/chartex" xmlns:cx4="http://schemas.microsoft.com/office/drawing/2016/5/10/chartex" xmlns:cx5="http://schemas.microsoft.com/office/drawing/2016/5/11/chartex" xmlns:cx6="http://schemas.microsoft.com/office/drawing/2016/5/12/chartex" xmlns:cx7="http://schemas.microsoft.com/office/drawing/2016/5/13/chartex" xmlns:cx8="http://schemas.microsoft.com/office/drawing/2016/5/14/chartex" xmlns:mc="http://schemas.openxmlformats.org/markup-compatibility/2006" xmlns:aink="http://schemas.microsoft.com/office/drawing/2016/ink" xmlns:am3d="http://schemas.microsoft.com/office/drawing/2017/model3d" xmlns:o="urn:schemas-microsoft-com:office:office" xmlns:oel="http://schemas.microsoft.com/office/2019/extlst" xmlns:r="http://schemas.openxmlformats.org/officeDocument/2006/relationships" xmlns:m="http://schemas.openxmlformats.org/officeDocument/2006/math" xmlns:v="urn:schemas-microsoft-com:vml" xmlns:wp14="http://schemas.microsoft.com/office/word/2010/wordprocessingDrawing" xmlns:wp="http://schemas.openxmlformats.org/drawingml/2006/wordprocessingDrawing" xmlns:w10="urn:schemas-microsoft-com:office:word" xmlns:w="http://schemas.openxmlformats.org/wordprocessingml/2006/main" xmlns:w14="http://schemas.microsoft.com/office/word/2010/wordml" xmlns:w15="http://schemas.microsoft.com/office/word/2012/wordml" xmlns:w16cex="http://schemas.microsoft.com/office/word/2018/wordml/cex" xmlns:w16cid="http://schemas.microsoft.com/office/word/2016/wordml/cid" xmlns:w16="http://schemas.microsoft.com/office/word/2018/wordml" xmlns:w16du="http://schemas.microsoft.com/office/word/2023/wordml/word16du" xmlns:w16sdtdh="http://schemas.microsoft.com/office/word/2020/wordml/sdtdatahash" xmlns:w16sdtfl="http://schemas.microsoft.com/office/word/2024/wordml/sdtformatlock" xmlns:w16se="http://schemas.microsoft.com/office/word/2015/wordml/symex" xmlns:wpg="http://schemas.microsoft.com/office/word/2010/wordprocessingGroup" xmlns:wpi="http://schemas.microsoft.com/office/word/2010/wordprocessingInk" xmlns:wne="http://schemas.microsoft.com/office/word/2006/wordml" xmlns:wps="http://schemas.microsoft.com/office/word/2010/wordprocessingShape" mc:Ignorable="w14 w15 w16se w16cid w16 w16cex w16sdtdh w16sdtfl w16du wp14">
+  <w15:commentEx w15:paraId="2DB45E35" w15:done="0"/>
+</w15:commentsEx>
+</file>
+
+<file path=word/commentsExtensible.xml><?xml version="1.0" encoding="utf-8"?>
+<w16cex:commentsExtensible xmlns:wpc="http://schemas.microsoft.com/office/word/2010/wordprocessingCanvas" xmlns:cx="http://schemas.microsoft.com/office/drawing/2014/chartex" xmlns:cx1="http://schemas.microsoft.com/office/drawing/2015/9/8/chartex" xmlns:cx2="http://schemas.microsoft.com/office/drawing/2015/10/21/chartex" xmlns:cx3="http://schemas.microsoft.com/office/drawing/2016/5/9/chartex" xmlns:cx4="http://schemas.microsoft.com/office/drawing/2016/5/10/chartex" xmlns:cx5="http://schemas.microsoft.com/office/drawing/2016/5/11/chartex" xmlns:cx6="http://schemas.microsoft.com/office/drawing/2016/5/12/chartex" xmlns:cx7="http://schemas.microsoft.com/office/drawing/2016/5/13/chartex" xmlns:cx8="http://schemas.microsoft.com/office/drawing/2016/5/14/chartex" xmlns:cr="http://schemas.microsoft.com/office/comments/2020/reactions" xmlns:mc="http://schemas.openxmlformats.org/markup-compatibility/2006" xmlns:aink="http://schemas.microsoft.com/office/drawing/2016/ink" xmlns:am3d="http://schemas.microsoft.com/office/drawing/2017/model3d" xmlns:o="urn:schemas-microsoft-com:office:office" xmlns:oel="http://schemas.microsoft.com/office/2019/extlst" xmlns:r="http://schemas.openxmlformats.org/officeDocument/2006/relationships" xmlns:m="http://schemas.openxmlformats.org/officeDocument/2006/math" xmlns:v="urn:schemas-microsoft-com:vml" xmlns:wp14="http://schemas.microsoft.com/office/word/2010/wordprocessingDrawing" xmlns:wp="http://schemas.openxmlformats.org/drawingml/2006/wordprocessingDrawing" xmlns:w10="urn:schemas-microsoft-com:office:word" xmlns:w="http://schemas.openxmlformats.org/wordprocessingml/2006/main" xmlns:w14="http://schemas.microsoft.com/office/word/2010/wordml" xmlns:w15="http://schemas.microsoft.com/office/word/2012/wordml" xmlns:w16cex="http://schemas.microsoft.com/office/word/2018/wordml/cex" xmlns:w16cid="http://schemas.microsoft.com/office/word/2016/wordml/cid" xmlns:w16="http://schemas.microsoft.com/office/word/2018/wordml" xmlns:w16du="http://schemas.microsoft.com/office/word/2023/wordml/word16du" xmlns:w16sdtdh="http://schemas.microsoft.com/office/word/2020/wordml/sdtdatahash" xmlns:w16sdtfl="http://schemas.microsoft.com/office/word/2024/wordml/sdtformatlock" xmlns:w16se="http://schemas.microsoft.com/office/word/2015/wordml/symex" xmlns:wpg="http://schemas.microsoft.com/office/word/2010/wordprocessingGroup" xmlns:wpi="http://schemas.microsoft.com/office/word/2010/wordprocessingInk" xmlns:wne="http://schemas.microsoft.com/office/word/2006/wordml" xmlns:wps="http://schemas.microsoft.com/office/word/2010/wordprocessingShape" mc:Ignorable="w14 w15 w16se w16cid w16 w16cex w16sdtdh w16sdtfl cr w16du wp14">
+  <w16cex:commentExtensible w16cex:durableId="304CE5B2" w16cex:dateUtc="2025-07-30T15:35:00Z"/>
+</w16cex:commentsExtensible>
+</file>
+
+<file path=word/commentsIds.xml><?xml version="1.0" encoding="utf-8"?>
+<w16cid:commentsIds xmlns:wpc="http://schemas.microsoft.com/office/word/2010/wordprocessingCanvas" xmlns:cx="http://schemas.microsoft.com/office/drawing/2014/chartex" xmlns:cx1="http://schemas.microsoft.com/office/drawing/2015/9/8/chartex" xmlns:cx2="http://schemas.microsoft.com/office/drawing/2015/10/21/chartex" xmlns:cx3="http://schemas.microsoft.com/office/drawing/2016/5/9/chartex" xmlns:cx4="http://schemas.microsoft.com/office/drawing/2016/5/10/chartex" xmlns:cx5="http://schemas.microsoft.com/office/drawing/2016/5/11/chartex" xmlns:cx6="http://schemas.microsoft.com/office/drawing/2016/5/12/chartex" xmlns:cx7="http://schemas.microsoft.com/office/drawing/2016/5/13/chartex" xmlns:cx8="http://schemas.microsoft.com/office/drawing/2016/5/14/chartex" xmlns:mc="http://schemas.openxmlformats.org/markup-compatibility/2006" xmlns:aink="http://schemas.microsoft.com/office/drawing/2016/ink" xmlns:am3d="http://schemas.microsoft.com/office/drawing/2017/model3d" xmlns:o="urn:schemas-microsoft-com:office:office" xmlns:oel="http://schemas.microsoft.com/office/2019/extlst" xmlns:r="http://schemas.openxmlformats.org/officeDocument/2006/relationships" xmlns:m="http://schemas.openxmlformats.org/officeDocument/2006/math" xmlns:v="urn:schemas-microsoft-com:vml" xmlns:wp14="http://schemas.microsoft.com/office/word/2010/wordprocessingDrawing" xmlns:wp="http://schemas.openxmlformats.org/drawingml/2006/wordprocessingDrawing" xmlns:w10="urn:schemas-microsoft-com:office:word" xmlns:w="http://schemas.openxmlformats.org/wordprocessingml/2006/main" xmlns:w14="http://schemas.microsoft.com/office/word/2010/wordml" xmlns:w15="http://schemas.microsoft.com/office/word/2012/wordml" xmlns:w16cex="http://schemas.microsoft.com/office/word/2018/wordml/cex" xmlns:w16cid="http://schemas.microsoft.com/office/word/2016/wordml/cid" xmlns:w16="http://schemas.microsoft.com/office/word/2018/wordml" xmlns:w16du="http://schemas.microsoft.com/office/word/2023/wordml/word16du" xmlns:w16sdtdh="http://schemas.microsoft.com/office/word/2020/wordml/sdtdatahash" xmlns:w16sdtfl="http://schemas.microsoft.com/office/word/2024/wordml/sdtformatlock" xmlns:w16se="http://schemas.microsoft.com/office/word/2015/wordml/symex" xmlns:wpg="http://schemas.microsoft.com/office/word/2010/wordprocessingGroup" xmlns:wpi="http://schemas.microsoft.com/office/word/2010/wordprocessingInk" xmlns:wne="http://schemas.microsoft.com/office/word/2006/wordml" xmlns:wps="http://schemas.microsoft.com/office/word/2010/wordprocessingShape" mc:Ignorable="w14 w15 w16se w16cid w16 w16cex w16sdtdh w16sdtfl w16du wp14">
+  <w16cid:commentId w16cid:paraId="2DB45E35" w16cid:durableId="304CE5B2"/>
+</w16cid:commentsIds>
+</file>
+
+<file path=word/people.xml><?xml version="1.0" encoding="utf-8"?>
+<w15:people xmlns:wpc="http://schemas.microsoft.com/office/word/2010/wordprocessingCanvas" xmlns:cx="http://schemas.microsoft.com/office/drawing/2014/chartex" xmlns:cx1="http://schemas.microsoft.com/office/drawing/2015/9/8/chartex" xmlns:cx2="http://schemas.microsoft.com/office/drawing/2015/10/21/chartex" xmlns:cx3="http://schemas.microsoft.com/office/drawing/2016/5/9/chartex" xmlns:cx4="http://schemas.microsoft.com/office/drawing/2016/5/10/chartex" xmlns:cx5="http://schemas.microsoft.com/office/drawing/2016/5/11/chartex" xmlns:cx6="http://schemas.microsoft.com/office/drawing/2016/5/12/chartex" xmlns:cx7="http://schemas.microsoft.com/office/drawing/2016/5/13/chartex" xmlns:cx8="http://schemas.microsoft.com/office/drawing/2016/5/14/chartex" xmlns:mc="http://schemas.openxmlformats.org/markup-compatibility/2006" xmlns:aink="http://schemas.microsoft.com/office/drawing/2016/ink" xmlns:am3d="http://schemas.microsoft.com/office/drawing/2017/model3d" xmlns:o="urn:schemas-microsoft-com:office:office" xmlns:oel="http://schemas.microsoft.com/office/2019/extlst" xmlns:r="http://schemas.openxmlformats.org/officeDocument/2006/relationships" xmlns:m="http://schemas.openxmlformats.org/officeDocument/2006/math" xmlns:v="urn:schemas-microsoft-com:vml" xmlns:wp14="http://schemas.microsoft.com/office/word/2010/wordprocessingDrawing" xmlns:wp="http://schemas.openxmlformats.org/drawingml/2006/wordprocessingDrawing" xmlns:w10="urn:schemas-microsoft-com:office:word" xmlns:w="http://schemas.openxmlformats.org/wordprocessingml/2006/main" xmlns:w14="http://schemas.microsoft.com/office/word/2010/wordml" xmlns:w15="http://schemas.microsoft.com/office/word/2012/wordml" xmlns:w16cex="http://schemas.microsoft.com/office/word/2018/wordml/cex" xmlns:w16cid="http://schemas.microsoft.com/office/word/2016/wordml/cid" xmlns:w16="http://schemas.microsoft.com/office/word/2018/wordml" xmlns:w16du="http://schemas.microsoft.com/office/word/2023/wordml/word16du" xmlns:w16sdtdh="http://schemas.microsoft.com/office/word/2020/wordml/sdtdatahash" xmlns:w16sdtfl="http://schemas.microsoft.com/office/word/2024/wordml/sdtformatlock" xmlns:w16se="http://schemas.microsoft.com/office/word/2015/wordml/symex" xmlns:wpg="http://schemas.microsoft.com/office/word/2010/wordprocessingGroup" xmlns:wpi="http://schemas.microsoft.com/office/word/2010/wordprocessingInk" xmlns:wne="http://schemas.microsoft.com/office/word/2006/wordml" xmlns:wps="http://schemas.microsoft.com/office/word/2010/wordprocessingShape" mc:Ignorable="w14 w15 w16se w16cid w16 w16cex w16sdtdh w16sdtfl w16du wp14">
+  <w15:person w15:author="Microsoft Office User">
+    <w15:presenceInfo w15:providerId="None" w15:userId="Microsoft Office User"/>
+  </w15:person>
+</w15:people>
 </file>
 
 <file path=word/styles.xml><?xml version="1.0" encoding="utf-8"?>
@@ -5042,6 +8270,141 @@
       <w14:ligatures w14:val="none"/>
     </w:rPr>
   </w:style>
+  <w:style w:type="table" w:styleId="Tableausimple2">
+    <w:name w:val="Plain Table 2"/>
+    <w:basedOn w:val="TableauNormal"/>
+    <w:uiPriority w:val="42"/>
+    <w:rsid w:val="008814C9"/>
+    <w:rPr>
+      <w:kern w:val="0"/>
+      <w:sz w:val="20"/>
+      <w:szCs w:val="22"/>
+      <w14:ligatures w14:val="none"/>
+    </w:rPr>
+    <w:tblPr>
+      <w:tblStyleRowBandSize w:val="1"/>
+      <w:tblStyleColBandSize w:val="1"/>
+      <w:tblBorders>
+        <w:top w:val="single" w:sz="4" w:space="0" w:color="7F7F7F" w:themeColor="text1" w:themeTint="80"/>
+        <w:bottom w:val="single" w:sz="4" w:space="0" w:color="7F7F7F" w:themeColor="text1" w:themeTint="80"/>
+      </w:tblBorders>
+    </w:tblPr>
+    <w:tblStylePr w:type="firstRow">
+      <w:rPr>
+        <w:b/>
+        <w:bCs/>
+      </w:rPr>
+      <w:tblPr/>
+      <w:tcPr>
+        <w:tcBorders>
+          <w:bottom w:val="single" w:sz="4" w:space="0" w:color="000000" w:themeColor="text1"/>
+        </w:tcBorders>
+      </w:tcPr>
+    </w:tblStylePr>
+    <w:tblStylePr w:type="lastRow">
+      <w:rPr>
+        <w:b/>
+        <w:bCs/>
+      </w:rPr>
+      <w:tblPr/>
+      <w:tcPr>
+        <w:tcBorders>
+          <w:top w:val="single" w:sz="4" w:space="0" w:color="000000" w:themeColor="text1"/>
+        </w:tcBorders>
+      </w:tcPr>
+    </w:tblStylePr>
+    <w:tblStylePr w:type="firstCol">
+      <w:rPr>
+        <w:b/>
+        <w:bCs/>
+      </w:rPr>
+    </w:tblStylePr>
+    <w:tblStylePr w:type="lastCol">
+      <w:rPr>
+        <w:b/>
+        <w:bCs/>
+      </w:rPr>
+    </w:tblStylePr>
+    <w:tblStylePr w:type="band1Vert">
+      <w:tblPr/>
+      <w:tcPr>
+        <w:tcBorders>
+          <w:left w:val="single" w:sz="4" w:space="0" w:color="000000" w:themeColor="text1"/>
+          <w:right w:val="single" w:sz="4" w:space="0" w:color="000000" w:themeColor="text1"/>
+        </w:tcBorders>
+      </w:tcPr>
+    </w:tblStylePr>
+    <w:tblStylePr w:type="band2Vert">
+      <w:tblPr/>
+      <w:tcPr>
+        <w:tcBorders>
+          <w:left w:val="single" w:sz="4" w:space="0" w:color="000000" w:themeColor="text1"/>
+          <w:right w:val="single" w:sz="4" w:space="0" w:color="000000" w:themeColor="text1"/>
+        </w:tcBorders>
+      </w:tcPr>
+    </w:tblStylePr>
+    <w:tblStylePr w:type="band1Horz">
+      <w:tblPr/>
+      <w:tcPr>
+        <w:tcBorders>
+          <w:top w:val="single" w:sz="4" w:space="0" w:color="000000" w:themeColor="text1"/>
+          <w:bottom w:val="single" w:sz="4" w:space="0" w:color="000000" w:themeColor="text1"/>
+        </w:tcBorders>
+      </w:tcPr>
+    </w:tblStylePr>
+  </w:style>
+  <w:style w:type="character" w:customStyle="1" w:styleId="apple-converted-space">
+    <w:name w:val="apple-converted-space"/>
+    <w:basedOn w:val="Policepardfaut"/>
+    <w:rsid w:val="00F91FD8"/>
+  </w:style>
+  <w:style w:type="character" w:styleId="Accentuation">
+    <w:name w:val="Emphasis"/>
+    <w:basedOn w:val="Policepardfaut"/>
+    <w:uiPriority w:val="20"/>
+    <w:qFormat/>
+    <w:rsid w:val="00F91FD8"/>
+    <w:rPr>
+      <w:i/>
+      <w:iCs/>
+    </w:rPr>
+  </w:style>
+  <w:style w:type="paragraph" w:styleId="Objetducommentaire">
+    <w:name w:val="annotation subject"/>
+    <w:basedOn w:val="Commentaire"/>
+    <w:next w:val="Commentaire"/>
+    <w:link w:val="ObjetducommentaireCar"/>
+    <w:uiPriority w:val="99"/>
+    <w:semiHidden/>
+    <w:unhideWhenUsed/>
+    <w:rsid w:val="00F36E2B"/>
+    <w:pPr>
+      <w:suppressAutoHyphens w:val="0"/>
+      <w:spacing w:after="0"/>
+    </w:pPr>
+    <w:rPr>
+      <w:b/>
+      <w:bCs/>
+      <w:kern w:val="2"/>
+      <w14:ligatures w14:val="standardContextual"/>
+    </w:rPr>
+  </w:style>
+  <w:style w:type="character" w:customStyle="1" w:styleId="ObjetducommentaireCar">
+    <w:name w:val="Objet du commentaire Car"/>
+    <w:basedOn w:val="CommentaireCar"/>
+    <w:link w:val="Objetducommentaire"/>
+    <w:uiPriority w:val="99"/>
+    <w:semiHidden/>
+    <w:rsid w:val="00F36E2B"/>
+    <w:rPr>
+      <w:b/>
+      <w:bCs/>
+      <w:kern w:val="0"/>
+      <w:sz w:val="20"/>
+      <w:szCs w:val="20"/>
+      <w14:ligatures w14:val="none"/>
+    </w:rPr>
+  </w:style>
 </w:styles>
 </file>
 

</xml_diff>